<commit_message>
Frissites 2026. 09. 18. 12:22:23,14
</commit_message>
<xml_diff>
--- a/felhasznaloi-utmutato.docx
+++ b/felhasznaloi-utmutato.docx
@@ -7,38 +7,169 @@
         <w:pStyle w:val="Title"/>
       </w:pPr>
       <w:r>
-        <w:t>Kemence Akadémia — Felhasználói útmutató</w:t>
+        <w:rPr>
+          <w:color w:val="B8430F"/>
+          <w:sz w:val="44"/>
+        </w:rPr>
+        <w:t>Kemence Akadémia — Admin kézikönyv</w:t>
       </w:r>
     </w:p>
     <w:p>
       <w:r>
-        <w:t>A foglalási rendszer használata: a vendég oldala és az admin felület, lépésről lépésre.</w:t>
+        <w:rPr>
+          <w:color w:val="7A6A58"/>
+        </w:rPr>
+        <w:t>Rövid, gyakorlati útmutató: mit hol találsz, és mit csinálj egy-egy helyzetben.</w:t>
       </w:r>
     </w:p>
     <w:p>
       <w:r>
         <w:rPr>
-          <w:i/>
+          <w:color w:val="7A6A58"/>
+          <w:sz w:val="18"/>
         </w:rPr>
-        <w:t>A képernyőképek helye jelölve (📷) — ezeket később illesztitek be.</w:t>
+        <w:t>Frissítve: 2026-09-18 · A 📷 jelölés a később beillesztendő képernyőképek helye.</w:t>
       </w:r>
     </w:p>
     <w:p>
       <w:pPr>
-        <w:shd w:val="clear" w:color="auto" w:fill="EEF7F0"/>
-        <w:spacing w:before="80" w:after="80"/>
+        <w:pBdr>
+          <w:left w:val="single" w:sz="24" w:space="8" w:color="E4571B"/>
+        </w:pBdr>
+        <w:shd w:val="clear" w:color="auto" w:fill="FFF4EE"/>
+        <w:spacing w:after="0"/>
       </w:pPr>
       <w:r>
         <w:rPr>
           <w:b/>
         </w:rPr>
-        <w:t xml:space="preserve">Miből áll a rendszer? </w:t>
-      </w:r>
+        <w:t>A rendszer két része</w:t>
+      </w:r>
+    </w:p>
+    <w:p>
+      <w:pPr>
+        <w:pBdr>
+          <w:left w:val="single" w:sz="24" w:space="8" w:color="E4571B"/>
+        </w:pBdr>
+        <w:shd w:val="clear" w:color="auto" w:fill="FFF4EE"/>
+        <w:spacing w:after="0"/>
+      </w:pPr>
       <w:r>
         <w:rPr>
           <w:b w:val="0"/>
         </w:rPr>
-        <w:t>Publikus oldal — ezt látják a vendégek (böngésznek, foglalnak). Admin felület (/admin/) — ezt kezelitek ti (foglalások, naptár, programok, beállítások). A leveleket a rendszer automatikusan vagy egy gombnyomásra küldi.</w:t>
+        <w:t xml:space="preserve">• </w:t>
+      </w:r>
+      <w:r>
+        <w:rPr>
+          <w:b/>
+        </w:rPr>
+        <w:t>Nyilvános oldal</w:t>
+      </w:r>
+      <w:r>
+        <w:rPr>
+          <w:b w:val="0"/>
+        </w:rPr>
+        <w:t xml:space="preserve"> — a vendégek itt foglalnak időpontra, vagy kérnek egyedi ajánlatot.</w:t>
+      </w:r>
+    </w:p>
+    <w:p>
+      <w:pPr>
+        <w:pBdr>
+          <w:left w:val="single" w:sz="24" w:space="8" w:color="E4571B"/>
+        </w:pBdr>
+        <w:shd w:val="clear" w:color="auto" w:fill="FFF4EE"/>
+        <w:spacing w:after="0"/>
+      </w:pPr>
+      <w:r>
+        <w:rPr>
+          <w:b w:val="0"/>
+        </w:rPr>
+        <w:t xml:space="preserve">• </w:t>
+      </w:r>
+      <w:r>
+        <w:rPr>
+          <w:b/>
+        </w:rPr>
+        <w:t>Admin felület</w:t>
+      </w:r>
+      <w:r>
+        <w:rPr>
+          <w:b w:val="0"/>
+        </w:rPr>
+        <w:t xml:space="preserve"> (</w:t>
+      </w:r>
+      <w:r>
+        <w:rPr>
+          <w:rFonts w:ascii="Consolas" w:hAnsi="Consolas"/>
+          <w:b w:val="0"/>
+          <w:sz w:val="20"/>
+        </w:rPr>
+        <w:t>/admin/</w:t>
+      </w:r>
+      <w:r>
+        <w:rPr>
+          <w:b w:val="0"/>
+        </w:rPr>
+        <w:t>) — itt kezeled mindezt. Belépés a kapott e-mail címmel és jelszóval; regisztráció nincs.</w:t>
+      </w:r>
+    </w:p>
+    <w:p>
+      <w:pPr>
+        <w:spacing w:after="0"/>
+      </w:pPr>
+    </w:p>
+    <w:p>
+      <w:r>
+        <w:rPr>
+          <w:b/>
+        </w:rPr>
+        <w:t>Tartalom</w:t>
+      </w:r>
+    </w:p>
+    <w:p>
+      <w:pPr>
+        <w:spacing w:after="0"/>
+        <w:ind w:left="283"/>
+      </w:pPr>
+      <w:r>
+        <w:t>1. Eligazodás az admin felületen</w:t>
+      </w:r>
+    </w:p>
+    <w:p>
+      <w:pPr>
+        <w:spacing w:after="0"/>
+        <w:ind w:left="283"/>
+      </w:pPr>
+      <w:r>
+        <w:t>2. Programok és időpontok</w:t>
+      </w:r>
+    </w:p>
+    <w:p>
+      <w:pPr>
+        <w:spacing w:after="0"/>
+        <w:ind w:left="283"/>
+      </w:pPr>
+      <w:r>
+        <w:t>3. Foglalások</w:t>
+      </w:r>
+    </w:p>
+    <w:p>
+      <w:pPr>
+        <w:spacing w:after="0"/>
+        <w:ind w:left="283"/>
+      </w:pPr>
+      <w:r>
+        <w:t>4. Egyedi programok és ajánlatok</w:t>
+      </w:r>
+    </w:p>
+    <w:p>
+      <w:pPr>
+        <w:spacing w:after="0"/>
+        <w:ind w:left="283"/>
+      </w:pPr>
+      <w:r>
+        <w:t>5. Közös eszközök</w:t>
       </w:r>
     </w:p>
     <w:p>
@@ -46,7 +177,7 @@
         <w:pStyle w:val="Heading1"/>
       </w:pPr>
       <w:r>
-        <w:t>1. Hogyan foglal a vendég?</w:t>
+        <w:t>1. Eligazodás az admin felületen</w:t>
       </w:r>
     </w:p>
     <w:p>
@@ -54,183 +185,7 @@
         <w:rPr>
           <w:b w:val="0"/>
         </w:rPr>
-        <w:t>A vendég a publikus oldalon böngészi a programokat, és pár kattintással foglal. Nem kell regisztrálnia.</w:t>
-      </w:r>
-    </w:p>
-    <w:p>
-      <w:pPr>
-        <w:pStyle w:val="Heading2"/>
-      </w:pPr>
-      <w:r>
-        <w:t>1.1 A főoldal</w:t>
-      </w:r>
-    </w:p>
-    <w:p>
-      <w:r>
-        <w:rPr>
-          <w:b w:val="0"/>
-        </w:rPr>
-        <w:t>A vendég a főoldalon látja a bemutatkozást, a workshop-típusokat, és a Programok résznél a meghirdetett, foglalható alkalmakat (cím, időpont, ár, szabad helyek). Minden programnál egy rövid leírás látszik; a „Részletek" gombra kattintva a hosszabb, részletes leírás is megjelenik (ha van megadva).</w:t>
-      </w:r>
-    </w:p>
-    <w:p>
-      <w:pPr>
-        <w:shd w:val="clear" w:color="auto" w:fill="F3E9D8"/>
-        <w:jc w:val="center"/>
-      </w:pPr>
-      <w:r>
-        <w:rPr>
-          <w:i/>
-          <w:color w:val="8A7458"/>
-        </w:rPr>
-        <w:t>📷  Képernyőkép: a publikus főoldal a programlistával</w:t>
-      </w:r>
-    </w:p>
-    <w:p>
-      <w:pPr>
-        <w:pStyle w:val="Heading2"/>
-      </w:pPr>
-      <w:r>
-        <w:t>1.2 A foglalás lépései</w:t>
-      </w:r>
-    </w:p>
-    <w:p>
-      <w:pPr>
-        <w:pStyle w:val="ListNumber"/>
-      </w:pPr>
-      <w:r>
-        <w:rPr>
-          <w:b/>
-        </w:rPr>
-        <w:t xml:space="preserve">1. </w:t>
-      </w:r>
-      <w:r>
-        <w:rPr>
-          <w:b w:val="0"/>
-        </w:rPr>
-        <w:t>A vendég kiválaszt egy programot, és a Foglalás gombra kattint.</w:t>
-      </w:r>
-    </w:p>
-    <w:p>
-      <w:pPr>
-        <w:pStyle w:val="ListNumber"/>
-      </w:pPr>
-      <w:r>
-        <w:rPr>
-          <w:b/>
-        </w:rPr>
-        <w:t xml:space="preserve">2. </w:t>
-      </w:r>
-      <w:r>
-        <w:rPr>
-          <w:b w:val="0"/>
-        </w:rPr>
-        <w:t>Kitölti az űrlapot: név, e-mail, telefon, létszám (hány fő), megjegyzés (nem kötelező).</w:t>
-      </w:r>
-    </w:p>
-    <w:p>
-      <w:pPr>
-        <w:pStyle w:val="ListNumber"/>
-      </w:pPr>
-      <w:r>
-        <w:rPr>
-          <w:b/>
-        </w:rPr>
-        <w:t xml:space="preserve">3. </w:t>
-      </w:r>
-      <w:r>
-        <w:rPr>
-          <w:b w:val="0"/>
-        </w:rPr>
-        <w:t>Elküldi. Ha van elég szabad hely, a rendszer rögzíti a foglalást.</w:t>
-      </w:r>
-    </w:p>
-    <w:p>
-      <w:pPr>
-        <w:shd w:val="clear" w:color="auto" w:fill="F3E9D8"/>
-        <w:jc w:val="center"/>
-      </w:pPr>
-      <w:r>
-        <w:rPr>
-          <w:i/>
-          <w:color w:val="8A7458"/>
-        </w:rPr>
-        <w:t>📷  Képernyőkép: a foglalási űrlap (felugró ablak)</w:t>
-      </w:r>
-    </w:p>
-    <w:p>
-      <w:pPr>
-        <w:shd w:val="clear" w:color="auto" w:fill="FCEEE4"/>
-        <w:spacing w:before="80" w:after="80"/>
-      </w:pPr>
-      <w:r>
-        <w:rPr>
-          <w:b/>
-        </w:rPr>
-        <w:t xml:space="preserve">Túlfoglalás elleni védelem: </w:t>
-      </w:r>
-      <w:r>
-        <w:rPr>
-          <w:b w:val="0"/>
-        </w:rPr>
-        <w:t>a rendszer nem enged több foglalást, mint ahány szabad hely van, és múltbéli programra sem enged a vendég foglalni.</w:t>
-      </w:r>
-    </w:p>
-    <w:p>
-      <w:pPr>
-        <w:pStyle w:val="Heading2"/>
-      </w:pPr>
-      <w:r>
-        <w:t>1.3 Mi történik közvetlenül a foglalás után?</w:t>
-      </w:r>
-    </w:p>
-    <w:p>
-      <w:pPr>
-        <w:pStyle w:val="ListBullet"/>
-      </w:pPr>
-      <w:r>
-        <w:rPr>
-          <w:b w:val="0"/>
-        </w:rPr>
-        <w:t>A foglalás bekerül a rendszerbe „Jóváhagyásra vár" státusszal.</w:t>
-      </w:r>
-    </w:p>
-    <w:p>
-      <w:pPr>
-        <w:pStyle w:val="ListBullet"/>
-      </w:pPr>
-      <w:r>
-        <w:rPr>
-          <w:b w:val="0"/>
-        </w:rPr>
-        <w:t>A vendég azonnal kap egy visszaigazoló levelet („megkaptuk a foglalásod").</w:t>
-      </w:r>
-    </w:p>
-    <w:p>
-      <w:pPr>
-        <w:pStyle w:val="ListBullet"/>
-      </w:pPr>
-      <w:r>
-        <w:rPr>
-          <w:b w:val="0"/>
-        </w:rPr>
-        <w:t>Ti értesítőt kaptok a csapat e-mail címére, hogy új foglalás érkezett.</w:t>
-      </w:r>
-    </w:p>
-    <w:p>
-      <w:pPr>
-        <w:pStyle w:val="Heading1"/>
-      </w:pPr>
-      <w:r>
-        <w:t>2. Egy foglalás életútja és a státuszok</w:t>
-      </w:r>
-    </w:p>
-    <w:p>
-      <w:r>
-        <w:rPr>
-          <w:b w:val="0"/>
-        </w:rPr>
-        <w:t>Minden foglalásnak van egy státusza, ami megmutatja, hol tart. Négy státusz van:</w:t>
+        <w:t>A fülsor két üzletágra oszlik, mindkettőnek saját színe van:</w:t>
       </w:r>
     </w:p>
     <w:tbl>
@@ -240,19 +195,1076 @@
         <w:tblLook w:firstColumn="1" w:firstRow="1" w:lastColumn="0" w:lastRow="0" w:noHBand="0" w:noVBand="1" w:val="04A0"/>
       </w:tblPr>
       <w:tblGrid>
-        <w:gridCol w:w="2880"/>
-        <w:gridCol w:w="2880"/>
-        <w:gridCol w:w="2880"/>
+        <w:gridCol w:w="3324"/>
+        <w:gridCol w:w="3324"/>
+        <w:gridCol w:w="3324"/>
       </w:tblGrid>
       <w:tr>
         <w:tc>
           <w:tcPr>
-            <w:tcW w:type="dxa" w:w="2880"/>
+            <w:tcW w:type="dxa" w:w="3324"/>
+            <w:shd w:val="clear" w:color="auto" w:fill="F6EFE6"/>
           </w:tcPr>
           <w:p>
-            <w:pPr>
-              <w:shd w:val="clear" w:color="auto" w:fill="F6EFE6"/>
-            </w:pPr>
+            <w:r/>
+            <w:r>
+              <w:rPr>
+                <w:b/>
+              </w:rPr>
+              <w:t>Csoport</w:t>
+            </w:r>
+          </w:p>
+        </w:tc>
+        <w:tc>
+          <w:tcPr>
+            <w:tcW w:type="dxa" w:w="3324"/>
+            <w:shd w:val="clear" w:color="auto" w:fill="F6EFE6"/>
+          </w:tcPr>
+          <w:p>
+            <w:r/>
+            <w:r>
+              <w:rPr>
+                <w:b/>
+              </w:rPr>
+              <w:t>Fülek</w:t>
+            </w:r>
+          </w:p>
+        </w:tc>
+        <w:tc>
+          <w:tcPr>
+            <w:tcW w:type="dxa" w:w="3324"/>
+            <w:shd w:val="clear" w:color="auto" w:fill="F6EFE6"/>
+          </w:tcPr>
+          <w:p>
+            <w:r/>
+            <w:r>
+              <w:rPr>
+                <w:b/>
+              </w:rPr>
+              <w:t>Mire való</w:t>
+            </w:r>
+          </w:p>
+        </w:tc>
+      </w:tr>
+      <w:tr>
+        <w:tc>
+          <w:tcPr>
+            <w:tcW w:type="dxa" w:w="3324"/>
+          </w:tcPr>
+          <w:p>
+            <w:r/>
+            <w:r>
+              <w:rPr>
+                <w:b/>
+              </w:rPr>
+              <w:t>Nyilvános programok</w:t>
+            </w:r>
+            <w:r>
+              <w:rPr>
+                <w:b w:val="0"/>
+              </w:rPr>
+              <w:t xml:space="preserve"> (narancs)</w:t>
+            </w:r>
+          </w:p>
+        </w:tc>
+        <w:tc>
+          <w:tcPr>
+            <w:tcW w:type="dxa" w:w="3324"/>
+          </w:tcPr>
+          <w:p>
+            <w:r/>
+            <w:r>
+              <w:rPr>
+                <w:b w:val="0"/>
+              </w:rPr>
+              <w:t>Foglalások, Programok</w:t>
+            </w:r>
+          </w:p>
+        </w:tc>
+        <w:tc>
+          <w:tcPr>
+            <w:tcW w:type="dxa" w:w="3324"/>
+          </w:tcPr>
+          <w:p>
+            <w:r/>
+            <w:r>
+              <w:rPr>
+                <w:b w:val="0"/>
+              </w:rPr>
+              <w:t>Meghirdetett időpontok, amikre a vendég azonnal foglal.</w:t>
+            </w:r>
+          </w:p>
+        </w:tc>
+      </w:tr>
+      <w:tr>
+        <w:tc>
+          <w:tcPr>
+            <w:tcW w:type="dxa" w:w="3324"/>
+          </w:tcPr>
+          <w:p>
+            <w:r/>
+            <w:r>
+              <w:rPr>
+                <w:b/>
+              </w:rPr>
+              <w:t>Egyedi megrendelések</w:t>
+            </w:r>
+            <w:r>
+              <w:rPr>
+                <w:b w:val="0"/>
+              </w:rPr>
+              <w:t xml:space="preserve"> (lila)</w:t>
+            </w:r>
+          </w:p>
+        </w:tc>
+        <w:tc>
+          <w:tcPr>
+            <w:tcW w:type="dxa" w:w="3324"/>
+          </w:tcPr>
+          <w:p>
+            <w:r/>
+            <w:r>
+              <w:rPr>
+                <w:b w:val="0"/>
+              </w:rPr>
+              <w:t>Ajánlatok, Egyedi programok</w:t>
+            </w:r>
+          </w:p>
+        </w:tc>
+        <w:tc>
+          <w:tcPr>
+            <w:tcW w:type="dxa" w:w="3324"/>
+          </w:tcPr>
+          <w:p>
+            <w:r/>
+            <w:r>
+              <w:rPr>
+                <w:b w:val="0"/>
+              </w:rPr>
+              <w:t>Időpont nélküli ötletek (pl. leánybúcsú, csapatépítő), amikre a vendég ajánlatot kér.</w:t>
+            </w:r>
+          </w:p>
+        </w:tc>
+      </w:tr>
+      <w:tr>
+        <w:tc>
+          <w:tcPr>
+            <w:tcW w:type="dxa" w:w="3324"/>
+          </w:tcPr>
+          <w:p>
+            <w:r/>
+            <w:r>
+              <w:rPr>
+                <w:b w:val="0"/>
+              </w:rPr>
+              <w:t>jobb oldalt</w:t>
+            </w:r>
+          </w:p>
+        </w:tc>
+        <w:tc>
+          <w:tcPr>
+            <w:tcW w:type="dxa" w:w="3324"/>
+          </w:tcPr>
+          <w:p>
+            <w:r/>
+            <w:r>
+              <w:rPr>
+                <w:b w:val="0"/>
+              </w:rPr>
+              <w:t>Naptár, ⚙ Beállítások</w:t>
+            </w:r>
+          </w:p>
+        </w:tc>
+        <w:tc>
+          <w:tcPr>
+            <w:tcW w:type="dxa" w:w="3324"/>
+          </w:tcPr>
+          <w:p>
+            <w:r/>
+            <w:r>
+              <w:rPr>
+                <w:b w:val="0"/>
+              </w:rPr>
+              <w:t>A Naptár mindkét ágat mutatja. A Beállításokban a címek, azonosítók és levélsablonok vannak.</w:t>
+            </w:r>
+          </w:p>
+        </w:tc>
+      </w:tr>
+    </w:tbl>
+    <w:p>
+      <w:pPr>
+        <w:spacing w:after="0"/>
+      </w:pPr>
+    </w:p>
+    <w:p>
+      <w:pPr>
+        <w:pBdr>
+          <w:left w:val="single" w:sz="24" w:space="8" w:color="D9A441"/>
+        </w:pBdr>
+        <w:shd w:val="clear" w:color="auto" w:fill="FDF7E3"/>
+        <w:spacing w:after="0"/>
+      </w:pPr>
+      <w:r>
+        <w:rPr>
+          <w:b w:val="0"/>
+        </w:rPr>
+        <w:t xml:space="preserve">💡 Mindkét ágban ugyanaz a logika: a </w:t>
+      </w:r>
+      <w:r>
+        <w:rPr>
+          <w:b/>
+        </w:rPr>
+        <w:t>Programok</w:t>
+      </w:r>
+      <w:r>
+        <w:rPr>
+          <w:b w:val="0"/>
+        </w:rPr>
+        <w:t xml:space="preserve"> / </w:t>
+      </w:r>
+      <w:r>
+        <w:rPr>
+          <w:b/>
+        </w:rPr>
+        <w:t>Egyedi programok</w:t>
+      </w:r>
+      <w:r>
+        <w:rPr>
+          <w:b w:val="0"/>
+        </w:rPr>
+        <w:t xml:space="preserve"> fülön azt állítod be, </w:t>
+      </w:r>
+      <w:r>
+        <w:rPr>
+          <w:b/>
+        </w:rPr>
+        <w:t>mit kínálsz</w:t>
+      </w:r>
+      <w:r>
+        <w:rPr>
+          <w:b w:val="0"/>
+        </w:rPr>
+        <w:t xml:space="preserve">; a </w:t>
+      </w:r>
+      <w:r>
+        <w:rPr>
+          <w:b/>
+        </w:rPr>
+        <w:t>Foglalások</w:t>
+      </w:r>
+      <w:r>
+        <w:rPr>
+          <w:b w:val="0"/>
+        </w:rPr>
+        <w:t xml:space="preserve"> / </w:t>
+      </w:r>
+      <w:r>
+        <w:rPr>
+          <w:b/>
+        </w:rPr>
+        <w:t>Ajánlatok</w:t>
+      </w:r>
+      <w:r>
+        <w:rPr>
+          <w:b w:val="0"/>
+        </w:rPr>
+        <w:t xml:space="preserve"> fülön azt intézed, </w:t>
+      </w:r>
+      <w:r>
+        <w:rPr>
+          <w:b/>
+        </w:rPr>
+        <w:t>ami beérkezett</w:t>
+      </w:r>
+      <w:r>
+        <w:rPr>
+          <w:b w:val="0"/>
+        </w:rPr>
+        <w:t>.</w:t>
+      </w:r>
+    </w:p>
+    <w:p>
+      <w:pPr>
+        <w:spacing w:after="0"/>
+      </w:pPr>
+    </w:p>
+    <w:p>
+      <w:pPr>
+        <w:jc w:val="center"/>
+      </w:pPr>
+      <w:r>
+        <w:rPr>
+          <w:i/>
+          <w:color w:val="7A6A58"/>
+        </w:rPr>
+        <w:t>📷 Képernyőkép: az admin fülsora</w:t>
+      </w:r>
+    </w:p>
+    <w:p>
+      <w:pPr>
+        <w:pStyle w:val="Heading1"/>
+      </w:pPr>
+      <w:r>
+        <w:t>2. Programok és időpontok</w:t>
+      </w:r>
+    </w:p>
+    <w:p>
+      <w:pPr>
+        <w:pStyle w:val="Heading2"/>
+      </w:pPr>
+      <w:r>
+        <w:t>Új programot hirdetnék meg</w:t>
+      </w:r>
+    </w:p>
+    <w:p>
+      <w:pPr>
+        <w:spacing w:after="40"/>
+        <w:ind w:left="510" w:hanging="340"/>
+      </w:pPr>
+      <w:r>
+        <w:t>1.</w:t>
+        <w:tab/>
+      </w:r>
+      <w:r>
+        <w:rPr>
+          <w:b/>
+        </w:rPr>
+        <w:t>Programok</w:t>
+      </w:r>
+      <w:r>
+        <w:rPr>
+          <w:b w:val="0"/>
+        </w:rPr>
+        <w:t xml:space="preserve"> fül → </w:t>
+      </w:r>
+      <w:r>
+        <w:rPr>
+          <w:b/>
+        </w:rPr>
+        <w:t>+ Új program</w:t>
+      </w:r>
+      <w:r>
+        <w:rPr>
+          <w:b w:val="0"/>
+        </w:rPr>
+        <w:t>.</w:t>
+      </w:r>
+    </w:p>
+    <w:p>
+      <w:pPr>
+        <w:spacing w:after="40"/>
+        <w:ind w:left="510" w:hanging="340"/>
+      </w:pPr>
+      <w:r>
+        <w:t>2.</w:t>
+        <w:tab/>
+      </w:r>
+      <w:r>
+        <w:rPr>
+          <w:b w:val="0"/>
+        </w:rPr>
+        <w:t xml:space="preserve">Töltsd ki: </w:t>
+      </w:r>
+      <w:r>
+        <w:rPr>
+          <w:b/>
+        </w:rPr>
+        <w:t>cím</w:t>
+      </w:r>
+      <w:r>
+        <w:rPr>
+          <w:b w:val="0"/>
+        </w:rPr>
+        <w:t xml:space="preserve">, </w:t>
+      </w:r>
+      <w:r>
+        <w:rPr>
+          <w:b/>
+        </w:rPr>
+        <w:t>rövid leírás</w:t>
+      </w:r>
+      <w:r>
+        <w:rPr>
+          <w:b w:val="0"/>
+        </w:rPr>
+        <w:t xml:space="preserve"> (ez látszik a kártyán), és ha kell: részletes leírás, előadó, várható időtartam, fotó.</w:t>
+      </w:r>
+    </w:p>
+    <w:p>
+      <w:pPr>
+        <w:spacing w:after="40"/>
+        <w:ind w:left="510" w:hanging="340"/>
+      </w:pPr>
+      <w:r>
+        <w:t>3.</w:t>
+        <w:tab/>
+      </w:r>
+      <w:r>
+        <w:rPr>
+          <w:b w:val="0"/>
+        </w:rPr>
+        <w:t xml:space="preserve">Állapot: </w:t>
+      </w:r>
+      <w:r>
+        <w:rPr>
+          <w:b/>
+        </w:rPr>
+        <w:t>Aktív</w:t>
+      </w:r>
+      <w:r>
+        <w:rPr>
+          <w:b w:val="0"/>
+        </w:rPr>
+        <w:t xml:space="preserve">, ha már foglalható. </w:t>
+      </w:r>
+      <w:r>
+        <w:rPr>
+          <w:b/>
+        </w:rPr>
+        <w:t>Hamarosan</w:t>
+      </w:r>
+      <w:r>
+        <w:rPr>
+          <w:b w:val="0"/>
+        </w:rPr>
+        <w:t>, ha csak előre beharangoznád (időpont nélkül, nem foglalható).</w:t>
+      </w:r>
+    </w:p>
+    <w:p>
+      <w:pPr>
+        <w:spacing w:after="40"/>
+        <w:ind w:left="510" w:hanging="340"/>
+      </w:pPr>
+      <w:r>
+        <w:t>4.</w:t>
+        <w:tab/>
+      </w:r>
+      <w:r>
+        <w:rPr>
+          <w:b/>
+        </w:rPr>
+        <w:t>+ Időpont hozzáadása</w:t>
+      </w:r>
+      <w:r>
+        <w:rPr>
+          <w:b w:val="0"/>
+        </w:rPr>
+        <w:t xml:space="preserve"> — minden alkalomhoz: dátum és idő, ár/fő, kedvezményes ár (nem kötelező), max. létszám.</w:t>
+      </w:r>
+    </w:p>
+    <w:p>
+      <w:pPr>
+        <w:spacing w:after="40"/>
+        <w:ind w:left="510" w:hanging="340"/>
+      </w:pPr>
+      <w:r>
+        <w:t>5.</w:t>
+        <w:tab/>
+      </w:r>
+      <w:r>
+        <w:rPr>
+          <w:b/>
+        </w:rPr>
+        <w:t>Mentés</w:t>
+      </w:r>
+      <w:r>
+        <w:rPr>
+          <w:b w:val="0"/>
+        </w:rPr>
+        <w:t>. A jövőbeli, aktív időpontok azonnal foglalhatók a főoldalon.</w:t>
+      </w:r>
+    </w:p>
+    <w:p>
+      <w:pPr>
+        <w:pBdr>
+          <w:left w:val="single" w:sz="24" w:space="8" w:color="D9A441"/>
+        </w:pBdr>
+        <w:shd w:val="clear" w:color="auto" w:fill="FDF7E3"/>
+        <w:spacing w:after="0"/>
+      </w:pPr>
+      <w:r>
+        <w:rPr>
+          <w:b w:val="0"/>
+        </w:rPr>
+        <w:t>💡 Egy program = egy kártya a főoldalon, akárhány időponttal. Ha ugyanazt a workshopot többször tartod, ne csinálj új programot, csak adj hozzá időpontot.</w:t>
+      </w:r>
+    </w:p>
+    <w:p>
+      <w:pPr>
+        <w:spacing w:after="0"/>
+      </w:pPr>
+    </w:p>
+    <w:p>
+      <w:pPr>
+        <w:pStyle w:val="Heading2"/>
+      </w:pPr>
+      <w:r>
+        <w:t>Módosítanék egy programot vagy időpontot</w:t>
+      </w:r>
+    </w:p>
+    <w:p>
+      <w:pPr>
+        <w:spacing w:after="40"/>
+        <w:ind w:left="510" w:hanging="340"/>
+      </w:pPr>
+      <w:r>
+        <w:t>1.</w:t>
+        <w:tab/>
+      </w:r>
+      <w:r>
+        <w:rPr>
+          <w:b w:val="0"/>
+        </w:rPr>
+        <w:t xml:space="preserve">A programnál </w:t>
+      </w:r>
+      <w:r>
+        <w:rPr>
+          <w:b/>
+        </w:rPr>
+        <w:t>Szerkesztés</w:t>
+      </w:r>
+      <w:r>
+        <w:rPr>
+          <w:b w:val="0"/>
+        </w:rPr>
+        <w:t>.</w:t>
+      </w:r>
+    </w:p>
+    <w:p>
+      <w:pPr>
+        <w:spacing w:after="40"/>
+        <w:ind w:left="510" w:hanging="340"/>
+      </w:pPr>
+      <w:r>
+        <w:t>2.</w:t>
+        <w:tab/>
+      </w:r>
+      <w:r>
+        <w:rPr>
+          <w:b w:val="0"/>
+        </w:rPr>
+        <w:t xml:space="preserve">Írd át, amit kell (szöveg, fotó, ár, létszám), új alkalomhoz </w:t>
+      </w:r>
+      <w:r>
+        <w:rPr>
+          <w:b/>
+        </w:rPr>
+        <w:t>+ Időpont hozzáadása</w:t>
+      </w:r>
+      <w:r>
+        <w:rPr>
+          <w:b w:val="0"/>
+        </w:rPr>
+        <w:t>.</w:t>
+      </w:r>
+    </w:p>
+    <w:p>
+      <w:pPr>
+        <w:spacing w:after="40"/>
+        <w:ind w:left="510" w:hanging="340"/>
+      </w:pPr>
+      <w:r>
+        <w:t>3.</w:t>
+        <w:tab/>
+      </w:r>
+      <w:r>
+        <w:rPr>
+          <w:b/>
+        </w:rPr>
+        <w:t>Mentés</w:t>
+      </w:r>
+      <w:r>
+        <w:rPr>
+          <w:b w:val="0"/>
+        </w:rPr>
+        <w:t>.</w:t>
+      </w:r>
+    </w:p>
+    <w:p>
+      <w:pPr>
+        <w:pBdr>
+          <w:left w:val="single" w:sz="24" w:space="8" w:color="D9A441"/>
+        </w:pBdr>
+        <w:shd w:val="clear" w:color="auto" w:fill="FDF7E3"/>
+        <w:spacing w:after="0"/>
+      </w:pPr>
+      <w:r>
+        <w:rPr>
+          <w:b w:val="0"/>
+        </w:rPr>
+        <w:t>💡 A max. létszámot nem viheted a már lefoglalt létszám alá — a rendszer szól, és visszaállítja.</w:t>
+      </w:r>
+    </w:p>
+    <w:p>
+      <w:pPr>
+        <w:spacing w:after="0"/>
+      </w:pPr>
+    </w:p>
+    <w:p>
+      <w:pPr>
+        <w:pStyle w:val="Heading2"/>
+      </w:pPr>
+      <w:r>
+        <w:t>Csak csoportoknak szánt (zártkörű) alkalmat hirdetnék</w:t>
+      </w:r>
+    </w:p>
+    <w:p>
+      <w:r>
+        <w:rPr>
+          <w:b w:val="0"/>
+        </w:rPr>
+        <w:t>Az időpont sorában két nem kötelező mező van:</w:t>
+      </w:r>
+    </w:p>
+    <w:p>
+      <w:pPr>
+        <w:spacing w:after="40"/>
+        <w:ind w:left="510" w:hanging="340"/>
+      </w:pPr>
+      <w:r>
+        <w:t>•</w:t>
+        <w:tab/>
+      </w:r>
+      <w:r>
+        <w:rPr>
+          <w:b/>
+        </w:rPr>
+        <w:t>Min. fő/foglalás</w:t>
+      </w:r>
+      <w:r>
+        <w:rPr>
+          <w:b w:val="0"/>
+        </w:rPr>
+        <w:t xml:space="preserve"> — egy foglalás legalább ennyi fős lehet (pl. 8).</w:t>
+      </w:r>
+    </w:p>
+    <w:p>
+      <w:pPr>
+        <w:spacing w:after="40"/>
+        <w:ind w:left="510" w:hanging="340"/>
+      </w:pPr>
+      <w:r>
+        <w:t>•</w:t>
+        <w:tab/>
+      </w:r>
+      <w:r>
+        <w:rPr>
+          <w:b/>
+        </w:rPr>
+        <w:t>Max. foglalás</w:t>
+      </w:r>
+      <w:r>
+        <w:rPr>
+          <w:b w:val="0"/>
+        </w:rPr>
+        <w:t xml:space="preserve"> — összesen ennyi foglalás (csapat) jöhet (pl. 1 = egy csapat viszi az egészet).</w:t>
+      </w:r>
+    </w:p>
+    <w:p>
+      <w:r>
+        <w:rPr>
+          <w:b w:val="0"/>
+        </w:rPr>
+        <w:t>A kettő független, bármelyik megadható egyedül is. Az időpont magától lezár, ha elérte a max. foglalások számát, vagy ha a maradék hely kevesebb a minimumnál.</w:t>
+      </w:r>
+    </w:p>
+    <w:p>
+      <w:pPr>
+        <w:pBdr>
+          <w:left w:val="single" w:sz="24" w:space="8" w:color="D9A441"/>
+        </w:pBdr>
+        <w:shd w:val="clear" w:color="auto" w:fill="FDF7E3"/>
+        <w:spacing w:after="0"/>
+      </w:pPr>
+      <w:r>
+        <w:rPr>
+          <w:b w:val="0"/>
+        </w:rPr>
+        <w:t xml:space="preserve">💡 Zártkörű alkalomhoz add meg </w:t>
+      </w:r>
+      <w:r>
+        <w:rPr>
+          <w:b/>
+        </w:rPr>
+        <w:t>mindkettőt</w:t>
+      </w:r>
+      <w:r>
+        <w:rPr>
+          <w:b w:val="0"/>
+        </w:rPr>
+        <w:t xml:space="preserve"> (pl. Max. 1 foglalás + Min. 10 fő) — különben egy 2 fős foglalás is lezárja az egész alkalmat. Példák: a mezők alatti </w:t>
+      </w:r>
+      <w:r>
+        <w:rPr>
+          <w:b/>
+        </w:rPr>
+        <w:t>?</w:t>
+      </w:r>
+      <w:r>
+        <w:rPr>
+          <w:b w:val="0"/>
+        </w:rPr>
+        <w:t xml:space="preserve"> gomb.</w:t>
+      </w:r>
+    </w:p>
+    <w:p>
+      <w:pPr>
+        <w:spacing w:after="0"/>
+      </w:pPr>
+    </w:p>
+    <w:p>
+      <w:pPr>
+        <w:pStyle w:val="Heading2"/>
+      </w:pPr>
+      <w:r>
+        <w:t>Elmarad egy alkalom</w:t>
+      </w:r>
+    </w:p>
+    <w:p>
+      <w:pPr>
+        <w:spacing w:after="40"/>
+        <w:ind w:left="510" w:hanging="340"/>
+      </w:pPr>
+      <w:r>
+        <w:t>1.</w:t>
+        <w:tab/>
+      </w:r>
+      <w:r>
+        <w:rPr>
+          <w:b w:val="0"/>
+        </w:rPr>
+        <w:t xml:space="preserve">A programnál </w:t>
+      </w:r>
+      <w:r>
+        <w:rPr>
+          <w:b/>
+        </w:rPr>
+        <w:t>Szerkesztés</w:t>
+      </w:r>
+      <w:r>
+        <w:rPr>
+          <w:b w:val="0"/>
+        </w:rPr>
+        <w:t xml:space="preserve"> → az időpont állapota: </w:t>
+      </w:r>
+      <w:r>
+        <w:rPr>
+          <w:b/>
+        </w:rPr>
+        <w:t>Elmarad</w:t>
+      </w:r>
+      <w:r>
+        <w:rPr>
+          <w:b w:val="0"/>
+        </w:rPr>
+        <w:t xml:space="preserve"> → </w:t>
+      </w:r>
+      <w:r>
+        <w:rPr>
+          <w:b/>
+        </w:rPr>
+        <w:t>Mentés</w:t>
+      </w:r>
+      <w:r>
+        <w:rPr>
+          <w:b w:val="0"/>
+        </w:rPr>
+        <w:t>.</w:t>
+      </w:r>
+    </w:p>
+    <w:p>
+      <w:pPr>
+        <w:spacing w:after="40"/>
+        <w:ind w:left="510" w:hanging="340"/>
+      </w:pPr>
+      <w:r>
+        <w:t>2.</w:t>
+        <w:tab/>
+      </w:r>
+      <w:r>
+        <w:rPr>
+          <w:b w:val="0"/>
+        </w:rPr>
+        <w:t xml:space="preserve">Ha van rá foglalás, a rendszer megkérdezi: lemondja őket </w:t>
+      </w:r>
+      <w:r>
+        <w:rPr>
+          <w:b/>
+        </w:rPr>
+        <w:t>levél nélkül</w:t>
+      </w:r>
+      <w:r>
+        <w:rPr>
+          <w:b w:val="0"/>
+        </w:rPr>
+        <w:t xml:space="preserve">, vagy </w:t>
+      </w:r>
+      <w:r>
+        <w:rPr>
+          <w:b/>
+        </w:rPr>
+        <w:t>„sajnos elmarad” levéllel</w:t>
+      </w:r>
+      <w:r>
+        <w:rPr>
+          <w:b w:val="0"/>
+        </w:rPr>
+        <w:t>.</w:t>
+      </w:r>
+    </w:p>
+    <w:p>
+      <w:pPr>
+        <w:pBdr>
+          <w:left w:val="single" w:sz="24" w:space="8" w:color="D9A441"/>
+        </w:pBdr>
+        <w:shd w:val="clear" w:color="auto" w:fill="FDF7E3"/>
+        <w:spacing w:after="0"/>
+      </w:pPr>
+      <w:r>
+        <w:rPr>
+          <w:b w:val="0"/>
+        </w:rPr>
+        <w:t>💡 Foglalással rendelkező időpontot ne törölj — az „Elmarad” megőrzi a nyomát és értesíti a vendégeket. Törölni (✕) a foglalás nélküli időpontot lehet.</w:t>
+      </w:r>
+    </w:p>
+    <w:p>
+      <w:pPr>
+        <w:spacing w:after="0"/>
+      </w:pPr>
+    </w:p>
+    <w:p>
+      <w:pPr>
+        <w:pStyle w:val="Heading2"/>
+      </w:pPr>
+      <w:r>
+        <w:t>Egy időre leállítanám a foglalást</w:t>
+      </w:r>
+    </w:p>
+    <w:p>
+      <w:pPr>
+        <w:spacing w:after="40"/>
+        <w:ind w:left="510" w:hanging="340"/>
+      </w:pPr>
+      <w:r>
+        <w:t>•</w:t>
+        <w:tab/>
+      </w:r>
+      <w:r>
+        <w:rPr>
+          <w:b/>
+        </w:rPr>
+        <w:t>Egy programra:</w:t>
+      </w:r>
+      <w:r>
+        <w:rPr>
+          <w:b w:val="0"/>
+        </w:rPr>
+        <w:t xml:space="preserve"> a programnál </w:t>
+      </w:r>
+      <w:r>
+        <w:rPr>
+          <w:b/>
+        </w:rPr>
+        <w:t>Foglalás felfüggesztése</w:t>
+      </w:r>
+      <w:r>
+        <w:rPr>
+          <w:b w:val="0"/>
+        </w:rPr>
+        <w:t xml:space="preserve">. A főoldalon látszik, de nem foglalható. Visszakapcsolás: </w:t>
+      </w:r>
+      <w:r>
+        <w:rPr>
+          <w:b/>
+        </w:rPr>
+        <w:t>Foglalás engedélyezése</w:t>
+      </w:r>
+      <w:r>
+        <w:rPr>
+          <w:b w:val="0"/>
+        </w:rPr>
+        <w:t>.</w:t>
+      </w:r>
+    </w:p>
+    <w:p>
+      <w:pPr>
+        <w:spacing w:after="40"/>
+        <w:ind w:left="510" w:hanging="340"/>
+      </w:pPr>
+      <w:r>
+        <w:t>•</w:t>
+        <w:tab/>
+      </w:r>
+      <w:r>
+        <w:rPr>
+          <w:b/>
+        </w:rPr>
+        <w:t>Mindenre:</w:t>
+      </w:r>
+      <w:r>
+        <w:rPr>
+          <w:b w:val="0"/>
+        </w:rPr>
+        <w:t xml:space="preserve"> a Programok fül tetején </w:t>
+      </w:r>
+      <w:r>
+        <w:rPr>
+          <w:b/>
+        </w:rPr>
+        <w:t>Minden foglalás felfüggesztése</w:t>
+      </w:r>
+      <w:r>
+        <w:rPr>
+          <w:b w:val="0"/>
+        </w:rPr>
+        <w:t>. A feloldás mindent visszaenged.</w:t>
+      </w:r>
+    </w:p>
+    <w:p>
+      <w:pPr>
+        <w:pBdr>
+          <w:left w:val="single" w:sz="24" w:space="8" w:color="D9A441"/>
+        </w:pBdr>
+        <w:shd w:val="clear" w:color="auto" w:fill="FDF7E3"/>
+        <w:spacing w:after="0"/>
+      </w:pPr>
+      <w:r>
+        <w:rPr>
+          <w:b w:val="0"/>
+        </w:rPr>
+        <w:t>💡 Akkor hasznos, ha még nem biztos, hogy elindul egy program, vagy épp átírod az adatait. A meglévő foglalások megmaradnak.</w:t>
+      </w:r>
+    </w:p>
+    <w:p>
+      <w:pPr>
+        <w:spacing w:after="0"/>
+      </w:pPr>
+    </w:p>
+    <w:p>
+      <w:pPr>
+        <w:pStyle w:val="Heading2"/>
+      </w:pPr>
+      <w:r>
+        <w:t>Lement a program — eltenném vagy törölném</w:t>
+      </w:r>
+    </w:p>
+    <w:p>
+      <w:pPr>
+        <w:spacing w:after="40"/>
+        <w:ind w:left="510" w:hanging="340"/>
+      </w:pPr>
+      <w:r>
+        <w:t>•</w:t>
+        <w:tab/>
+      </w:r>
+      <w:r>
+        <w:rPr>
+          <w:b/>
+        </w:rPr>
+        <w:t>Archiválás</w:t>
+      </w:r>
+      <w:r>
+        <w:rPr>
+          <w:b w:val="0"/>
+        </w:rPr>
+        <w:t xml:space="preserve"> — lekerül a főoldalról, de az adatok és a foglalások megmaradnak (</w:t>
+      </w:r>
+      <w:r>
+        <w:rPr>
+          <w:b/>
+        </w:rPr>
+        <w:t>Archivált programok</w:t>
+      </w:r>
+      <w:r>
+        <w:rPr>
+          <w:b w:val="0"/>
+        </w:rPr>
+        <w:t xml:space="preserve"> alfül). Bármikor visszaállítható. </w:t>
+      </w:r>
+      <w:r>
+        <w:rPr>
+          <w:b/>
+        </w:rPr>
+        <w:t>Általában ezt válaszd.</w:t>
+      </w:r>
+    </w:p>
+    <w:p>
+      <w:pPr>
+        <w:spacing w:after="40"/>
+        <w:ind w:left="510" w:hanging="340"/>
+      </w:pPr>
+      <w:r>
+        <w:t>•</w:t>
+        <w:tab/>
+      </w:r>
+      <w:r>
+        <w:rPr>
+          <w:b/>
+        </w:rPr>
+        <w:t>Törlés</w:t>
+      </w:r>
+      <w:r>
+        <w:rPr>
+          <w:b w:val="0"/>
+        </w:rPr>
+        <w:t xml:space="preserve"> — végleg eltűnik minden időpontjával. Csak foglalás nélküli programnál jelenik meg.</w:t>
+      </w:r>
+    </w:p>
+    <w:p>
+      <w:r>
+        <w:rPr>
+          <w:b w:val="0"/>
+        </w:rPr>
+        <w:t xml:space="preserve">Hogy milyen sorrendben látszanak a főoldalon: a programlistában a </w:t>
+      </w:r>
+      <w:r>
+        <w:rPr>
+          <w:b/>
+        </w:rPr>
+        <w:t>⠿</w:t>
+      </w:r>
+      <w:r>
+        <w:rPr>
+          <w:b w:val="0"/>
+        </w:rPr>
+        <w:t xml:space="preserve"> fogantyúnál húzd át őket.</w:t>
+      </w:r>
+    </w:p>
+    <w:p>
+      <w:pPr>
+        <w:pStyle w:val="Heading1"/>
+      </w:pPr>
+      <w:r>
+        <w:t>3. Foglalások</w:t>
+      </w:r>
+    </w:p>
+    <w:p>
+      <w:pPr>
+        <w:pStyle w:val="Heading2"/>
+      </w:pPr>
+      <w:r>
+        <w:t>Egy foglalás útja</w:t>
+      </w:r>
+    </w:p>
+    <w:tbl>
+      <w:tblPr>
+        <w:tblStyle w:val="TableGrid"/>
+        <w:tblW w:type="auto" w:w="0"/>
+        <w:tblLook w:firstColumn="1" w:firstRow="1" w:lastColumn="0" w:lastRow="0" w:noHBand="0" w:noVBand="1" w:val="04A0"/>
+      </w:tblPr>
+      <w:tblGrid>
+        <w:gridCol w:w="3324"/>
+        <w:gridCol w:w="3324"/>
+        <w:gridCol w:w="3324"/>
+      </w:tblGrid>
+      <w:tr>
+        <w:tc>
+          <w:tcPr>
+            <w:tcW w:type="dxa" w:w="3324"/>
+            <w:shd w:val="clear" w:color="auto" w:fill="F6EFE6"/>
+          </w:tcPr>
+          <w:p>
+            <w:r/>
             <w:r>
               <w:rPr>
                 <w:b/>
@@ -263,12 +1275,11 @@
         </w:tc>
         <w:tc>
           <w:tcPr>
-            <w:tcW w:type="dxa" w:w="2880"/>
+            <w:tcW w:type="dxa" w:w="3324"/>
+            <w:shd w:val="clear" w:color="auto" w:fill="F6EFE6"/>
           </w:tcPr>
           <w:p>
-            <w:pPr>
-              <w:shd w:val="clear" w:color="auto" w:fill="F6EFE6"/>
-            </w:pPr>
+            <w:r/>
             <w:r>
               <w:rPr>
                 <w:b/>
@@ -279,12 +1290,11 @@
         </w:tc>
         <w:tc>
           <w:tcPr>
-            <w:tcW w:type="dxa" w:w="2880"/>
+            <w:tcW w:type="dxa" w:w="3324"/>
+            <w:shd w:val="clear" w:color="auto" w:fill="F6EFE6"/>
           </w:tcPr>
           <w:p>
-            <w:pPr>
-              <w:shd w:val="clear" w:color="auto" w:fill="F6EFE6"/>
-            </w:pPr>
+            <w:r/>
             <w:r>
               <w:rPr>
                 <w:b/>
@@ -297,68 +1307,42 @@
       <w:tr>
         <w:tc>
           <w:tcPr>
-            <w:tcW w:type="dxa" w:w="2880"/>
+            <w:tcW w:type="dxa" w:w="3324"/>
           </w:tcPr>
           <w:p>
             <w:r/>
             <w:r>
+              <w:rPr>
+                <w:b/>
+              </w:rPr>
               <w:t>Jóváhagyásra vár</w:t>
             </w:r>
           </w:p>
         </w:tc>
         <w:tc>
           <w:tcPr>
-            <w:tcW w:type="dxa" w:w="2880"/>
+            <w:tcW w:type="dxa" w:w="3324"/>
           </w:tcPr>
           <w:p>
             <w:r/>
             <w:r>
-              <w:t>Új foglalás, még nem döntöttetek róla.</w:t>
+              <w:rPr>
+                <w:b w:val="0"/>
+              </w:rPr>
+              <w:t>Új foglalás, még nem döntöttél.</w:t>
             </w:r>
           </w:p>
         </w:tc>
         <w:tc>
           <w:tcPr>
-            <w:tcW w:type="dxa" w:w="2880"/>
+            <w:tcW w:type="dxa" w:w="3324"/>
           </w:tcPr>
           <w:p>
             <w:r/>
             <w:r>
-              <w:t>Igen (fenntartja a helyet)</w:t>
-            </w:r>
-          </w:p>
-        </w:tc>
-      </w:tr>
-      <w:tr>
-        <w:tc>
-          <w:tcPr>
-            <w:tcW w:type="dxa" w:w="2880"/>
-          </w:tcPr>
-          <w:p>
-            <w:r/>
-            <w:r>
-              <w:t>Jóváhagyott</w:t>
-            </w:r>
-          </w:p>
-        </w:tc>
-        <w:tc>
-          <w:tcPr>
-            <w:tcW w:type="dxa" w:w="2880"/>
-          </w:tcPr>
-          <w:p>
-            <w:r/>
-            <w:r>
-              <w:t>Elfogadtátok, a vendég helye biztos.</w:t>
-            </w:r>
-          </w:p>
-        </w:tc>
-        <w:tc>
-          <w:tcPr>
-            <w:tcW w:type="dxa" w:w="2880"/>
-          </w:tcPr>
-          <w:p>
-            <w:r/>
-            <w:r>
+              <w:rPr>
+                <w:b w:val="0"/>
+              </w:rPr>
               <w:t>Igen</w:t>
             </w:r>
           </w:p>
@@ -367,34 +1351,43 @@
       <w:tr>
         <w:tc>
           <w:tcPr>
-            <w:tcW w:type="dxa" w:w="2880"/>
+            <w:tcW w:type="dxa" w:w="3324"/>
           </w:tcPr>
           <w:p>
             <w:r/>
             <w:r>
-              <w:t>Elutasított</w:t>
+              <w:rPr>
+                <w:b/>
+              </w:rPr>
+              <w:t>Jóváhagyott</w:t>
             </w:r>
           </w:p>
         </w:tc>
         <w:tc>
           <w:tcPr>
-            <w:tcW w:type="dxa" w:w="2880"/>
+            <w:tcW w:type="dxa" w:w="3324"/>
           </w:tcPr>
           <w:p>
             <w:r/>
             <w:r>
-              <w:t>Nem fogadtátok el (pl. betelt).</w:t>
+              <w:rPr>
+                <w:b w:val="0"/>
+              </w:rPr>
+              <w:t>Elfogadtad, a hely biztos.</w:t>
             </w:r>
           </w:p>
         </w:tc>
         <w:tc>
           <w:tcPr>
-            <w:tcW w:type="dxa" w:w="2880"/>
+            <w:tcW w:type="dxa" w:w="3324"/>
           </w:tcPr>
           <w:p>
             <w:r/>
             <w:r>
-              <w:t>Nem (felszabadítja)</w:t>
+              <w:rPr>
+                <w:b w:val="0"/>
+              </w:rPr>
+              <w:t>Igen</w:t>
             </w:r>
           </w:p>
         </w:tc>
@@ -402,79 +1395,127 @@
       <w:tr>
         <w:tc>
           <w:tcPr>
-            <w:tcW w:type="dxa" w:w="2880"/>
+            <w:tcW w:type="dxa" w:w="3324"/>
           </w:tcPr>
           <w:p>
             <w:r/>
             <w:r>
+              <w:rPr>
+                <w:b/>
+              </w:rPr>
+              <w:t>Elutasított</w:t>
+            </w:r>
+          </w:p>
+        </w:tc>
+        <w:tc>
+          <w:tcPr>
+            <w:tcW w:type="dxa" w:w="3324"/>
+          </w:tcPr>
+          <w:p>
+            <w:r/>
+            <w:r>
+              <w:rPr>
+                <w:b w:val="0"/>
+              </w:rPr>
+              <w:t>Nem fogadtad el.</w:t>
+            </w:r>
+          </w:p>
+        </w:tc>
+        <w:tc>
+          <w:tcPr>
+            <w:tcW w:type="dxa" w:w="3324"/>
+          </w:tcPr>
+          <w:p>
+            <w:r/>
+            <w:r>
+              <w:rPr>
+                <w:b w:val="0"/>
+              </w:rPr>
+              <w:t>Nem — a hely felszabadul</w:t>
+            </w:r>
+          </w:p>
+        </w:tc>
+      </w:tr>
+      <w:tr>
+        <w:tc>
+          <w:tcPr>
+            <w:tcW w:type="dxa" w:w="3324"/>
+          </w:tcPr>
+          <w:p>
+            <w:r/>
+            <w:r>
+              <w:rPr>
+                <w:b/>
+              </w:rPr>
               <w:t>Lemondott</w:t>
             </w:r>
           </w:p>
         </w:tc>
         <w:tc>
           <w:tcPr>
-            <w:tcW w:type="dxa" w:w="2880"/>
+            <w:tcW w:type="dxa" w:w="3324"/>
           </w:tcPr>
           <w:p>
             <w:r/>
             <w:r>
-              <w:t>A vendég lemondta, ti rögzítitek.</w:t>
+              <w:rPr>
+                <w:b w:val="0"/>
+              </w:rPr>
+              <w:t>A vendég lemondta.</w:t>
             </w:r>
           </w:p>
         </w:tc>
         <w:tc>
           <w:tcPr>
-            <w:tcW w:type="dxa" w:w="2880"/>
+            <w:tcW w:type="dxa" w:w="3324"/>
           </w:tcPr>
           <w:p>
             <w:r/>
             <w:r>
-              <w:t>Nem (felszabadítja)</w:t>
+              <w:rPr>
+                <w:b w:val="0"/>
+              </w:rPr>
+              <w:t>Nem — a hely felszabadul</w:t>
             </w:r>
           </w:p>
         </w:tc>
       </w:tr>
     </w:tbl>
-    <w:p/>
     <w:p>
       <w:pPr>
-        <w:pStyle w:val="Heading2"/>
+        <w:spacing w:after="0"/>
       </w:pPr>
-      <w:r>
-        <w:t>2.1 Milyen lépések lehetségesek?</w:t>
-      </w:r>
     </w:p>
     <w:p>
-      <w:pPr>
-        <w:pStyle w:val="ListBullet"/>
-      </w:pPr>
       <w:r>
         <w:rPr>
           <w:b w:val="0"/>
         </w:rPr>
-        <w:t>„Jóváhagyásra vár" állapotból: Jóváhagyás, Elutasítás, vagy Vendég lemondta.</w:t>
-      </w:r>
-    </w:p>
-    <w:p>
-      <w:pPr>
-        <w:pStyle w:val="ListBullet"/>
-      </w:pPr>
+        <w:t xml:space="preserve">A </w:t>
+      </w:r>
+      <w:r>
+        <w:rPr>
+          <w:b/>
+        </w:rPr>
+        <w:t>Foglalások</w:t>
+      </w:r>
       <w:r>
         <w:rPr>
           <w:b w:val="0"/>
         </w:rPr>
-        <w:t>„Jóváhagyott" állapotból: Vendég lemondta, vagy Jóváhagyás visszavonása (vissza „vár" állapotba).</w:t>
-      </w:r>
-    </w:p>
-    <w:p>
-      <w:pPr>
-        <w:pStyle w:val="ListBullet"/>
-      </w:pPr>
+        <w:t xml:space="preserve"> fülön minden státusz külön alfül (zárójelben a darabszám); az </w:t>
+      </w:r>
+      <w:r>
+        <w:rPr>
+          <w:b/>
+        </w:rPr>
+        <w:t>Összes foglalás</w:t>
+      </w:r>
       <w:r>
         <w:rPr>
           <w:b w:val="0"/>
         </w:rPr>
-        <w:t>„Elutasított" / „Lemondott": lezárt állapot, innen nincs további lépés.</w:t>
+        <w:t xml:space="preserve"> mindent mutat. Szűrhetsz időpontra, névre, és arra, hogy jövőbeli / mai / múltbéli.</w:t>
       </w:r>
     </w:p>
     <w:p>
@@ -482,7 +1523,7 @@
         <w:pStyle w:val="Heading2"/>
       </w:pPr>
       <w:r>
-        <w:t>2.2 Szabad helyek</w:t>
+        <w:t>Új foglalás érkezett — mit csináljak?</w:t>
       </w:r>
     </w:p>
     <w:p>
@@ -490,7 +1531,439 @@
         <w:rPr>
           <w:b w:val="0"/>
         </w:rPr>
-        <w:t>A szabad helyek száma = max. létszám − (a „jóváhagyásra vár" + „jóváhagyott" foglalások létszáma). Ha egy foglalást elutasítasz vagy lemondasz, a helye azonnal felszabadul, és újra foglalható.</w:t>
+        <w:t>A vendég azonnal kap egy automatikus visszaigazolást („megkaptuk”), te pedig értesítőt a csapat e-mail címére.</w:t>
+      </w:r>
+    </w:p>
+    <w:p>
+      <w:pPr>
+        <w:spacing w:after="40"/>
+        <w:ind w:left="510" w:hanging="340"/>
+      </w:pPr>
+      <w:r>
+        <w:t>1.</w:t>
+        <w:tab/>
+      </w:r>
+      <w:r>
+        <w:rPr>
+          <w:b/>
+        </w:rPr>
+        <w:t>Foglalások</w:t>
+      </w:r>
+      <w:r>
+        <w:rPr>
+          <w:b w:val="0"/>
+        </w:rPr>
+        <w:t xml:space="preserve"> → </w:t>
+      </w:r>
+      <w:r>
+        <w:rPr>
+          <w:b/>
+        </w:rPr>
+        <w:t>Jóváhagyásra vár</w:t>
+      </w:r>
+      <w:r>
+        <w:rPr>
+          <w:b w:val="0"/>
+        </w:rPr>
+        <w:t>.</w:t>
+      </w:r>
+    </w:p>
+    <w:p>
+      <w:pPr>
+        <w:spacing w:after="40"/>
+        <w:ind w:left="510" w:hanging="340"/>
+      </w:pPr>
+      <w:r>
+        <w:t>2.</w:t>
+        <w:tab/>
+      </w:r>
+      <w:r>
+        <w:rPr>
+          <w:b w:val="0"/>
+        </w:rPr>
+        <w:t xml:space="preserve">Nézd meg a foglalást (a 📝 jel = van megjegyzése). Ha rendben van (pl. megjött az utalás): </w:t>
+      </w:r>
+      <w:r>
+        <w:rPr>
+          <w:b/>
+        </w:rPr>
+        <w:t>Jóváhagyás</w:t>
+      </w:r>
+      <w:r>
+        <w:rPr>
+          <w:b w:val="0"/>
+        </w:rPr>
+        <w:t>.</w:t>
+      </w:r>
+    </w:p>
+    <w:p>
+      <w:pPr>
+        <w:spacing w:after="40"/>
+        <w:ind w:left="510" w:hanging="340"/>
+      </w:pPr>
+      <w:r>
+        <w:t>3.</w:t>
+        <w:tab/>
+      </w:r>
+      <w:r>
+        <w:rPr>
+          <w:b w:val="0"/>
+        </w:rPr>
+        <w:t xml:space="preserve">Utána a sorban </w:t>
+      </w:r>
+      <w:r>
+        <w:rPr>
+          <w:b/>
+        </w:rPr>
+        <w:t>✉ Levél</w:t>
+      </w:r>
+      <w:r>
+        <w:rPr>
+          <w:b w:val="0"/>
+        </w:rPr>
+        <w:t xml:space="preserve"> → elküldöd a jóváhagyó levelet. A szöveg küldés előtt átírható.</w:t>
+      </w:r>
+    </w:p>
+    <w:p>
+      <w:pPr>
+        <w:spacing w:after="40"/>
+        <w:ind w:left="510" w:hanging="340"/>
+      </w:pPr>
+      <w:r>
+        <w:t>4.</w:t>
+        <w:tab/>
+      </w:r>
+      <w:r>
+        <w:rPr>
+          <w:b w:val="0"/>
+        </w:rPr>
+        <w:t xml:space="preserve">Ha nem tudod fogadni: </w:t>
+      </w:r>
+      <w:r>
+        <w:rPr>
+          <w:b/>
+        </w:rPr>
+        <w:t>Elutasítás</w:t>
+      </w:r>
+      <w:r>
+        <w:rPr>
+          <w:b w:val="0"/>
+        </w:rPr>
+        <w:t xml:space="preserve">, majd </w:t>
+      </w:r>
+      <w:r>
+        <w:rPr>
+          <w:b/>
+        </w:rPr>
+        <w:t>✉ Levél</w:t>
+      </w:r>
+      <w:r>
+        <w:rPr>
+          <w:b w:val="0"/>
+        </w:rPr>
+        <w:t xml:space="preserve"> az elutasítóval.</w:t>
+      </w:r>
+    </w:p>
+    <w:p>
+      <w:pPr>
+        <w:pBdr>
+          <w:left w:val="single" w:sz="24" w:space="8" w:color="D9A441"/>
+        </w:pBdr>
+        <w:shd w:val="clear" w:color="auto" w:fill="FDF7E3"/>
+        <w:spacing w:after="0"/>
+      </w:pPr>
+      <w:r>
+        <w:rPr>
+          <w:b w:val="0"/>
+        </w:rPr>
+        <w:t xml:space="preserve">💡 </w:t>
+      </w:r>
+      <w:r>
+        <w:rPr>
+          <w:b/>
+        </w:rPr>
+        <w:t>Miért két lépés?</w:t>
+      </w:r>
+      <w:r>
+        <w:rPr>
+          <w:b w:val="0"/>
+        </w:rPr>
+        <w:t xml:space="preserve"> A státuszváltás magától nem küld levelet. Így előbb dönthetsz, és a levelet személyre szabhatod.</w:t>
+      </w:r>
+    </w:p>
+    <w:p>
+      <w:pPr>
+        <w:spacing w:after="0"/>
+      </w:pPr>
+    </w:p>
+    <w:p>
+      <w:pPr>
+        <w:jc w:val="center"/>
+      </w:pPr>
+      <w:r>
+        <w:rPr>
+          <w:i/>
+          <w:color w:val="7A6A58"/>
+        </w:rPr>
+        <w:t>📷 Képernyőkép: a Foglalások lista egy sorral és a gombokkal</w:t>
+      </w:r>
+    </w:p>
+    <w:p>
+      <w:pPr>
+        <w:pStyle w:val="Heading2"/>
+      </w:pPr>
+      <w:r>
+        <w:t>A vendég lemondta</w:t>
+      </w:r>
+    </w:p>
+    <w:p>
+      <w:pPr>
+        <w:spacing w:after="40"/>
+        <w:ind w:left="510" w:hanging="340"/>
+      </w:pPr>
+      <w:r>
+        <w:t>1.</w:t>
+        <w:tab/>
+      </w:r>
+      <w:r>
+        <w:rPr>
+          <w:b w:val="0"/>
+        </w:rPr>
+        <w:t xml:space="preserve">A foglalásnál </w:t>
+      </w:r>
+      <w:r>
+        <w:rPr>
+          <w:b/>
+        </w:rPr>
+        <w:t>Vendég lemondta</w:t>
+      </w:r>
+      <w:r>
+        <w:rPr>
+          <w:b w:val="0"/>
+        </w:rPr>
+        <w:t>.</w:t>
+      </w:r>
+    </w:p>
+    <w:p>
+      <w:pPr>
+        <w:spacing w:after="40"/>
+        <w:ind w:left="510" w:hanging="340"/>
+      </w:pPr>
+      <w:r>
+        <w:t>2.</w:t>
+        <w:tab/>
+      </w:r>
+      <w:r>
+        <w:rPr>
+          <w:b w:val="0"/>
+        </w:rPr>
+        <w:t xml:space="preserve">Ha kell, </w:t>
+      </w:r>
+      <w:r>
+        <w:rPr>
+          <w:b/>
+        </w:rPr>
+        <w:t>✉ Levél</w:t>
+      </w:r>
+      <w:r>
+        <w:rPr>
+          <w:b w:val="0"/>
+        </w:rPr>
+        <w:t xml:space="preserve"> a lemondás visszaigazolásával.</w:t>
+      </w:r>
+    </w:p>
+    <w:p>
+      <w:pPr>
+        <w:pBdr>
+          <w:left w:val="single" w:sz="24" w:space="8" w:color="D9A441"/>
+        </w:pBdr>
+        <w:shd w:val="clear" w:color="auto" w:fill="FDF7E3"/>
+        <w:spacing w:after="0"/>
+      </w:pPr>
+      <w:r>
+        <w:rPr>
+          <w:b w:val="0"/>
+        </w:rPr>
+        <w:t>💡 A hely azonnal felszabadul, és újra foglalható.</w:t>
+      </w:r>
+    </w:p>
+    <w:p>
+      <w:pPr>
+        <w:spacing w:after="0"/>
+      </w:pPr>
+    </w:p>
+    <w:p>
+      <w:pPr>
+        <w:pStyle w:val="Heading2"/>
+      </w:pPr>
+      <w:r>
+        <w:t>Más létszámmal jönnének, vagy másik időpontra mennének</w:t>
+      </w:r>
+    </w:p>
+    <w:p>
+      <w:pPr>
+        <w:spacing w:after="40"/>
+        <w:ind w:left="510" w:hanging="340"/>
+      </w:pPr>
+      <w:r>
+        <w:t>1.</w:t>
+        <w:tab/>
+      </w:r>
+      <w:r>
+        <w:rPr>
+          <w:b w:val="0"/>
+        </w:rPr>
+        <w:t xml:space="preserve">A foglalásnál </w:t>
+      </w:r>
+      <w:r>
+        <w:rPr>
+          <w:b/>
+        </w:rPr>
+        <w:t>Szerkesztés</w:t>
+      </w:r>
+      <w:r>
+        <w:rPr>
+          <w:b w:val="0"/>
+        </w:rPr>
+        <w:t>.</w:t>
+      </w:r>
+    </w:p>
+    <w:p>
+      <w:pPr>
+        <w:spacing w:after="40"/>
+        <w:ind w:left="510" w:hanging="340"/>
+      </w:pPr>
+      <w:r>
+        <w:t>2.</w:t>
+        <w:tab/>
+      </w:r>
+      <w:r>
+        <w:rPr>
+          <w:b w:val="0"/>
+        </w:rPr>
+        <w:t xml:space="preserve">Átírhatod a nevet, elérhetőségeket, létszámot, megjegyzést, és áthelyezheted </w:t>
+      </w:r>
+      <w:r>
+        <w:rPr>
+          <w:b/>
+        </w:rPr>
+        <w:t>ugyanannak a programnak</w:t>
+      </w:r>
+      <w:r>
+        <w:rPr>
+          <w:b w:val="0"/>
+        </w:rPr>
+        <w:t xml:space="preserve"> egy másik időpontjára.</w:t>
+      </w:r>
+    </w:p>
+    <w:p>
+      <w:pPr>
+        <w:spacing w:after="40"/>
+        <w:ind w:left="510" w:hanging="340"/>
+      </w:pPr>
+      <w:r>
+        <w:t>3.</w:t>
+        <w:tab/>
+      </w:r>
+      <w:r>
+        <w:rPr>
+          <w:b/>
+        </w:rPr>
+        <w:t>Mentés</w:t>
+      </w:r>
+      <w:r>
+        <w:rPr>
+          <w:b w:val="0"/>
+        </w:rPr>
+        <w:t>.</w:t>
+      </w:r>
+    </w:p>
+    <w:p>
+      <w:pPr>
+        <w:pBdr>
+          <w:left w:val="single" w:sz="24" w:space="8" w:color="D9A441"/>
+        </w:pBdr>
+        <w:shd w:val="clear" w:color="auto" w:fill="FDF7E3"/>
+        <w:spacing w:after="0"/>
+      </w:pPr>
+      <w:r>
+        <w:rPr>
+          <w:b w:val="0"/>
+        </w:rPr>
+        <w:t xml:space="preserve">💡 Áthelyezni csak </w:t>
+      </w:r>
+      <w:r>
+        <w:rPr>
+          <w:b/>
+        </w:rPr>
+        <w:t>azonos árú</w:t>
+      </w:r>
+      <w:r>
+        <w:rPr>
+          <w:b w:val="0"/>
+        </w:rPr>
+        <w:t xml:space="preserve"> időpontra lehet — eltérő árnál a vendégnek újra kell foglalnia. A férőhelyet a rendszer itt is betartja; a csoportos minimum alá viszont engedi (csak rákérdez).</w:t>
+      </w:r>
+    </w:p>
+    <w:p>
+      <w:pPr>
+        <w:spacing w:after="0"/>
+      </w:pPr>
+    </w:p>
+    <w:p>
+      <w:pPr>
+        <w:pStyle w:val="Heading2"/>
+      </w:pPr>
+      <w:r>
+        <w:t>Tévedésből hagytam jóvá</w:t>
+      </w:r>
+    </w:p>
+    <w:p>
+      <w:r>
+        <w:rPr>
+          <w:b w:val="0"/>
+        </w:rPr>
+        <w:t xml:space="preserve">A foglalásnál </w:t>
+      </w:r>
+      <w:r>
+        <w:rPr>
+          <w:b/>
+        </w:rPr>
+        <w:t>Jóváhagyás visszavonása</w:t>
+      </w:r>
+      <w:r>
+        <w:rPr>
+          <w:b w:val="0"/>
+        </w:rPr>
+        <w:t xml:space="preserve"> — visszakerül „Jóváhagyásra vár” állapotba.</w:t>
+      </w:r>
+    </w:p>
+    <w:p>
+      <w:pPr>
+        <w:pStyle w:val="Heading2"/>
+      </w:pPr>
+      <w:r>
+        <w:t>Takarítás: régi, lezárt foglalások</w:t>
+      </w:r>
+    </w:p>
+    <w:p>
+      <w:r>
+        <w:rPr>
+          <w:b w:val="0"/>
+        </w:rPr>
+        <w:t xml:space="preserve">Elutasított vagy lemondott foglalásnál megjelenik a </w:t>
+      </w:r>
+      <w:r>
+        <w:rPr>
+          <w:b/>
+        </w:rPr>
+        <w:t>🗑 Törlés</w:t>
+      </w:r>
+      <w:r>
+        <w:rPr>
+          <w:b w:val="0"/>
+        </w:rPr>
+        <w:t>, ami véglegesen eltávolítja. Élő (váró vagy jóváhagyott) foglalást nem lehet törölni.</w:t>
       </w:r>
     </w:p>
     <w:p>
@@ -498,7 +1971,7 @@
         <w:pStyle w:val="Heading1"/>
       </w:pPr>
       <w:r>
-        <w:t>3. Milyen e-mailek mennek ki?</w:t>
+        <w:t>4. Egyedi programok és ajánlatok</w:t>
       </w:r>
     </w:p>
     <w:p>
@@ -506,7 +1979,761 @@
         <w:rPr>
           <w:b w:val="0"/>
         </w:rPr>
-        <w:t>A rendszer hétféle levelet ismer. Egy részük automatikus, más részüket ti küldtök egy gombnyomással (a szöveget küldés előtt megnézhetitek és szerkeszthetitek).</w:t>
+        <w:t xml:space="preserve">Az egyedi ág </w:t>
+      </w:r>
+      <w:r>
+        <w:rPr>
+          <w:b/>
+        </w:rPr>
+        <w:t>időpont és ár nélküli ötleteket</w:t>
+      </w:r>
+      <w:r>
+        <w:rPr>
+          <w:b w:val="0"/>
+        </w:rPr>
+        <w:t xml:space="preserve"> kínál (pl. leánybúcsú, céges csapatépítő). A vendég ezekre </w:t>
+      </w:r>
+      <w:r>
+        <w:rPr>
+          <w:b/>
+        </w:rPr>
+        <w:t>ajánlatot kér</w:t>
+      </w:r>
+      <w:r>
+        <w:rPr>
+          <w:b w:val="0"/>
+        </w:rPr>
+        <w:t>; az árat és az időpontot e-mailben egyeztetitek, a rendszer pedig nyilvántartja, hol tart az ügy.</w:t>
+      </w:r>
+    </w:p>
+    <w:p>
+      <w:pPr>
+        <w:pStyle w:val="Heading2"/>
+      </w:pPr>
+      <w:r>
+        <w:t>Új ötletet tennék ki a főoldalra</w:t>
+      </w:r>
+    </w:p>
+    <w:p>
+      <w:pPr>
+        <w:spacing w:after="40"/>
+        <w:ind w:left="510" w:hanging="340"/>
+      </w:pPr>
+      <w:r>
+        <w:t>1.</w:t>
+        <w:tab/>
+      </w:r>
+      <w:r>
+        <w:rPr>
+          <w:b/>
+        </w:rPr>
+        <w:t>Egyedi programok</w:t>
+      </w:r>
+      <w:r>
+        <w:rPr>
+          <w:b w:val="0"/>
+        </w:rPr>
+        <w:t xml:space="preserve"> fül → </w:t>
+      </w:r>
+      <w:r>
+        <w:rPr>
+          <w:b/>
+        </w:rPr>
+        <w:t>+ Új egyedi program</w:t>
+      </w:r>
+      <w:r>
+        <w:rPr>
+          <w:b w:val="0"/>
+        </w:rPr>
+        <w:t>.</w:t>
+      </w:r>
+    </w:p>
+    <w:p>
+      <w:pPr>
+        <w:spacing w:after="40"/>
+        <w:ind w:left="510" w:hanging="340"/>
+      </w:pPr>
+      <w:r>
+        <w:t>2.</w:t>
+        <w:tab/>
+      </w:r>
+      <w:r>
+        <w:rPr>
+          <w:b w:val="0"/>
+        </w:rPr>
+        <w:t>Cím, rövid leírás (a kártyára), részletes leírás (nem kötelező), fotó.</w:t>
+      </w:r>
+    </w:p>
+    <w:p>
+      <w:pPr>
+        <w:spacing w:after="40"/>
+        <w:ind w:left="510" w:hanging="340"/>
+      </w:pPr>
+      <w:r>
+        <w:t>3.</w:t>
+        <w:tab/>
+      </w:r>
+      <w:r>
+        <w:rPr>
+          <w:b/>
+        </w:rPr>
+        <w:t>Mentés</w:t>
+      </w:r>
+      <w:r>
+        <w:rPr>
+          <w:b w:val="0"/>
+        </w:rPr>
+        <w:t xml:space="preserve">. A kártyán a vendég a </w:t>
+      </w:r>
+      <w:r>
+        <w:rPr>
+          <w:b/>
+        </w:rPr>
+        <w:t>„Kérjen egyedi ajánlatot”</w:t>
+      </w:r>
+      <w:r>
+        <w:rPr>
+          <w:b w:val="0"/>
+        </w:rPr>
+        <w:t xml:space="preserve"> gombot látja.</w:t>
+      </w:r>
+    </w:p>
+    <w:p>
+      <w:pPr>
+        <w:pBdr>
+          <w:left w:val="single" w:sz="24" w:space="8" w:color="D9A441"/>
+        </w:pBdr>
+        <w:shd w:val="clear" w:color="auto" w:fill="FDF7E3"/>
+        <w:spacing w:after="0"/>
+      </w:pPr>
+      <w:r>
+        <w:rPr>
+          <w:b w:val="0"/>
+        </w:rPr>
+        <w:t xml:space="preserve">💡 Ha egy ötletet már nem kínálsz: </w:t>
+      </w:r>
+      <w:r>
+        <w:rPr>
+          <w:b/>
+        </w:rPr>
+        <w:t>Archiválás</w:t>
+      </w:r>
+      <w:r>
+        <w:rPr>
+          <w:b w:val="0"/>
+        </w:rPr>
+        <w:t xml:space="preserve"> — a beérkezett kérések megmaradnak. Sorrend: a </w:t>
+      </w:r>
+      <w:r>
+        <w:rPr>
+          <w:b/>
+        </w:rPr>
+        <w:t>⠿</w:t>
+      </w:r>
+      <w:r>
+        <w:rPr>
+          <w:b w:val="0"/>
+        </w:rPr>
+        <w:t xml:space="preserve"> fogantyúnál húzd.</w:t>
+      </w:r>
+    </w:p>
+    <w:p>
+      <w:pPr>
+        <w:spacing w:after="0"/>
+      </w:pPr>
+    </w:p>
+    <w:p>
+      <w:pPr>
+        <w:pStyle w:val="Heading2"/>
+      </w:pPr>
+      <w:r>
+        <w:t>Ajánlatkérés érkezett — a teljes menet</w:t>
+      </w:r>
+    </w:p>
+    <w:p>
+      <w:r>
+        <w:rPr>
+          <w:b w:val="0"/>
+        </w:rPr>
+        <w:t xml:space="preserve">A vendég automatikus visszaigazolást kap, te értesítőt a csapat címére. A kérés </w:t>
+      </w:r>
+      <w:r>
+        <w:rPr>
+          <w:b/>
+        </w:rPr>
+        <w:t>Ajánlatra vár</w:t>
+      </w:r>
+      <w:r>
+        <w:rPr>
+          <w:b w:val="0"/>
+        </w:rPr>
+        <w:t xml:space="preserve"> állapotban jelenik meg.</w:t>
+      </w:r>
+    </w:p>
+    <w:p>
+      <w:pPr>
+        <w:spacing w:after="40"/>
+        <w:ind w:left="510" w:hanging="340"/>
+      </w:pPr>
+      <w:r>
+        <w:t>1.</w:t>
+        <w:tab/>
+      </w:r>
+      <w:r>
+        <w:rPr>
+          <w:b/>
+        </w:rPr>
+        <w:t>Ajánlatok</w:t>
+      </w:r>
+      <w:r>
+        <w:rPr>
+          <w:b w:val="0"/>
+        </w:rPr>
+        <w:t xml:space="preserve"> → </w:t>
+      </w:r>
+      <w:r>
+        <w:rPr>
+          <w:b/>
+        </w:rPr>
+        <w:t>Részletek</w:t>
+      </w:r>
+      <w:r>
+        <w:rPr>
+          <w:b w:val="0"/>
+        </w:rPr>
+        <w:t xml:space="preserve">: mit kér (létszám, kívánt időpont, üzenet). Ide írhatsz </w:t>
+      </w:r>
+      <w:r>
+        <w:rPr>
+          <w:b/>
+        </w:rPr>
+        <w:t>belső jegyzetet</w:t>
+      </w:r>
+      <w:r>
+        <w:rPr>
+          <w:b w:val="0"/>
+        </w:rPr>
+        <w:t xml:space="preserve"> is — a vendég soha nem látja.</w:t>
+      </w:r>
+    </w:p>
+    <w:p>
+      <w:pPr>
+        <w:spacing w:after="40"/>
+        <w:ind w:left="510" w:hanging="340"/>
+      </w:pPr>
+      <w:r>
+        <w:t>2.</w:t>
+        <w:tab/>
+      </w:r>
+      <w:r>
+        <w:rPr>
+          <w:b w:val="0"/>
+        </w:rPr>
+        <w:t xml:space="preserve">Állítsd össze az ajánlatot, és küldd el a vendégnek </w:t>
+      </w:r>
+      <w:r>
+        <w:rPr>
+          <w:b/>
+        </w:rPr>
+        <w:t>a saját leveleződből</w:t>
+      </w:r>
+      <w:r>
+        <w:rPr>
+          <w:b w:val="0"/>
+        </w:rPr>
+        <w:t>.</w:t>
+      </w:r>
+    </w:p>
+    <w:p>
+      <w:pPr>
+        <w:spacing w:after="40"/>
+        <w:ind w:left="510" w:hanging="340"/>
+      </w:pPr>
+      <w:r>
+        <w:t>3.</w:t>
+        <w:tab/>
+      </w:r>
+      <w:r>
+        <w:rPr>
+          <w:b w:val="0"/>
+        </w:rPr>
+        <w:t xml:space="preserve">Jelöld a rendszerben: </w:t>
+      </w:r>
+      <w:r>
+        <w:rPr>
+          <w:b/>
+        </w:rPr>
+        <w:t>Ajánlat kiküldve</w:t>
+      </w:r>
+      <w:r>
+        <w:rPr>
+          <w:b w:val="0"/>
+        </w:rPr>
+        <w:t>. Így látszik, hogy a válaszára vársz.</w:t>
+      </w:r>
+    </w:p>
+    <w:p>
+      <w:pPr>
+        <w:spacing w:after="40"/>
+        <w:ind w:left="510" w:hanging="340"/>
+      </w:pPr>
+      <w:r>
+        <w:t>4.</w:t>
+        <w:tab/>
+      </w:r>
+      <w:r>
+        <w:rPr>
+          <w:b w:val="0"/>
+        </w:rPr>
+        <w:t xml:space="preserve">Ha elfogadta: </w:t>
+      </w:r>
+      <w:r>
+        <w:rPr>
+          <w:b/>
+        </w:rPr>
+        <w:t>Elfogad</w:t>
+      </w:r>
+      <w:r>
+        <w:rPr>
+          <w:b w:val="0"/>
+        </w:rPr>
+        <w:t xml:space="preserve"> → a </w:t>
+      </w:r>
+      <w:r>
+        <w:rPr>
+          <w:b/>
+        </w:rPr>
+        <w:t>végleges</w:t>
+      </w:r>
+      <w:r>
+        <w:rPr>
+          <w:b w:val="0"/>
+        </w:rPr>
+        <w:t xml:space="preserve"> időpont, létszám, </w:t>
+      </w:r>
+      <w:r>
+        <w:rPr>
+          <w:b/>
+        </w:rPr>
+        <w:t>összár</w:t>
+      </w:r>
+      <w:r>
+        <w:rPr>
+          <w:b w:val="0"/>
+        </w:rPr>
+        <w:t xml:space="preserve"> (a teljes rendezvényre, nem fejenként) és az ajánlat szövege (lehet „Ajánlat a csatolmány szerint”). Fájlt is csatolhatsz.</w:t>
+      </w:r>
+    </w:p>
+    <w:p>
+      <w:pPr>
+        <w:spacing w:after="40"/>
+        <w:ind w:left="510" w:hanging="340"/>
+      </w:pPr>
+      <w:r>
+        <w:t>5.</w:t>
+        <w:tab/>
+      </w:r>
+      <w:r>
+        <w:rPr>
+          <w:b w:val="0"/>
+        </w:rPr>
+        <w:t xml:space="preserve">Végül </w:t>
+      </w:r>
+      <w:r>
+        <w:rPr>
+          <w:b/>
+        </w:rPr>
+        <w:t>✉ Levél</w:t>
+      </w:r>
+      <w:r>
+        <w:rPr>
+          <w:b w:val="0"/>
+        </w:rPr>
+        <w:t xml:space="preserve"> → megerősítő levél a végleges adatokkal (a csatolmánnyal együtt).</w:t>
+      </w:r>
+    </w:p>
+    <w:p>
+      <w:pPr>
+        <w:pBdr>
+          <w:left w:val="single" w:sz="24" w:space="8" w:color="D9A441"/>
+        </w:pBdr>
+        <w:shd w:val="clear" w:color="auto" w:fill="FDF7E3"/>
+        <w:spacing w:after="0"/>
+      </w:pPr>
+      <w:r>
+        <w:rPr>
+          <w:b w:val="0"/>
+        </w:rPr>
+        <w:t xml:space="preserve">💡 </w:t>
+      </w:r>
+      <w:r>
+        <w:rPr>
+          <w:b/>
+        </w:rPr>
+        <w:t>Miért érdemes elfogadni a rendszerben is?</w:t>
+      </w:r>
+      <w:r>
+        <w:rPr>
+          <w:b w:val="0"/>
+        </w:rPr>
+        <w:t xml:space="preserve"> Az elfogadott ajánlat </w:t>
+      </w:r>
+      <w:r>
+        <w:rPr>
+          <w:b/>
+        </w:rPr>
+        <w:t>lilával a Naptárba</w:t>
+      </w:r>
+      <w:r>
+        <w:rPr>
+          <w:b w:val="0"/>
+        </w:rPr>
+        <w:t xml:space="preserve"> kerül, így egy helyen látod a foglalásokkal.</w:t>
+      </w:r>
+    </w:p>
+    <w:p>
+      <w:pPr>
+        <w:spacing w:after="0"/>
+      </w:pPr>
+    </w:p>
+    <w:p>
+      <w:pPr>
+        <w:jc w:val="center"/>
+      </w:pPr>
+      <w:r>
+        <w:rPr>
+          <w:i/>
+          <w:color w:val="7A6A58"/>
+        </w:rPr>
+        <w:t>📷 Képernyőkép: az Ajánlatok lista és az Elfogad ablak</w:t>
+      </w:r>
+    </w:p>
+    <w:p>
+      <w:pPr>
+        <w:pStyle w:val="Heading2"/>
+      </w:pPr>
+      <w:r>
+        <w:t>Változott a megbeszélt időpont vagy ár</w:t>
+      </w:r>
+    </w:p>
+    <w:p>
+      <w:pPr>
+        <w:spacing w:after="40"/>
+        <w:ind w:left="510" w:hanging="340"/>
+      </w:pPr>
+      <w:r>
+        <w:t>1.</w:t>
+        <w:tab/>
+      </w:r>
+      <w:r>
+        <w:rPr>
+          <w:b w:val="0"/>
+        </w:rPr>
+        <w:t xml:space="preserve">Az ajánlatnál </w:t>
+      </w:r>
+      <w:r>
+        <w:rPr>
+          <w:b/>
+        </w:rPr>
+        <w:t>Részletek</w:t>
+      </w:r>
+      <w:r>
+        <w:rPr>
+          <w:b w:val="0"/>
+        </w:rPr>
+        <w:t xml:space="preserve"> → </w:t>
+      </w:r>
+      <w:r>
+        <w:rPr>
+          <w:b/>
+        </w:rPr>
+        <w:t>Végleges adatok módosítása / megtekintése</w:t>
+      </w:r>
+      <w:r>
+        <w:rPr>
+          <w:b w:val="0"/>
+        </w:rPr>
+        <w:t>.</w:t>
+      </w:r>
+    </w:p>
+    <w:p>
+      <w:pPr>
+        <w:spacing w:after="40"/>
+        <w:ind w:left="510" w:hanging="340"/>
+      </w:pPr>
+      <w:r>
+        <w:t>2.</w:t>
+        <w:tab/>
+      </w:r>
+      <w:r>
+        <w:rPr>
+          <w:b w:val="0"/>
+        </w:rPr>
+        <w:t xml:space="preserve">Írd át, </w:t>
+      </w:r>
+      <w:r>
+        <w:rPr>
+          <w:b/>
+        </w:rPr>
+        <w:t>Mentés</w:t>
+      </w:r>
+      <w:r>
+        <w:rPr>
+          <w:b w:val="0"/>
+        </w:rPr>
+        <w:t>. Ha kell, küldj új megerősítést (</w:t>
+      </w:r>
+      <w:r>
+        <w:rPr>
+          <w:b/>
+        </w:rPr>
+        <w:t>✉ Levél</w:t>
+      </w:r>
+      <w:r>
+        <w:rPr>
+          <w:b w:val="0"/>
+        </w:rPr>
+        <w:t>).</w:t>
+      </w:r>
+    </w:p>
+    <w:p>
+      <w:pPr>
+        <w:pStyle w:val="Heading2"/>
+      </w:pPr>
+      <w:r>
+        <w:t>Nem lesz belőle rendezvény</w:t>
+      </w:r>
+    </w:p>
+    <w:p>
+      <w:pPr>
+        <w:spacing w:after="40"/>
+        <w:ind w:left="510" w:hanging="340"/>
+      </w:pPr>
+      <w:r>
+        <w:t>•</w:t>
+        <w:tab/>
+      </w:r>
+      <w:r>
+        <w:rPr>
+          <w:b/>
+        </w:rPr>
+        <w:t>Elutasítás</w:t>
+      </w:r>
+      <w:r>
+        <w:rPr>
+          <w:b w:val="0"/>
+        </w:rPr>
+        <w:t xml:space="preserve"> — ha te nem vállalod.</w:t>
+      </w:r>
+    </w:p>
+    <w:p>
+      <w:pPr>
+        <w:spacing w:after="40"/>
+        <w:ind w:left="510" w:hanging="340"/>
+      </w:pPr>
+      <w:r>
+        <w:t>•</w:t>
+        <w:tab/>
+      </w:r>
+      <w:r>
+        <w:rPr>
+          <w:b/>
+        </w:rPr>
+        <w:t>Lemondás</w:t>
+      </w:r>
+      <w:r>
+        <w:rPr>
+          <w:b w:val="0"/>
+        </w:rPr>
+        <w:t xml:space="preserve"> — ha a vendég lépett vissza (elfogadott ajánlatnál is).</w:t>
+      </w:r>
+    </w:p>
+    <w:p>
+      <w:r>
+        <w:rPr>
+          <w:b w:val="0"/>
+        </w:rPr>
+        <w:t>Mindkettő után küldhetsz levelet (</w:t>
+      </w:r>
+      <w:r>
+        <w:rPr>
+          <w:b/>
+        </w:rPr>
+        <w:t>✉ Levél</w:t>
+      </w:r>
+      <w:r>
+        <w:rPr>
+          <w:b w:val="0"/>
+        </w:rPr>
+        <w:t xml:space="preserve">). A lezárt ajánlatok a </w:t>
+      </w:r>
+      <w:r>
+        <w:rPr>
+          <w:b/>
+        </w:rPr>
+        <w:t>🗑 Törlés</w:t>
+      </w:r>
+      <w:r>
+        <w:rPr>
+          <w:b w:val="0"/>
+        </w:rPr>
+        <w:t xml:space="preserve"> gombbal takaríthatók.</w:t>
+      </w:r>
+    </w:p>
+    <w:p>
+      <w:pPr>
+        <w:pStyle w:val="Heading1"/>
+      </w:pPr>
+      <w:r>
+        <w:t>5. Közös eszközök</w:t>
+      </w:r>
+    </w:p>
+    <w:p>
+      <w:pPr>
+        <w:pStyle w:val="Heading2"/>
+      </w:pPr>
+      <w:r>
+        <w:t>Ki jön holnap? — Naptár és résztvevőlista</w:t>
+      </w:r>
+    </w:p>
+    <w:p>
+      <w:pPr>
+        <w:spacing w:after="40"/>
+        <w:ind w:left="510" w:hanging="340"/>
+      </w:pPr>
+      <w:r>
+        <w:t>1.</w:t>
+        <w:tab/>
+      </w:r>
+      <w:r>
+        <w:rPr>
+          <w:b/>
+        </w:rPr>
+        <w:t>Naptár</w:t>
+      </w:r>
+      <w:r>
+        <w:rPr>
+          <w:b w:val="0"/>
+        </w:rPr>
+        <w:t xml:space="preserve"> fül → lépj a kívánt időszakra.</w:t>
+      </w:r>
+    </w:p>
+    <w:p>
+      <w:pPr>
+        <w:spacing w:after="40"/>
+        <w:ind w:left="510" w:hanging="340"/>
+      </w:pPr>
+      <w:r>
+        <w:t>2.</w:t>
+        <w:tab/>
+      </w:r>
+      <w:r>
+        <w:rPr>
+          <w:b w:val="0"/>
+        </w:rPr>
+        <w:t>Kattints az alkalomra: látod a foglalókat elérhetőséggel és létszámmal.</w:t>
+      </w:r>
+    </w:p>
+    <w:p>
+      <w:pPr>
+        <w:spacing w:after="40"/>
+        <w:ind w:left="510" w:hanging="340"/>
+      </w:pPr>
+      <w:r>
+        <w:t>3.</w:t>
+        <w:tab/>
+      </w:r>
+      <w:r>
+        <w:rPr>
+          <w:b/>
+        </w:rPr>
+        <w:t>📄 Jelentés (PDF)</w:t>
+      </w:r>
+      <w:r>
+        <w:rPr>
+          <w:b w:val="0"/>
+        </w:rPr>
+        <w:t xml:space="preserve"> — nyomtatható résztvevőlista a helyszínre.</w:t>
+      </w:r>
+    </w:p>
+    <w:p>
+      <w:r>
+        <w:rPr>
+          <w:b w:val="0"/>
+        </w:rPr>
+        <w:t xml:space="preserve">A színek a telítettséget jelzik (zöld = van hely, narancs = majdnem tele, piros = betelt); a </w:t>
+      </w:r>
+      <w:r>
+        <w:rPr>
+          <w:b/>
+        </w:rPr>
+        <w:t>lila</w:t>
+      </w:r>
+      <w:r>
+        <w:rPr>
+          <w:b w:val="0"/>
+        </w:rPr>
+        <w:t xml:space="preserve"> az elfogadott egyedi ajánlat. Éves lista vagy havi rács nézet: a Beállításokban választod.</w:t>
+      </w:r>
+    </w:p>
+    <w:p>
+      <w:pPr>
+        <w:pStyle w:val="Heading2"/>
+      </w:pPr>
+      <w:r>
+        <w:t>Kiexportálnám Excelbe</w:t>
+      </w:r>
+    </w:p>
+    <w:p>
+      <w:r>
+        <w:rPr>
+          <w:b w:val="0"/>
+        </w:rPr>
+        <w:t xml:space="preserve">A </w:t>
+      </w:r>
+      <w:r>
+        <w:rPr>
+          <w:b/>
+        </w:rPr>
+        <w:t>Foglalások</w:t>
+      </w:r>
+      <w:r>
+        <w:rPr>
+          <w:b w:val="0"/>
+        </w:rPr>
+        <w:t xml:space="preserve"> és az </w:t>
+      </w:r>
+      <w:r>
+        <w:rPr>
+          <w:b/>
+        </w:rPr>
+        <w:t>Ajánlatok</w:t>
+      </w:r>
+      <w:r>
+        <w:rPr>
+          <w:b w:val="0"/>
+        </w:rPr>
+        <w:t xml:space="preserve"> fülön a </w:t>
+      </w:r>
+      <w:r>
+        <w:rPr>
+          <w:b/>
+        </w:rPr>
+        <w:t>📊 Excel</w:t>
+      </w:r>
+      <w:r>
+        <w:rPr>
+          <w:b w:val="0"/>
+        </w:rPr>
+        <w:t xml:space="preserve"> gomb az éppen látott listát tölti le (az aktív alfül és a szűrők szerint).</w:t>
+      </w:r>
+    </w:p>
+    <w:p>
+      <w:pPr>
+        <w:pStyle w:val="Heading2"/>
+      </w:pPr>
+      <w:r>
+        <w:t>Milyen levelek mennek ki?</w:t>
       </w:r>
     </w:p>
     <w:tbl>
@@ -516,20 +2743,18 @@
         <w:tblLook w:firstColumn="1" w:firstRow="1" w:lastColumn="0" w:lastRow="0" w:noHBand="0" w:noVBand="1" w:val="04A0"/>
       </w:tblPr>
       <w:tblGrid>
-        <w:gridCol w:w="2160"/>
-        <w:gridCol w:w="2160"/>
-        <w:gridCol w:w="2160"/>
-        <w:gridCol w:w="2160"/>
+        <w:gridCol w:w="3324"/>
+        <w:gridCol w:w="3324"/>
+        <w:gridCol w:w="3324"/>
       </w:tblGrid>
       <w:tr>
         <w:tc>
           <w:tcPr>
-            <w:tcW w:type="dxa" w:w="2160"/>
+            <w:tcW w:type="dxa" w:w="3324"/>
+            <w:shd w:val="clear" w:color="auto" w:fill="F6EFE6"/>
           </w:tcPr>
           <w:p>
-            <w:pPr>
-              <w:shd w:val="clear" w:color="auto" w:fill="F6EFE6"/>
-            </w:pPr>
+            <w:r/>
             <w:r>
               <w:rPr>
                 <w:b/>
@@ -540,28 +2765,11 @@
         </w:tc>
         <w:tc>
           <w:tcPr>
-            <w:tcW w:type="dxa" w:w="2160"/>
+            <w:tcW w:type="dxa" w:w="3324"/>
+            <w:shd w:val="clear" w:color="auto" w:fill="F6EFE6"/>
           </w:tcPr>
           <w:p>
-            <w:pPr>
-              <w:shd w:val="clear" w:color="auto" w:fill="F6EFE6"/>
-            </w:pPr>
-            <w:r>
-              <w:rPr>
-                <w:b/>
-              </w:rPr>
-              <w:t>Kinek</w:t>
-            </w:r>
-          </w:p>
-        </w:tc>
-        <w:tc>
-          <w:tcPr>
-            <w:tcW w:type="dxa" w:w="2160"/>
-          </w:tcPr>
-          <w:p>
-            <w:pPr>
-              <w:shd w:val="clear" w:color="auto" w:fill="F6EFE6"/>
-            </w:pPr>
+            <w:r/>
             <w:r>
               <w:rPr>
                 <w:b/>
@@ -572,12 +2780,11 @@
         </w:tc>
         <w:tc>
           <w:tcPr>
-            <w:tcW w:type="dxa" w:w="2160"/>
+            <w:tcW w:type="dxa" w:w="3324"/>
+            <w:shd w:val="clear" w:color="auto" w:fill="F6EFE6"/>
           </w:tcPr>
           <w:p>
-            <w:pPr>
-              <w:shd w:val="clear" w:color="auto" w:fill="F6EFE6"/>
-            </w:pPr>
+            <w:r/>
             <w:r>
               <w:rPr>
                 <w:b/>
@@ -590,44 +2797,42 @@
       <w:tr>
         <w:tc>
           <w:tcPr>
-            <w:tcW w:type="dxa" w:w="2160"/>
+            <w:tcW w:type="dxa" w:w="3324"/>
           </w:tcPr>
           <w:p>
             <w:r/>
             <w:r>
-              <w:t>Visszaigazolás</w:t>
+              <w:rPr>
+                <w:b w:val="0"/>
+              </w:rPr>
+              <w:t>Visszaigazolás a vendégnek + értesítő nektek</w:t>
             </w:r>
           </w:p>
         </w:tc>
         <w:tc>
           <w:tcPr>
-            <w:tcW w:type="dxa" w:w="2160"/>
+            <w:tcW w:type="dxa" w:w="3324"/>
           </w:tcPr>
           <w:p>
             <w:r/>
             <w:r>
-              <w:t>a vendégnek</w:t>
+              <w:rPr>
+                <w:b w:val="0"/>
+              </w:rPr>
+              <w:t>foglaláskor és ajánlatkéréskor</w:t>
             </w:r>
           </w:p>
         </w:tc>
         <w:tc>
           <w:tcPr>
-            <w:tcW w:type="dxa" w:w="2160"/>
+            <w:tcW w:type="dxa" w:w="3324"/>
           </w:tcPr>
           <w:p>
             <w:r/>
             <w:r>
-              <w:t>foglaláskor</w:t>
-            </w:r>
-          </w:p>
-        </w:tc>
-        <w:tc>
-          <w:tcPr>
-            <w:tcW w:type="dxa" w:w="2160"/>
-          </w:tcPr>
-          <w:p>
-            <w:r/>
-            <w:r>
+              <w:rPr>
+                <w:b w:val="0"/>
+              </w:rPr>
               <w:t>automatikus</w:t>
             </w:r>
           </w:p>
@@ -636,44 +2841,142 @@
       <w:tr>
         <w:tc>
           <w:tcPr>
-            <w:tcW w:type="dxa" w:w="2160"/>
+            <w:tcW w:type="dxa" w:w="3324"/>
           </w:tcPr>
           <w:p>
             <w:r/>
             <w:r>
-              <w:t>Csapat-értesítő</w:t>
+              <w:rPr>
+                <w:b w:val="0"/>
+              </w:rPr>
+              <w:t>Jóváhagyás / elutasítás / lemondás (foglalás)</w:t>
             </w:r>
           </w:p>
         </w:tc>
         <w:tc>
           <w:tcPr>
-            <w:tcW w:type="dxa" w:w="2160"/>
+            <w:tcW w:type="dxa" w:w="3324"/>
           </w:tcPr>
           <w:p>
             <w:r/>
             <w:r>
-              <w:t>nektek (csapat cím)</w:t>
+              <w:rPr>
+                <w:b w:val="0"/>
+              </w:rPr>
+              <w:t>státuszváltás után</w:t>
             </w:r>
           </w:p>
         </w:tc>
         <w:tc>
           <w:tcPr>
-            <w:tcW w:type="dxa" w:w="2160"/>
+            <w:tcW w:type="dxa" w:w="3324"/>
           </w:tcPr>
           <w:p>
             <w:r/>
             <w:r>
-              <w:t>foglaláskor</w:t>
+              <w:rPr>
+                <w:b w:val="0"/>
+              </w:rPr>
+              <w:t xml:space="preserve">te küldöd: </w:t>
+            </w:r>
+            <w:r>
+              <w:rPr>
+                <w:b/>
+              </w:rPr>
+              <w:t>✉ Levél</w:t>
+            </w:r>
+          </w:p>
+        </w:tc>
+      </w:tr>
+      <w:tr>
+        <w:tc>
+          <w:tcPr>
+            <w:tcW w:type="dxa" w:w="3324"/>
+          </w:tcPr>
+          <w:p>
+            <w:r/>
+            <w:r>
+              <w:rPr>
+                <w:b w:val="0"/>
+              </w:rPr>
+              <w:t>Megerősítés / elutasítás / lemondás (ajánlat)</w:t>
             </w:r>
           </w:p>
         </w:tc>
         <w:tc>
           <w:tcPr>
-            <w:tcW w:type="dxa" w:w="2160"/>
+            <w:tcW w:type="dxa" w:w="3324"/>
           </w:tcPr>
           <w:p>
             <w:r/>
             <w:r>
+              <w:rPr>
+                <w:b w:val="0"/>
+              </w:rPr>
+              <w:t>státuszváltás után</w:t>
+            </w:r>
+          </w:p>
+        </w:tc>
+        <w:tc>
+          <w:tcPr>
+            <w:tcW w:type="dxa" w:w="3324"/>
+          </w:tcPr>
+          <w:p>
+            <w:r/>
+            <w:r>
+              <w:rPr>
+                <w:b w:val="0"/>
+              </w:rPr>
+              <w:t xml:space="preserve">te küldöd: </w:t>
+            </w:r>
+            <w:r>
+              <w:rPr>
+                <w:b/>
+              </w:rPr>
+              <w:t>✉ Levél</w:t>
+            </w:r>
+          </w:p>
+        </w:tc>
+      </w:tr>
+      <w:tr>
+        <w:tc>
+          <w:tcPr>
+            <w:tcW w:type="dxa" w:w="3324"/>
+          </w:tcPr>
+          <w:p>
+            <w:r/>
+            <w:r>
+              <w:rPr>
+                <w:b w:val="0"/>
+              </w:rPr>
+              <w:t>Emlékeztető</w:t>
+            </w:r>
+          </w:p>
+        </w:tc>
+        <w:tc>
+          <w:tcPr>
+            <w:tcW w:type="dxa" w:w="3324"/>
+          </w:tcPr>
+          <w:p>
+            <w:r/>
+            <w:r>
+              <w:rPr>
+                <w:b w:val="0"/>
+              </w:rPr>
+              <w:t>a program előtti napon</w:t>
+            </w:r>
+          </w:p>
+        </w:tc>
+        <w:tc>
+          <w:tcPr>
+            <w:tcW w:type="dxa" w:w="3324"/>
+          </w:tcPr>
+          <w:p>
+            <w:r/>
+            <w:r>
+              <w:rPr>
+                <w:b w:val="0"/>
+              </w:rPr>
               <w:t>automatikus</w:t>
             </w:r>
           </w:p>
@@ -682,45 +2985,43 @@
       <w:tr>
         <w:tc>
           <w:tcPr>
-            <w:tcW w:type="dxa" w:w="2160"/>
+            <w:tcW w:type="dxa" w:w="3324"/>
           </w:tcPr>
           <w:p>
             <w:r/>
             <w:r>
-              <w:t>Jóváhagyás</w:t>
+              <w:rPr>
+                <w:b w:val="0"/>
+              </w:rPr>
+              <w:t>„Sajnos elmarad”</w:t>
             </w:r>
           </w:p>
         </w:tc>
         <w:tc>
           <w:tcPr>
-            <w:tcW w:type="dxa" w:w="2160"/>
+            <w:tcW w:type="dxa" w:w="3324"/>
           </w:tcPr>
           <w:p>
             <w:r/>
             <w:r>
-              <w:t>a vendégnek</w:t>
+              <w:rPr>
+                <w:b w:val="0"/>
+              </w:rPr>
+              <w:t>időpont elmaradásakor</w:t>
             </w:r>
           </w:p>
         </w:tc>
         <w:tc>
           <w:tcPr>
-            <w:tcW w:type="dxa" w:w="2160"/>
+            <w:tcW w:type="dxa" w:w="3324"/>
           </w:tcPr>
           <w:p>
             <w:r/>
             <w:r>
-              <w:t>amikor jóváhagyjátok</w:t>
-            </w:r>
-          </w:p>
-        </w:tc>
-        <w:tc>
-          <w:tcPr>
-            <w:tcW w:type="dxa" w:w="2160"/>
-          </w:tcPr>
-          <w:p>
-            <w:r/>
-            <w:r>
-              <w:t>gombbal (✉ Levél)</w:t>
+              <w:rPr>
+                <w:b w:val="0"/>
+              </w:rPr>
+              <w:t>választható, mindenkinek egyszerre</w:t>
             </w:r>
           </w:p>
         </w:tc>
@@ -728,315 +3029,71 @@
       <w:tr>
         <w:tc>
           <w:tcPr>
-            <w:tcW w:type="dxa" w:w="2160"/>
+            <w:tcW w:type="dxa" w:w="3324"/>
           </w:tcPr>
           <w:p>
             <w:r/>
             <w:r>
-              <w:t>Elutasítás</w:t>
+              <w:rPr>
+                <w:b w:val="0"/>
+              </w:rPr>
+              <w:t>Maga az ajánlat</w:t>
             </w:r>
           </w:p>
         </w:tc>
         <w:tc>
           <w:tcPr>
-            <w:tcW w:type="dxa" w:w="2160"/>
+            <w:tcW w:type="dxa" w:w="3324"/>
           </w:tcPr>
           <w:p>
             <w:r/>
             <w:r>
-              <w:t>a vendégnek</w:t>
+              <w:rPr>
+                <w:b w:val="0"/>
+              </w:rPr>
+              <w:t>egyeztetéskor</w:t>
             </w:r>
           </w:p>
         </w:tc>
         <w:tc>
           <w:tcPr>
-            <w:tcW w:type="dxa" w:w="2160"/>
+            <w:tcW w:type="dxa" w:w="3324"/>
           </w:tcPr>
           <w:p>
             <w:r/>
             <w:r>
-              <w:t>amikor elutasítjátok</w:t>
-            </w:r>
-          </w:p>
-        </w:tc>
-        <w:tc>
-          <w:tcPr>
-            <w:tcW w:type="dxa" w:w="2160"/>
-          </w:tcPr>
-          <w:p>
-            <w:r/>
-            <w:r>
-              <w:t>gombbal (✉ Levél)</w:t>
-            </w:r>
-          </w:p>
-        </w:tc>
-      </w:tr>
-      <w:tr>
-        <w:tc>
-          <w:tcPr>
-            <w:tcW w:type="dxa" w:w="2160"/>
-          </w:tcPr>
-          <w:p>
-            <w:r/>
-            <w:r>
-              <w:t>Lemondás</w:t>
-            </w:r>
-          </w:p>
-        </w:tc>
-        <w:tc>
-          <w:tcPr>
-            <w:tcW w:type="dxa" w:w="2160"/>
-          </w:tcPr>
-          <w:p>
-            <w:r/>
-            <w:r>
-              <w:t>a vendégnek</w:t>
-            </w:r>
-          </w:p>
-        </w:tc>
-        <w:tc>
-          <w:tcPr>
-            <w:tcW w:type="dxa" w:w="2160"/>
-          </w:tcPr>
-          <w:p>
-            <w:r/>
-            <w:r>
-              <w:t>lemondás rögzítésekor</w:t>
-            </w:r>
-          </w:p>
-        </w:tc>
-        <w:tc>
-          <w:tcPr>
-            <w:tcW w:type="dxa" w:w="2160"/>
-          </w:tcPr>
-          <w:p>
-            <w:r/>
-            <w:r>
-              <w:t>gombbal (✉ Levél)</w:t>
-            </w:r>
-          </w:p>
-        </w:tc>
-      </w:tr>
-      <w:tr>
-        <w:tc>
-          <w:tcPr>
-            <w:tcW w:type="dxa" w:w="2160"/>
-          </w:tcPr>
-          <w:p>
-            <w:r/>
-            <w:r>
-              <w:t>Emlékeztető</w:t>
-            </w:r>
-          </w:p>
-        </w:tc>
-        <w:tc>
-          <w:tcPr>
-            <w:tcW w:type="dxa" w:w="2160"/>
-          </w:tcPr>
-          <w:p>
-            <w:r/>
-            <w:r>
-              <w:t>a vendégnek</w:t>
-            </w:r>
-          </w:p>
-        </w:tc>
-        <w:tc>
-          <w:tcPr>
-            <w:tcW w:type="dxa" w:w="2160"/>
-          </w:tcPr>
-          <w:p>
-            <w:r/>
-            <w:r>
-              <w:t>a program előtti napon</w:t>
-            </w:r>
-          </w:p>
-        </w:tc>
-        <w:tc>
-          <w:tcPr>
-            <w:tcW w:type="dxa" w:w="2160"/>
-          </w:tcPr>
-          <w:p>
-            <w:r/>
-            <w:r>
-              <w:t>automatikus (napi)</w:t>
-            </w:r>
-          </w:p>
-        </w:tc>
-      </w:tr>
-      <w:tr>
-        <w:tc>
-          <w:tcPr>
-            <w:tcW w:type="dxa" w:w="2160"/>
-          </w:tcPr>
-          <w:p>
-            <w:r/>
-            <w:r>
-              <w:t>Program elmarad</w:t>
-            </w:r>
-          </w:p>
-        </w:tc>
-        <w:tc>
-          <w:tcPr>
-            <w:tcW w:type="dxa" w:w="2160"/>
-          </w:tcPr>
-          <w:p>
-            <w:r/>
-            <w:r>
-              <w:t>az érintett foglalóknak</w:t>
-            </w:r>
-          </w:p>
-        </w:tc>
-        <w:tc>
-          <w:tcPr>
-            <w:tcW w:type="dxa" w:w="2160"/>
-          </w:tcPr>
-          <w:p>
-            <w:r/>
-            <w:r>
-              <w:t>ha egy programot elmarasztotok</w:t>
-            </w:r>
-          </w:p>
-        </w:tc>
-        <w:tc>
-          <w:tcPr>
-            <w:tcW w:type="dxa" w:w="2160"/>
-          </w:tcPr>
-          <w:p>
-            <w:r/>
-            <w:r>
-              <w:t>egy lépésben, tömegesen</w:t>
+              <w:rPr>
+                <w:b w:val="0"/>
+              </w:rPr>
+              <w:t>a saját leveleződből, a rendszeren kívül</w:t>
             </w:r>
           </w:p>
         </w:tc>
       </w:tr>
     </w:tbl>
-    <w:p/>
     <w:p>
       <w:pPr>
-        <w:shd w:val="clear" w:color="auto" w:fill="FCEEE4"/>
-        <w:spacing w:before="80" w:after="80"/>
+        <w:spacing w:after="0"/>
       </w:pPr>
+    </w:p>
+    <w:p>
+      <w:r>
+        <w:rPr>
+          <w:b w:val="0"/>
+        </w:rPr>
+        <w:t xml:space="preserve">A vendégek válasza a </w:t>
+      </w:r>
       <w:r>
         <w:rPr>
           <w:b/>
         </w:rPr>
-        <w:t xml:space="preserve">A „✉ Levél" gomb: </w:t>
+        <w:t>csapat e-mail címre</w:t>
       </w:r>
       <w:r>
         <w:rPr>
           <w:b w:val="0"/>
         </w:rPr>
-        <w:t>a foglalás sorában megjelenik egy levél-gomb. Rákattintva egy ablak nyílik, ahol látod és szerkesztheted a levél szövegét, mielőtt elküldöd.</w:t>
-      </w:r>
-    </w:p>
-    <w:p>
-      <w:pPr>
-        <w:shd w:val="clear" w:color="auto" w:fill="EEF7F0"/>
-        <w:spacing w:before="80" w:after="80"/>
-      </w:pPr>
-      <w:r>
-        <w:rPr>
-          <w:b/>
-        </w:rPr>
-        <w:t xml:space="preserve">Válaszcím: </w:t>
-      </w:r>
-      <w:r>
-        <w:rPr>
-          <w:b w:val="0"/>
-        </w:rPr>
-        <w:t>a vendégnek küldött levelekre a válasz a Csapat e-mail címre érkezik (Beállítások), tehát a vendég egyszerűen „válasz"-t nyomhat, és nektek ír.</w:t>
-      </w:r>
-    </w:p>
-    <w:p>
-      <w:pPr>
-        <w:shd w:val="clear" w:color="auto" w:fill="F3E9D8"/>
-        <w:jc w:val="center"/>
-      </w:pPr>
-      <w:r>
-        <w:rPr>
-          <w:i/>
-          <w:color w:val="8A7458"/>
-        </w:rPr>
-        <w:t>📷  Képernyőkép: a „✉ Levél" ablak a szerkeszthető szöveggel</w:t>
-      </w:r>
-    </w:p>
-    <w:p>
-      <w:pPr>
-        <w:pStyle w:val="Heading1"/>
-      </w:pPr>
-      <w:r>
-        <w:t>4. Admin belépés</w:t>
-      </w:r>
-    </w:p>
-    <w:p>
-      <w:pPr>
-        <w:pStyle w:val="ListNumber"/>
-      </w:pPr>
-      <w:r>
-        <w:rPr>
-          <w:b/>
-        </w:rPr>
-        <w:t xml:space="preserve">1. </w:t>
-      </w:r>
-      <w:r>
-        <w:rPr>
-          <w:b w:val="0"/>
-        </w:rPr>
-        <w:t>Nyisd meg az oldal /admin/ címét (pl. kemence-akademia.xyz/admin/).</w:t>
-      </w:r>
-    </w:p>
-    <w:p>
-      <w:pPr>
-        <w:pStyle w:val="ListNumber"/>
-      </w:pPr>
-      <w:r>
-        <w:rPr>
-          <w:b/>
-        </w:rPr>
-        <w:t xml:space="preserve">2. </w:t>
-      </w:r>
-      <w:r>
-        <w:rPr>
-          <w:b w:val="0"/>
-        </w:rPr>
-        <w:t>Add meg az e-mail címet és jelszót, amit a rendszerhez kaptál.</w:t>
-      </w:r>
-    </w:p>
-    <w:p>
-      <w:r>
-        <w:rPr>
-          <w:b w:val="0"/>
-        </w:rPr>
-        <w:t>Önregisztráció nincs, csak a meghívott admin fiók léphet be. A felület négy fülből áll: Foglalások, Naptár, Programok, Beállítások.</w:t>
-      </w:r>
-    </w:p>
-    <w:p>
-      <w:pPr>
-        <w:shd w:val="clear" w:color="auto" w:fill="F3E9D8"/>
-        <w:jc w:val="center"/>
-      </w:pPr>
-      <w:r>
-        <w:rPr>
-          <w:i/>
-          <w:color w:val="8A7458"/>
-        </w:rPr>
-        <w:t>📷  Képernyőkép: a belépő képernyő és a négy fül</w:t>
-      </w:r>
-    </w:p>
-    <w:p>
-      <w:pPr>
-        <w:pStyle w:val="Heading1"/>
-      </w:pPr>
-      <w:r>
-        <w:t>5. Foglalások kezelése</w:t>
-      </w:r>
-    </w:p>
-    <w:p>
-      <w:r>
-        <w:rPr>
-          <w:b w:val="0"/>
-        </w:rPr>
-        <w:t>A Foglalások fülön látod és intézed a beérkezett foglalásokat.</w:t>
+        <w:t xml:space="preserve"> érkezik. A soron a „✉ N kiment levél” linken látod, mi ment már ki.</w:t>
       </w:r>
     </w:p>
     <w:p>
@@ -1044,15 +3101,145 @@
         <w:pStyle w:val="Heading2"/>
       </w:pPr>
       <w:r>
-        <w:t>5.1 A négy státusz-alfül</w:t>
+        <w:t>Beállítások</w:t>
       </w:r>
     </w:p>
     <w:p>
+      <w:pPr>
+        <w:spacing w:after="40"/>
+        <w:ind w:left="510" w:hanging="340"/>
+      </w:pPr>
+      <w:r>
+        <w:t>•</w:t>
+        <w:tab/>
+      </w:r>
+      <w:r>
+        <w:rPr>
+          <w:b/>
+        </w:rPr>
+        <w:t>Csapat e-mail cím</w:t>
+      </w:r>
       <w:r>
         <w:rPr>
           <w:b w:val="0"/>
         </w:rPr>
-        <w:t>Fent négy alfül van, státuszonként (mindegyiknél zárójelben a darabszám): Jóváhagyásra vár, Jóváhagyott, Elutasított, Lemondott. Kattints egyre, és az adott állapotú foglalások listáját látod.</w:t>
+        <w:t xml:space="preserve"> — ide jönnek az értesítők, és erre válaszolnak a vendégek. Valódi, olvasott postafiók legyen.</w:t>
+      </w:r>
+    </w:p>
+    <w:p>
+      <w:pPr>
+        <w:spacing w:after="40"/>
+        <w:ind w:left="510" w:hanging="340"/>
+      </w:pPr>
+      <w:r>
+        <w:t>•</w:t>
+        <w:tab/>
+      </w:r>
+      <w:r>
+        <w:rPr>
+          <w:b/>
+        </w:rPr>
+        <w:t>Foglalási info-sáv</w:t>
+      </w:r>
+      <w:r>
+        <w:rPr>
+          <w:b w:val="0"/>
+        </w:rPr>
+        <w:t xml:space="preserve"> — rövid szöveg a foglalási űrlapon (pl. „előre utalás szükséges”).</w:t>
+      </w:r>
+    </w:p>
+    <w:p>
+      <w:pPr>
+        <w:spacing w:after="40"/>
+        <w:ind w:left="510" w:hanging="340"/>
+      </w:pPr>
+      <w:r>
+        <w:t>•</w:t>
+        <w:tab/>
+      </w:r>
+      <w:r>
+        <w:rPr>
+          <w:b/>
+        </w:rPr>
+        <w:t>Naptár megjelenítése</w:t>
+      </w:r>
+      <w:r>
+        <w:rPr>
+          <w:b w:val="0"/>
+        </w:rPr>
+        <w:t xml:space="preserve"> — éves lista vagy havi rács.</w:t>
+      </w:r>
+    </w:p>
+    <w:p>
+      <w:pPr>
+        <w:spacing w:after="40"/>
+        <w:ind w:left="510" w:hanging="340"/>
+      </w:pPr>
+      <w:r>
+        <w:t>•</w:t>
+        <w:tab/>
+      </w:r>
+      <w:r>
+        <w:rPr>
+          <w:b/>
+        </w:rPr>
+        <w:t>Azonosító-formátum</w:t>
+      </w:r>
+      <w:r>
+        <w:rPr>
+          <w:b w:val="0"/>
+        </w:rPr>
+        <w:t xml:space="preserve"> — külön a foglalásoknak (pl. F-100) és az ajánlatoknak (pl. A-100).</w:t>
+      </w:r>
+    </w:p>
+    <w:p>
+      <w:pPr>
+        <w:spacing w:after="40"/>
+        <w:ind w:left="510" w:hanging="340"/>
+      </w:pPr>
+      <w:r>
+        <w:t>•</w:t>
+        <w:tab/>
+      </w:r>
+      <w:r>
+        <w:rPr>
+          <w:b/>
+        </w:rPr>
+        <w:t>E-mail sablonok</w:t>
+      </w:r>
+      <w:r>
+        <w:rPr>
+          <w:b w:val="0"/>
+        </w:rPr>
+        <w:t xml:space="preserve"> — külön a foglalási és az ajánlati levelekhez. A kapcsos zárójeles mezők (pl. </w:t>
+      </w:r>
+      <w:r>
+        <w:rPr>
+          <w:rFonts w:ascii="Consolas" w:hAnsi="Consolas"/>
+          <w:b w:val="0"/>
+          <w:sz w:val="20"/>
+        </w:rPr>
+        <w:t>{nev}</w:t>
+      </w:r>
+      <w:r>
+        <w:rPr>
+          <w:b w:val="0"/>
+        </w:rPr>
+        <w:t xml:space="preserve">, </w:t>
+      </w:r>
+      <w:r>
+        <w:rPr>
+          <w:rFonts w:ascii="Consolas" w:hAnsi="Consolas"/>
+          <w:b w:val="0"/>
+          <w:sz w:val="20"/>
+        </w:rPr>
+        <w:t>{program}</w:t>
+      </w:r>
+      <w:r>
+        <w:rPr>
+          <w:b w:val="0"/>
+        </w:rPr>
+        <w:t>) küldéskor kitöltődnek, és a ✉ Levél ablakban még átírhatod a szöveget.</w:t>
       </w:r>
     </w:p>
     <w:p>
@@ -1060,7 +3247,7 @@
         <w:pStyle w:val="Heading2"/>
       </w:pPr>
       <w:r>
-        <w:t>5.2 Szűrés</w:t>
+        <w:t>Főoldali képek cseréje</w:t>
       </w:r>
     </w:p>
     <w:p>
@@ -1068,50 +3255,76 @@
         <w:rPr>
           <w:b w:val="0"/>
         </w:rPr>
-        <w:t>A lista szűkíthető: program szerint, vendég neve szerint, és időállapot szerint (jövőbeli / ma / múltbéli).</w:t>
+        <w:t xml:space="preserve">A program-fotókat az adminban, a program szerkesztőjében cseréled. A főoldal fix képei (felső diavetítés, csapatkép, logó, workshop-képek) a </w:t>
+      </w:r>
+      <w:r>
+        <w:rPr>
+          <w:rFonts w:ascii="Consolas" w:hAnsi="Consolas"/>
+          <w:b w:val="0"/>
+          <w:sz w:val="20"/>
+        </w:rPr>
+        <w:t>web/kepek/</w:t>
+      </w:r>
+      <w:r>
+        <w:rPr>
+          <w:b w:val="0"/>
+        </w:rPr>
+        <w:t xml:space="preserve"> mappában vannak: az új képet </w:t>
+      </w:r>
+      <w:r>
+        <w:rPr>
+          <w:b/>
+        </w:rPr>
+        <w:t>ugyanazon a néven</w:t>
+      </w:r>
+      <w:r>
+        <w:rPr>
+          <w:b w:val="0"/>
+        </w:rPr>
+        <w:t xml:space="preserve"> mentsd, majd tedd ki újra az oldalt. Ideális méret: 1400–2000 px széles, 200–400 KB-os JPG.</w:t>
       </w:r>
     </w:p>
     <w:p>
       <w:pPr>
-        <w:pStyle w:val="Heading2"/>
+        <w:pBdr>
+          <w:left w:val="single" w:sz="24" w:space="8" w:color="8A5CC7"/>
+        </w:pBdr>
+        <w:shd w:val="clear" w:color="auto" w:fill="F5EFFB"/>
+        <w:spacing w:after="0"/>
       </w:pPr>
       <w:r>
-        <w:t>5.3 Egy foglalás sora</w:t>
+        <w:rPr>
+          <w:b/>
+        </w:rPr>
+        <w:t>Röviden, a napi rutin</w:t>
       </w:r>
     </w:p>
     <w:p>
+      <w:pPr>
+        <w:pBdr>
+          <w:left w:val="single" w:sz="24" w:space="8" w:color="8A5CC7"/>
+        </w:pBdr>
+        <w:shd w:val="clear" w:color="auto" w:fill="F5EFFB"/>
+        <w:spacing w:after="0"/>
+      </w:pPr>
       <w:r>
         <w:rPr>
           <w:b w:val="0"/>
         </w:rPr>
-        <w:t>Minden sorban látod: azonosító, program + időpont, időállapot, vendég (név, telefon, e-mail), létszám, megjegyzés, státusz, és a műveletek. A műveletek a státusztól függenek (lásd 2.1).</w:t>
-      </w:r>
-    </w:p>
-    <w:p>
-      <w:pPr>
-        <w:shd w:val="clear" w:color="auto" w:fill="F3E9D8"/>
-        <w:jc w:val="center"/>
-      </w:pPr>
+        <w:t xml:space="preserve">• </w:t>
+      </w:r>
       <w:r>
         <w:rPr>
-          <w:i/>
-          <w:color w:val="8A7458"/>
+          <w:b/>
         </w:rPr>
-        <w:t>📷  Képernyőkép: a Foglalások lista egy sorral és a műveletekkel</w:t>
-      </w:r>
-    </w:p>
-    <w:p>
-      <w:pPr>
-        <w:pStyle w:val="Heading2"/>
-      </w:pPr>
-      <w:r>
-        <w:t>5.4 Mit tehetsz egy foglalással?</w:t>
-      </w:r>
-    </w:p>
-    <w:p>
-      <w:pPr>
-        <w:pStyle w:val="ListBullet"/>
-      </w:pPr>
+        <w:t>Foglalás:</w:t>
+      </w:r>
+      <w:r>
+        <w:rPr>
+          <w:b w:val="0"/>
+        </w:rPr>
+        <w:t xml:space="preserve"> értesítő e-mail → </w:t>
+      </w:r>
       <w:r>
         <w:rPr>
           <w:b/>
@@ -1122,64 +3335,8 @@
         <w:rPr>
           <w:b w:val="0"/>
         </w:rPr>
-        <w:t xml:space="preserve"> — elfogadod; a hely biztossá válik. Utána a ✉ Levéllel küldhetsz jóváhagyó értesítőt.</w:t>
-      </w:r>
-    </w:p>
-    <w:p>
-      <w:pPr>
-        <w:pStyle w:val="ListBullet"/>
-      </w:pPr>
-      <w:r>
-        <w:rPr>
-          <w:b/>
-        </w:rPr>
-        <w:t>Elutasítás</w:t>
-      </w:r>
-      <w:r>
-        <w:rPr>
-          <w:b w:val="0"/>
-        </w:rPr>
-        <w:t xml:space="preserve"> — nem fogadod el; a hely felszabadul. A ✉ Levéllel küldhetsz elutasítót.</w:t>
-      </w:r>
-    </w:p>
-    <w:p>
-      <w:pPr>
-        <w:pStyle w:val="ListBullet"/>
-      </w:pPr>
-      <w:r>
-        <w:rPr>
-          <w:b/>
-        </w:rPr>
-        <w:t>Vendég lemondta</w:t>
-      </w:r>
-      <w:r>
-        <w:rPr>
-          <w:b w:val="0"/>
-        </w:rPr>
-        <w:t xml:space="preserve"> — ha a vendég jelezte, itt rögzíted; a hely felszabadul.</w:t>
-      </w:r>
-    </w:p>
-    <w:p>
-      <w:pPr>
-        <w:pStyle w:val="ListBullet"/>
-      </w:pPr>
-      <w:r>
-        <w:rPr>
-          <w:b/>
-        </w:rPr>
-        <w:t>Szerkesztés</w:t>
-      </w:r>
-      <w:r>
-        <w:rPr>
-          <w:b w:val="0"/>
-        </w:rPr>
-        <w:t xml:space="preserve"> — javíthatod a foglalás adatait (név, e-mail, telefon, létszám, megjegyzés, program).</w:t>
-      </w:r>
-    </w:p>
-    <w:p>
-      <w:pPr>
-        <w:pStyle w:val="ListBullet"/>
-      </w:pPr>
+        <w:t xml:space="preserve"> + </w:t>
+      </w:r>
       <w:r>
         <w:rPr>
           <w:b/>
@@ -1190,659 +3347,104 @@
         <w:rPr>
           <w:b w:val="0"/>
         </w:rPr>
-        <w:t xml:space="preserve"> — a státuszhoz illő levelet küldöd a vendégnek (szerkeszthető szöveggel).</w:t>
+        <w:t xml:space="preserve"> → előző nap automatikus emlékeztető → Naptár → </w:t>
+      </w:r>
+      <w:r>
+        <w:rPr>
+          <w:b/>
+        </w:rPr>
+        <w:t>Jelentés (PDF)</w:t>
+      </w:r>
+      <w:r>
+        <w:rPr>
+          <w:b w:val="0"/>
+        </w:rPr>
+        <w:t xml:space="preserve"> a helyszínre.</w:t>
       </w:r>
     </w:p>
     <w:p>
       <w:pPr>
-        <w:pStyle w:val="Heading2"/>
+        <w:pBdr>
+          <w:left w:val="single" w:sz="24" w:space="8" w:color="8A5CC7"/>
+        </w:pBdr>
+        <w:shd w:val="clear" w:color="auto" w:fill="F5EFFB"/>
+        <w:spacing w:after="0"/>
       </w:pPr>
-      <w:r>
-        <w:t>5.5 Excel-export</w:t>
-      </w:r>
-    </w:p>
-    <w:p>
       <w:r>
         <w:rPr>
           <w:b w:val="0"/>
         </w:rPr>
-        <w:t>A szűrősávban a 📊 Excel gombbal letöltöd a jelenleg látott listát (aktív alfül + szűrők) Excel-fájlba: azonosító, program, időpont, vendég elérhetőségek, létszám, státusz, megjegyzés.</w:t>
+        <w:t xml:space="preserve">• </w:t>
+      </w:r>
+      <w:r>
+        <w:rPr>
+          <w:b/>
+        </w:rPr>
+        <w:t>Ajánlat:</w:t>
+      </w:r>
+      <w:r>
+        <w:rPr>
+          <w:b w:val="0"/>
+        </w:rPr>
+        <w:t xml:space="preserve"> értesítő e-mail → </w:t>
+      </w:r>
+      <w:r>
+        <w:rPr>
+          <w:b/>
+        </w:rPr>
+        <w:t>Részletek</w:t>
+      </w:r>
+      <w:r>
+        <w:rPr>
+          <w:b w:val="0"/>
+        </w:rPr>
+        <w:t xml:space="preserve"> → ajánlat a saját leveleződből → </w:t>
+      </w:r>
+      <w:r>
+        <w:rPr>
+          <w:b/>
+        </w:rPr>
+        <w:t>Ajánlat kiküldve</w:t>
+      </w:r>
+      <w:r>
+        <w:rPr>
+          <w:b w:val="0"/>
+        </w:rPr>
+        <w:t xml:space="preserve"> → </w:t>
+      </w:r>
+      <w:r>
+        <w:rPr>
+          <w:b/>
+        </w:rPr>
+        <w:t>Elfogad</w:t>
+      </w:r>
+      <w:r>
+        <w:rPr>
+          <w:b w:val="0"/>
+        </w:rPr>
+        <w:t xml:space="preserve"> → </w:t>
+      </w:r>
+      <w:r>
+        <w:rPr>
+          <w:b/>
+        </w:rPr>
+        <w:t>✉ Levél</w:t>
+      </w:r>
+      <w:r>
+        <w:rPr>
+          <w:b w:val="0"/>
+        </w:rPr>
+        <w:t xml:space="preserve"> → lilával a Naptárban.</w:t>
       </w:r>
     </w:p>
     <w:p>
       <w:pPr>
-        <w:pStyle w:val="Heading1"/>
+        <w:spacing w:after="0"/>
       </w:pPr>
-      <w:r>
-        <w:t>6. Naptár nézet és jelentés</w:t>
-      </w:r>
-    </w:p>
-    <w:p>
-      <w:r>
-        <w:rPr>
-          <w:b w:val="0"/>
-        </w:rPr>
-        <w:t>A Naptár fülön egy éves áttekintést kapsz a programokról, és egy programra kattintva látod a résztvevőket.</w:t>
-      </w:r>
-    </w:p>
-    <w:p>
-      <w:pPr>
-        <w:pStyle w:val="Heading2"/>
-      </w:pPr>
-      <w:r>
-        <w:t>6.1 Az éves nézet</w:t>
-      </w:r>
-    </w:p>
-    <w:p>
-      <w:r>
-        <w:rPr>
-          <w:b w:val="0"/>
-        </w:rPr>
-        <w:t>Léptethetsz az évek között, és látod, melyik hónapban milyen programok vannak. Egy programra kattintva lenyílnak a részletei.</w:t>
-      </w:r>
-    </w:p>
-    <w:p>
-      <w:pPr>
-        <w:shd w:val="clear" w:color="auto" w:fill="F3E9D8"/>
-        <w:jc w:val="center"/>
-      </w:pPr>
-      <w:r>
-        <w:rPr>
-          <w:i/>
-          <w:color w:val="8A7458"/>
-        </w:rPr>
-        <w:t>📷  Képernyőkép: a naptár éves nézete a programokkal</w:t>
-      </w:r>
-    </w:p>
-    <w:p>
-      <w:pPr>
-        <w:pStyle w:val="Heading2"/>
-      </w:pPr>
-      <w:r>
-        <w:t>6.2 Egy program résztvevői</w:t>
-      </w:r>
-    </w:p>
-    <w:p>
-      <w:r>
-        <w:rPr>
-          <w:b w:val="0"/>
-        </w:rPr>
-        <w:t>A kiválasztott programnál látod a foglalt/szabad helyeket, a jóváhagyott és váró létszámot, és egy táblázatot az élő foglalókról (jóváhagyott + jóváhagyásra váró): azonosító, vendég neve, telefon, e-mail, létszám, státusz.</w:t>
-      </w:r>
-    </w:p>
-    <w:p>
-      <w:pPr>
-        <w:pStyle w:val="Heading2"/>
-      </w:pPr>
-      <w:r>
-        <w:t>6.3 Jelentés (PDF)</w:t>
-      </w:r>
-    </w:p>
-    <w:p>
-      <w:r>
-        <w:rPr>
-          <w:b w:val="0"/>
-        </w:rPr>
-        <w:t>A résztvevő-tábla fölött a 📄 Jelentés (PDF) gombbal letöltesz egy nyomtatható PDF-et a programról: a program adatai (a részletes leírás nélkül) + az élő foglalók táblája elérhetőséggel és összesítéssel. Kiválóan használható a helyszínen (ki jön, hány fővel, hogyan érhető el).</w:t>
-      </w:r>
-    </w:p>
-    <w:p>
-      <w:pPr>
-        <w:shd w:val="clear" w:color="auto" w:fill="F3E9D8"/>
-        <w:jc w:val="center"/>
-      </w:pPr>
-      <w:r>
-        <w:rPr>
-          <w:i/>
-          <w:color w:val="8A7458"/>
-        </w:rPr>
-        <w:t>📷  Képernyőkép: a program résztvevő-táblája + a Jelentés gomb, és egy kész PDF</w:t>
-      </w:r>
-    </w:p>
-    <w:p>
-      <w:pPr>
-        <w:pStyle w:val="Heading1"/>
-      </w:pPr>
-      <w:r>
-        <w:t>7. Programok kezelése</w:t>
-      </w:r>
-    </w:p>
-    <w:p>
-      <w:r>
-        <w:rPr>
-          <w:b w:val="0"/>
-        </w:rPr>
-        <w:t>A Programok fülön veszed fel és kezeled a workshopokat. Két alfül: Aktuális és Archivált programok.</w:t>
-      </w:r>
-    </w:p>
-    <w:p>
-      <w:pPr>
-        <w:pStyle w:val="Heading2"/>
-      </w:pPr>
-      <w:r>
-        <w:t>7.1 Program-státuszok</w:t>
-      </w:r>
-    </w:p>
-    <w:tbl>
-      <w:tblPr>
-        <w:tblStyle w:val="TableGrid"/>
-        <w:tblW w:type="auto" w:w="0"/>
-        <w:tblLook w:firstColumn="1" w:firstRow="1" w:lastColumn="0" w:lastRow="0" w:noHBand="0" w:noVBand="1" w:val="04A0"/>
-      </w:tblPr>
-      <w:tblGrid>
-        <w:gridCol w:w="4320"/>
-        <w:gridCol w:w="4320"/>
-      </w:tblGrid>
-      <w:tr>
-        <w:tc>
-          <w:tcPr>
-            <w:tcW w:type="dxa" w:w="4320"/>
-          </w:tcPr>
-          <w:p>
-            <w:pPr>
-              <w:shd w:val="clear" w:color="auto" w:fill="F6EFE6"/>
-            </w:pPr>
-            <w:r>
-              <w:rPr>
-                <w:b/>
-              </w:rPr>
-              <w:t>Státusz</w:t>
-            </w:r>
-          </w:p>
-        </w:tc>
-        <w:tc>
-          <w:tcPr>
-            <w:tcW w:type="dxa" w:w="4320"/>
-          </w:tcPr>
-          <w:p>
-            <w:pPr>
-              <w:shd w:val="clear" w:color="auto" w:fill="F6EFE6"/>
-            </w:pPr>
-            <w:r>
-              <w:rPr>
-                <w:b/>
-              </w:rPr>
-              <w:t>Mit jelent</w:t>
-            </w:r>
-          </w:p>
-        </w:tc>
-      </w:tr>
-      <w:tr>
-        <w:tc>
-          <w:tcPr>
-            <w:tcW w:type="dxa" w:w="4320"/>
-          </w:tcPr>
-          <w:p>
-            <w:r/>
-            <w:r>
-              <w:t>Aktív</w:t>
-            </w:r>
-          </w:p>
-        </w:tc>
-        <w:tc>
-          <w:tcPr>
-            <w:tcW w:type="dxa" w:w="4320"/>
-          </w:tcPr>
-          <w:p>
-            <w:r/>
-            <w:r>
-              <w:t>Élő, foglalható program. Kötelező hozzá ár + időpont + létszám. Megjelenik a főoldalon.</w:t>
-            </w:r>
-          </w:p>
-        </w:tc>
-      </w:tr>
-      <w:tr>
-        <w:tc>
-          <w:tcPr>
-            <w:tcW w:type="dxa" w:w="4320"/>
-          </w:tcPr>
-          <w:p>
-            <w:r/>
-            <w:r>
-              <w:t>Hamarosan</w:t>
-            </w:r>
-          </w:p>
-        </w:tc>
-        <w:tc>
-          <w:tcPr>
-            <w:tcW w:type="dxa" w:w="4320"/>
-          </w:tcPr>
-          <w:p>
-            <w:r/>
-            <w:r>
-              <w:t>Előzetes/csalogató. Megjelenik, de még nem foglalható (az ár/időpont lehet üres).</w:t>
-            </w:r>
-          </w:p>
-        </w:tc>
-      </w:tr>
-      <w:tr>
-        <w:tc>
-          <w:tcPr>
-            <w:tcW w:type="dxa" w:w="4320"/>
-          </w:tcPr>
-          <w:p>
-            <w:r/>
-            <w:r>
-              <w:t>Elmaradt</w:t>
-            </w:r>
-          </w:p>
-        </w:tc>
-        <w:tc>
-          <w:tcPr>
-            <w:tcW w:type="dxa" w:w="4320"/>
-          </w:tcPr>
-          <w:p>
-            <w:r/>
-            <w:r>
-              <w:t>A program elmarad (nem lesz megtartva). A felületen „elmarad" jelöléssel látszik.</w:t>
-            </w:r>
-          </w:p>
-        </w:tc>
-      </w:tr>
-    </w:tbl>
-    <w:p/>
-    <w:p>
-      <w:pPr>
-        <w:shd w:val="clear" w:color="auto" w:fill="FCEEE4"/>
-        <w:spacing w:before="80" w:after="80"/>
-      </w:pPr>
-      <w:r>
-        <w:rPr>
-          <w:b/>
-        </w:rPr>
-        <w:t xml:space="preserve">Az „archiválás" külön dolog! </w:t>
-      </w:r>
-      <w:r>
-        <w:rPr>
-          <w:b w:val="0"/>
-        </w:rPr>
-        <w:t>Az archivált jelző FÜGGETLEN a státusztól, és azt jelenti: látszik-e a főoldalon. Egy program lehet egyszerre „aktív jellegű" ÉS archivált (levettük a főoldalról, de az adatok/foglalások megmaradnak).</w:t>
-      </w:r>
-    </w:p>
-    <w:p>
-      <w:pPr>
-        <w:pStyle w:val="Heading2"/>
-      </w:pPr>
-      <w:r>
-        <w:t>7.2 Új program felvitele</w:t>
-      </w:r>
-    </w:p>
-    <w:p>
-      <w:pPr>
-        <w:pStyle w:val="ListNumber"/>
-      </w:pPr>
-      <w:r>
-        <w:rPr>
-          <w:b/>
-        </w:rPr>
-        <w:t xml:space="preserve">1. </w:t>
-      </w:r>
-      <w:r>
-        <w:rPr>
-          <w:b w:val="0"/>
-        </w:rPr>
-        <w:t>Programok fül → Új program gomb.</w:t>
-      </w:r>
-    </w:p>
-    <w:p>
-      <w:pPr>
-        <w:pStyle w:val="ListNumber"/>
-      </w:pPr>
-      <w:r>
-        <w:rPr>
-          <w:b/>
-        </w:rPr>
-        <w:t xml:space="preserve">2. </w:t>
-      </w:r>
-      <w:r>
-        <w:rPr>
-          <w:b w:val="0"/>
-        </w:rPr>
-        <w:t>Töltsd ki: cím, rövid leírás (KÖTELEZŐ — ez jelenik meg a kártyán), részletes leírás (OPCIONÁLIS — a „Részletek" ablakban jön elő; ha üresen hagyod, nincs „Részletek" gomb), ár (és opcionálisan kedvezményes ár), időpont, várható időtartam, max. létszám, és állítsd be a státuszt (aktív / hamarosan).</w:t>
-      </w:r>
-    </w:p>
-    <w:p>
-      <w:pPr>
-        <w:pStyle w:val="ListNumber"/>
-      </w:pPr>
-      <w:r>
-        <w:rPr>
-          <w:b/>
-        </w:rPr>
-        <w:t xml:space="preserve">3. </w:t>
-      </w:r>
-      <w:r>
-        <w:rPr>
-          <w:b w:val="0"/>
-        </w:rPr>
-        <w:t>Ha van kép, tölts fel fotót a programhoz (ez lesz a foglalós kártya képe).</w:t>
-      </w:r>
-    </w:p>
-    <w:p>
-      <w:pPr>
-        <w:pStyle w:val="ListNumber"/>
-      </w:pPr>
-      <w:r>
-        <w:rPr>
-          <w:b/>
-        </w:rPr>
-        <w:t xml:space="preserve">4. </w:t>
-      </w:r>
-      <w:r>
-        <w:rPr>
-          <w:b w:val="0"/>
-        </w:rPr>
-        <w:t>Mentés. Ha „aktív", azonnal megjelenik a főoldalon és foglalható.</w:t>
-      </w:r>
-    </w:p>
-    <w:p>
-      <w:pPr>
-        <w:shd w:val="clear" w:color="auto" w:fill="F3E9D8"/>
-        <w:jc w:val="center"/>
-      </w:pPr>
-      <w:r>
-        <w:rPr>
-          <w:i/>
-          <w:color w:val="8A7458"/>
-        </w:rPr>
-        <w:t>📷  Képernyőkép: az új program űrlapja</w:t>
-      </w:r>
-    </w:p>
-    <w:p>
-      <w:pPr>
-        <w:pStyle w:val="Heading2"/>
-      </w:pPr>
-      <w:r>
-        <w:t>7.3 Mit tehetsz egy programmal?</w:t>
-      </w:r>
-    </w:p>
-    <w:p>
-      <w:pPr>
-        <w:pStyle w:val="ListBullet"/>
-      </w:pPr>
-      <w:r>
-        <w:rPr>
-          <w:b/>
-        </w:rPr>
-        <w:t>Szerkesztés</w:t>
-      </w:r>
-      <w:r>
-        <w:rPr>
-          <w:b w:val="0"/>
-        </w:rPr>
-        <w:t xml:space="preserve"> — bármelyik adat módosítható (ár, időpont, létszám, leírás, kép, státusz).</w:t>
-      </w:r>
-    </w:p>
-    <w:p>
-      <w:pPr>
-        <w:pStyle w:val="ListBullet"/>
-      </w:pPr>
-      <w:r>
-        <w:rPr>
-          <w:b/>
-        </w:rPr>
-        <w:t>Archiválás</w:t>
-      </w:r>
-      <w:r>
-        <w:rPr>
-          <w:b w:val="0"/>
-        </w:rPr>
-        <w:t xml:space="preserve"> — leveszi a főoldalról, de az adatok és a foglalások megmaradnak (az „Archivált" alfülre kerül). Bármikor visszaállítható.</w:t>
-      </w:r>
-    </w:p>
-    <w:p>
-      <w:pPr>
-        <w:pStyle w:val="ListBullet"/>
-      </w:pPr>
-      <w:r>
-        <w:rPr>
-          <w:b/>
-        </w:rPr>
-        <w:t>„Elmarad a program"</w:t>
-      </w:r>
-      <w:r>
-        <w:rPr>
-          <w:b w:val="0"/>
-        </w:rPr>
-        <w:t xml:space="preserve"> — a státuszt elmaradt-ra állítja, és egy lépésben értesítő levelet küld az érintett (élő) foglalóknak.</w:t>
-      </w:r>
-    </w:p>
-    <w:p>
-      <w:pPr>
-        <w:pStyle w:val="ListBullet"/>
-      </w:pPr>
-      <w:r>
-        <w:rPr>
-          <w:b/>
-        </w:rPr>
-        <w:t>Törlés</w:t>
-      </w:r>
-      <w:r>
-        <w:rPr>
-          <w:b w:val="0"/>
-        </w:rPr>
-        <w:t xml:space="preserve"> — végleg törli a programot. (Ha van hozzá foglalás, inkább archiválj.)</w:t>
-      </w:r>
-    </w:p>
-    <w:p>
-      <w:pPr>
-        <w:pStyle w:val="Heading2"/>
-      </w:pPr>
-      <w:r>
-        <w:t>7.4 Mit jelent az archiválás a gyakorlatban?</w:t>
-      </w:r>
-    </w:p>
-    <w:p>
-      <w:r>
-        <w:rPr>
-          <w:b w:val="0"/>
-        </w:rPr>
-        <w:t>Egy megtartott, lezajlott programot érdemes archiválni: eltűnik a főoldalról (a vendégek már nem látják/foglalják), de a foglalások és a statisztika megmarad, és visszanézhető. Nem törlöd el az adatokat, csak „elteszed".</w:t>
-      </w:r>
-    </w:p>
-    <w:p>
-      <w:pPr>
-        <w:pStyle w:val="Heading1"/>
-      </w:pPr>
-      <w:r>
-        <w:t>8. Beállítások</w:t>
-      </w:r>
-    </w:p>
-    <w:p>
-      <w:r>
-        <w:rPr>
-          <w:b w:val="0"/>
-        </w:rPr>
-        <w:t>A Beállítások fülön szabod testre a rendszert.</w:t>
-      </w:r>
-    </w:p>
-    <w:p>
-      <w:pPr>
-        <w:pStyle w:val="ListBullet"/>
-      </w:pPr>
-      <w:r>
-        <w:rPr>
-          <w:b/>
-        </w:rPr>
-        <w:t>Csapat e-mail cím</w:t>
-      </w:r>
-      <w:r>
-        <w:rPr>
-          <w:b w:val="0"/>
-        </w:rPr>
-        <w:t xml:space="preserve"> — ide érkeznek a csapat-értesítők (új foglalás), ÉS ez a vendég-levelek válaszcíme (Reply-To). Ide írjátok a valódi, olvasott postaládát.</w:t>
-      </w:r>
-    </w:p>
-    <w:p>
-      <w:pPr>
-        <w:pStyle w:val="ListBullet"/>
-      </w:pPr>
-      <w:r>
-        <w:rPr>
-          <w:b/>
-        </w:rPr>
-        <w:t>Foglalási infosáv</w:t>
-      </w:r>
-      <w:r>
-        <w:rPr>
-          <w:b w:val="0"/>
-        </w:rPr>
-        <w:t xml:space="preserve"> — egy rövid szöveg, ami a foglalási űrlapon jelenik meg (pl. tudnivalók, feltételek).</w:t>
-      </w:r>
-    </w:p>
-    <w:p>
-      <w:pPr>
-        <w:pStyle w:val="ListBullet"/>
-      </w:pPr>
-      <w:r>
-        <w:rPr>
-          <w:b/>
-        </w:rPr>
-        <w:t>Azonosító-formátum</w:t>
-      </w:r>
-      <w:r>
-        <w:rPr>
-          <w:b w:val="0"/>
-        </w:rPr>
-        <w:t xml:space="preserve"> — a foglalások azonosítójának előtagja és kezdő száma (pl. F- + 100 → F-100).</w:t>
-      </w:r>
-    </w:p>
-    <w:p>
-      <w:pPr>
-        <w:pStyle w:val="ListBullet"/>
-      </w:pPr>
-      <w:r>
-        <w:rPr>
-          <w:b/>
-        </w:rPr>
-        <w:t>E-mail sablonok</w:t>
-      </w:r>
-      <w:r>
-        <w:rPr>
-          <w:b w:val="0"/>
-        </w:rPr>
-        <w:t xml:space="preserve"> — a hétféle levél tárgya és szövege szerkeszthető. Behelyettesíthető mezők használhatók (pl. a vendég neve, a program, az időpont), amiket a rendszer kitölt küldéskor.</w:t>
-      </w:r>
-    </w:p>
-    <w:p>
-      <w:pPr>
-        <w:shd w:val="clear" w:color="auto" w:fill="F3E9D8"/>
-        <w:jc w:val="center"/>
-      </w:pPr>
-      <w:r>
-        <w:rPr>
-          <w:i/>
-          <w:color w:val="8A7458"/>
-        </w:rPr>
-        <w:t>📷  Képernyőkép: a Beállítások fül (csapat cím, infosáv, azonosító, sablonok)</w:t>
-      </w:r>
-    </w:p>
-    <w:p>
-      <w:pPr>
-        <w:pStyle w:val="Heading1"/>
-      </w:pPr>
-      <w:r>
-        <w:t>9. Főoldali képek cseréje</w:t>
-      </w:r>
-    </w:p>
-    <w:p>
-      <w:r>
-        <w:rPr>
-          <w:b w:val="0"/>
-        </w:rPr>
-        <w:t>A program-fotókat az adminból cseréled (7.2 / 7.3). A főoldal díszítő képei (hero-diavetítés, csapatkép, logó, workshop-bemutató képek) viszont fájlok, ezeket a webtárhelyen cseréled.</w:t>
-      </w:r>
-    </w:p>
-    <w:p>
-      <w:pPr>
-        <w:pStyle w:val="ListNumber"/>
-      </w:pPr>
-      <w:r>
-        <w:rPr>
-          <w:b/>
-        </w:rPr>
-        <w:t xml:space="preserve">1. </w:t>
-      </w:r>
-      <w:r>
-        <w:rPr>
-          <w:b w:val="0"/>
-        </w:rPr>
-        <w:t>Nyisd meg a web/kepek/ mappát.</w:t>
-      </w:r>
-    </w:p>
-    <w:p>
-      <w:pPr>
-        <w:pStyle w:val="ListNumber"/>
-      </w:pPr>
-      <w:r>
-        <w:rPr>
-          <w:b/>
-        </w:rPr>
-        <w:t xml:space="preserve">2. </w:t>
-      </w:r>
-      <w:r>
-        <w:rPr>
-          <w:b w:val="0"/>
-        </w:rPr>
-        <w:t>Cseréld az új képet UGYANAZON A NÉVEN (fontos, különben eltűnik): hero-1.jpg, hero-2.jpg, hero-3.jpg (diavetítés); csapat.jpg (Rólunk); logo-mark.png (logó); a *_workshop.jpg és leanybucsu.jpg (workshop-képek).</w:t>
-      </w:r>
-    </w:p>
-    <w:p>
-      <w:pPr>
-        <w:pStyle w:val="ListNumber"/>
-      </w:pPr>
-      <w:r>
-        <w:rPr>
-          <w:b/>
-        </w:rPr>
-        <w:t xml:space="preserve">3. </w:t>
-      </w:r>
-      <w:r>
-        <w:rPr>
-          <w:b w:val="0"/>
-        </w:rPr>
-        <w:t>Töltsd fel a frissített mappát a tárhelyre (új deploy).</w:t>
-      </w:r>
-    </w:p>
-    <w:p>
-      <w:pPr>
-        <w:shd w:val="clear" w:color="auto" w:fill="FDF7E3"/>
-        <w:spacing w:before="80" w:after="80"/>
-      </w:pPr>
-      <w:r>
-        <w:rPr>
-          <w:b/>
-        </w:rPr>
-        <w:t xml:space="preserve">Méret: </w:t>
-      </w:r>
-      <w:r>
-        <w:rPr>
-          <w:b w:val="0"/>
-        </w:rPr>
-        <w:t>ne tölts fel több MB-os / 4K képet, mert lassítja az oldalt. Ajánlott: hero ~2000px széles, a többi ~1400-1800px, JPG ~200-400 KB.</w:t>
-      </w:r>
-    </w:p>
-    <w:p>
-      <w:pPr>
-        <w:shd w:val="clear" w:color="auto" w:fill="EEF7F0"/>
-        <w:spacing w:before="80" w:after="80"/>
-      </w:pPr>
-      <w:r>
-        <w:rPr>
-          <w:b/>
-        </w:rPr>
-        <w:t xml:space="preserve">Röviden a napi rutin: </w:t>
-      </w:r>
-      <w:r>
-        <w:rPr>
-          <w:b w:val="0"/>
-        </w:rPr>
-        <w:t>új foglalás jön → e-mailben értesültök → az admin a Foglalások fülön jóváhagyja (és a ✉ Levéllel értesíti a vendéget) → a program előtti nap a rendszer emlékeztetőt küld → a helyszínre a Naptár → Jelentés (PDF) viszi a résztvevőlistát.</w:t>
-      </w:r>
     </w:p>
     <w:sectPr>
       <w:pgSz w:w="12240" w:h="15840"/>
-      <w:pgMar w:top="1440" w:right="1800" w:bottom="1440" w:left="1800" w:header="720" w:footer="720" w:gutter="0"/>
+      <w:pgMar w:top="1020" w:right="1134" w:bottom="1020" w:left="1134" w:header="720" w:footer="720" w:gutter="0"/>
       <w:cols w:space="720"/>
       <w:docGrid w:linePitch="360"/>
     </w:sectPr>
@@ -2214,8 +3816,8 @@
     <w:qFormat/>
     <w:rsid w:val="00FC693F"/>
     <w:rPr>
-      <w:rFonts w:ascii="Calibri" w:hAnsi="Calibri"/>
-      <w:sz w:val="22"/>
+      <w:rFonts w:ascii="Segoe UI" w:hAnsi="Segoe UI" w:eastAsia="Segoe UI"/>
+      <w:sz w:val="21"/>
     </w:rPr>
   </w:style>
   <w:style w:type="paragraph" w:styleId="Header">
@@ -2277,11 +3879,11 @@
       <w:outlineLvl w:val="0"/>
     </w:pPr>
     <w:rPr>
-      <w:rFonts w:asciiTheme="majorHAnsi" w:eastAsiaTheme="majorEastAsia" w:hAnsiTheme="majorHAnsi" w:cstheme="majorBidi"/>
+      <w:rFonts w:asciiTheme="majorHAnsi" w:eastAsiaTheme="majorEastAsia" w:hAnsiTheme="majorHAnsi" w:cstheme="majorBidi" w:ascii="Segoe UI" w:hAnsi="Segoe UI"/>
       <w:b/>
       <w:bCs/>
-      <w:color w:val="365F91" w:themeColor="accent1" w:themeShade="BF"/>
-      <w:sz w:val="28"/>
+      <w:color w:val="B8430F"/>
+      <w:sz w:val="32"/>
       <w:szCs w:val="28"/>
     </w:rPr>
   </w:style>
@@ -2301,11 +3903,11 @@
       <w:outlineLvl w:val="1"/>
     </w:pPr>
     <w:rPr>
-      <w:rFonts w:asciiTheme="majorHAnsi" w:eastAsiaTheme="majorEastAsia" w:hAnsiTheme="majorHAnsi" w:cstheme="majorBidi"/>
+      <w:rFonts w:asciiTheme="majorHAnsi" w:eastAsiaTheme="majorEastAsia" w:hAnsiTheme="majorHAnsi" w:cstheme="majorBidi" w:ascii="Segoe UI" w:hAnsi="Segoe UI"/>
       <w:b/>
       <w:bCs/>
-      <w:color w:val="4F81BD" w:themeColor="accent1"/>
-      <w:sz w:val="26"/>
+      <w:color w:val="B8430F"/>
+      <w:sz w:val="25"/>
       <w:szCs w:val="26"/>
     </w:rPr>
   </w:style>

</xml_diff>

<commit_message>
Frissites 2026. 09. 21. 14:13:02,75
</commit_message>
<xml_diff>
--- a/felhasznaloi-utmutato.docx
+++ b/felhasznaloi-utmutato.docx
@@ -28,7 +28,7 @@
           <w:color w:val="7A6A58"/>
           <w:sz w:val="18"/>
         </w:rPr>
-        <w:t>Frissítve: 2026-09-18 · A 📷 jelölés a később beillesztendő képernyőképek helye.</w:t>
+        <w:t>Frissítve: 2026-09-21 · A 📷 jelölés a később beillesztendő képernyőképek helye.</w:t>
       </w:r>
     </w:p>
     <w:p>
@@ -1025,6 +1025,122 @@
           <w:b w:val="0"/>
         </w:rPr>
         <w:t>💡 Foglalással rendelkező időpontot ne törölj — az „Elmarad” megőrzi a nyomát és értesíti a vendégeket. Törölni (✕) a foglalás nélküli időpontot lehet.</w:t>
+      </w:r>
+    </w:p>
+    <w:p>
+      <w:pPr>
+        <w:spacing w:after="0"/>
+      </w:pPr>
+    </w:p>
+    <w:p>
+      <w:pPr>
+        <w:pStyle w:val="Heading2"/>
+      </w:pPr>
+      <w:r>
+        <w:t>Lejártak egy program időpontjai — mi látszik kint?</w:t>
+      </w:r>
+    </w:p>
+    <w:p>
+      <w:r>
+        <w:rPr>
+          <w:b w:val="0"/>
+        </w:rPr>
+        <w:t xml:space="preserve">A főoldal csak a </w:t>
+      </w:r>
+      <w:r>
+        <w:rPr>
+          <w:b/>
+        </w:rPr>
+        <w:t>jövőbeli</w:t>
+      </w:r>
+      <w:r>
+        <w:rPr>
+          <w:b w:val="0"/>
+        </w:rPr>
+        <w:t xml:space="preserve"> alkalmakat mutatja. Ha egy programnak nincs ilyenje, a kártyája ott marad, de foglalni nem lehet rajta:</w:t>
+      </w:r>
+    </w:p>
+    <w:p>
+      <w:pPr>
+        <w:spacing w:after="40"/>
+        <w:ind w:left="510" w:hanging="340"/>
+      </w:pPr>
+      <w:r>
+        <w:t>•</w:t>
+        <w:tab/>
+      </w:r>
+      <w:r>
+        <w:rPr>
+          <w:b/>
+        </w:rPr>
+        <w:t>Hamarosan</w:t>
+      </w:r>
+      <w:r>
+        <w:rPr>
+          <w:b w:val="0"/>
+        </w:rPr>
+        <w:t xml:space="preserve"> jelvény — ha a program állapota „Hamarosan” (beharangozás, még nincs kitűzött dátum);</w:t>
+      </w:r>
+    </w:p>
+    <w:p>
+      <w:pPr>
+        <w:spacing w:after="40"/>
+        <w:ind w:left="510" w:hanging="340"/>
+      </w:pPr>
+      <w:r>
+        <w:t>•</w:t>
+        <w:tab/>
+      </w:r>
+      <w:r>
+        <w:rPr>
+          <w:b/>
+        </w:rPr>
+        <w:t>Új időpontok egyeztetés alatt</w:t>
+      </w:r>
+      <w:r>
+        <w:rPr>
+          <w:b w:val="0"/>
+        </w:rPr>
+        <w:t xml:space="preserve"> sáv a kártya alján — ha a program „Aktív”, de nincs jövőbeli időpontja.</w:t>
+      </w:r>
+    </w:p>
+    <w:p>
+      <w:pPr>
+        <w:pBdr>
+          <w:left w:val="single" w:sz="24" w:space="8" w:color="D9A441"/>
+        </w:pBdr>
+        <w:shd w:val="clear" w:color="auto" w:fill="FDF7E3"/>
+        <w:spacing w:after="0"/>
+      </w:pPr>
+      <w:r>
+        <w:rPr>
+          <w:b w:val="0"/>
+        </w:rPr>
+        <w:t xml:space="preserve">💡 Ha tervezed újra megtartani: </w:t>
+      </w:r>
+      <w:r>
+        <w:rPr>
+          <w:b/>
+        </w:rPr>
+        <w:t>Szerkesztés → + Időpont hozzáadása</w:t>
+      </w:r>
+      <w:r>
+        <w:rPr>
+          <w:b w:val="0"/>
+        </w:rPr>
+        <w:t xml:space="preserve">. Ha nem: </w:t>
+      </w:r>
+      <w:r>
+        <w:rPr>
+          <w:b/>
+        </w:rPr>
+        <w:t>archiváld</w:t>
+      </w:r>
+      <w:r>
+        <w:rPr>
+          <w:b w:val="0"/>
+        </w:rPr>
+        <w:t>, különben ott marad a főoldalon. Az adminban a programnál is kiírja: „Nincs jövőbeli időpont”.</w:t>
       </w:r>
     </w:p>
     <w:p>

</xml_diff>

<commit_message>
Frissites 2026. 09. 30. 23:08:58,10
</commit_message>
<xml_diff>
--- a/felhasznaloi-utmutato.docx
+++ b/felhasznaloi-utmutato.docx
@@ -563,6 +563,42 @@
               <w:rPr>
                 <w:b w:val="0"/>
               </w:rPr>
+              <w:t>Felveszek egy új előadót</w:t>
+            </w:r>
+          </w:p>
+        </w:tc>
+        <w:tc>
+          <w:tcPr>
+            <w:tcW w:type="dxa" w:w="4986"/>
+          </w:tcPr>
+          <w:p>
+            <w:r/>
+            <w:r>
+              <w:rPr>
+                <w:b/>
+              </w:rPr>
+              <w:t>Előadóink</w:t>
+            </w:r>
+            <w:r>
+              <w:rPr>
+                <w:b w:val="0"/>
+              </w:rPr>
+              <w:t xml:space="preserve"> fül (1. rész)</w:t>
+            </w:r>
+          </w:p>
+        </w:tc>
+      </w:tr>
+      <w:tr>
+        <w:tc>
+          <w:tcPr>
+            <w:tcW w:type="dxa" w:w="4986"/>
+          </w:tcPr>
+          <w:p>
+            <w:r/>
+            <w:r>
+              <w:rPr>
+                <w:b w:val="0"/>
+              </w:rPr>
               <w:t>Valami nem működik</w:t>
             </w:r>
           </w:p>
@@ -933,6 +969,50 @@
               <w:rPr>
                 <w:b/>
               </w:rPr>
+              <w:t>Csapat</w:t>
+            </w:r>
+          </w:p>
+        </w:tc>
+        <w:tc>
+          <w:tcPr>
+            <w:tcW w:type="dxa" w:w="3324"/>
+          </w:tcPr>
+          <w:p>
+            <w:r/>
+            <w:r>
+              <w:rPr>
+                <w:b w:val="0"/>
+              </w:rPr>
+              <w:t>Előadóink</w:t>
+            </w:r>
+          </w:p>
+        </w:tc>
+        <w:tc>
+          <w:tcPr>
+            <w:tcW w:type="dxa" w:w="3324"/>
+          </w:tcPr>
+          <w:p>
+            <w:r/>
+            <w:r>
+              <w:rPr>
+                <w:b w:val="0"/>
+              </w:rPr>
+              <w:t>A csapattagok, akik a programokat tartják — nevük a főoldalon és a program-kártyákon.</w:t>
+            </w:r>
+          </w:p>
+        </w:tc>
+      </w:tr>
+      <w:tr>
+        <w:tc>
+          <w:tcPr>
+            <w:tcW w:type="dxa" w:w="3324"/>
+          </w:tcPr>
+          <w:p>
+            <w:r/>
+            <w:r>
+              <w:rPr>
+                <w:b/>
+              </w:rPr>
               <w:t>Rendszer</w:t>
             </w:r>
           </w:p>
@@ -1807,7 +1887,7 @@
         <w:pStyle w:val="Heading2"/>
       </w:pPr>
       <w:r>
-        <w:t>Beállítások</w:t>
+        <w:t>Előadóink — a csapat bemutatása</w:t>
       </w:r>
     </w:p>
     <w:p>
@@ -1815,19 +1895,43 @@
         <w:rPr>
           <w:b w:val="0"/>
         </w:rPr>
-        <w:t xml:space="preserve">A </w:t>
+        <w:t xml:space="preserve">Az </w:t>
       </w:r>
       <w:r>
         <w:rPr>
           <w:b/>
         </w:rPr>
-        <w:t>Beállítások</w:t>
-      </w:r>
-      <w:r>
-        <w:rPr>
-          <w:b w:val="0"/>
-        </w:rPr>
-        <w:t xml:space="preserve"> fül három alfülből áll:</w:t>
+        <w:t>Előadóink</w:t>
+      </w:r>
+      <w:r>
+        <w:rPr>
+          <w:b w:val="0"/>
+        </w:rPr>
+        <w:t xml:space="preserve"> fülön tartod nyilván a csapattagokat. A nevük két helyen jelenik meg a főoldalon: a </w:t>
+      </w:r>
+      <w:r>
+        <w:rPr>
+          <w:b/>
+        </w:rPr>
+        <w:t>Rólunk</w:t>
+      </w:r>
+      <w:r>
+        <w:rPr>
+          <w:b w:val="0"/>
+        </w:rPr>
+        <w:t xml:space="preserve"> szakaszban, a szöveg alatt, és azoknak a </w:t>
+      </w:r>
+      <w:r>
+        <w:rPr>
+          <w:b/>
+        </w:rPr>
+        <w:t>programoknak a kártyáján</w:t>
+      </w:r>
+      <w:r>
+        <w:rPr>
+          <w:b w:val="0"/>
+        </w:rPr>
+        <w:t>, amelyeket ők tartanak. A névre kattintva a vendég megnézheti a bemutatkozást a fényképpel.</w:t>
       </w:r>
     </w:p>
     <w:p>
@@ -1836,6 +1940,106 @@
         <w:ind w:left="510" w:hanging="340"/>
       </w:pPr>
       <w:r>
+        <w:t>1.</w:t>
+        <w:tab/>
+      </w:r>
+      <w:r>
+        <w:rPr>
+          <w:b/>
+        </w:rPr>
+        <w:t>Előadóink</w:t>
+      </w:r>
+      <w:r>
+        <w:rPr>
+          <w:b w:val="0"/>
+        </w:rPr>
+        <w:t xml:space="preserve"> fül → </w:t>
+      </w:r>
+      <w:r>
+        <w:rPr>
+          <w:b/>
+        </w:rPr>
+        <w:t>+ Új előadó</w:t>
+      </w:r>
+      <w:r>
+        <w:rPr>
+          <w:b w:val="0"/>
+        </w:rPr>
+        <w:t>.</w:t>
+      </w:r>
+    </w:p>
+    <w:p>
+      <w:pPr>
+        <w:spacing w:after="40"/>
+        <w:ind w:left="510" w:hanging="340"/>
+      </w:pPr>
+      <w:r>
+        <w:t>2.</w:t>
+        <w:tab/>
+      </w:r>
+      <w:r>
+        <w:rPr>
+          <w:b w:val="0"/>
+        </w:rPr>
+        <w:t>Név, bemutatkozás (formázható), és ha van, fénykép.</w:t>
+      </w:r>
+    </w:p>
+    <w:p>
+      <w:pPr>
+        <w:spacing w:after="40"/>
+        <w:ind w:left="510" w:hanging="340"/>
+      </w:pPr>
+      <w:r>
+        <w:t>3.</w:t>
+        <w:tab/>
+      </w:r>
+      <w:r>
+        <w:rPr>
+          <w:b/>
+        </w:rPr>
+        <w:t>Mentés</w:t>
+      </w:r>
+      <w:r>
+        <w:rPr>
+          <w:b w:val="0"/>
+        </w:rPr>
+        <w:t>. A név azonnal megjelenik a főoldalon.</w:t>
+      </w:r>
+    </w:p>
+    <w:p>
+      <w:pPr>
+        <w:spacing w:after="40"/>
+        <w:ind w:left="510" w:hanging="340"/>
+      </w:pPr>
+      <w:r>
+        <w:t>4.</w:t>
+        <w:tab/>
+      </w:r>
+      <w:r>
+        <w:rPr>
+          <w:b w:val="0"/>
+        </w:rPr>
+        <w:t xml:space="preserve">Sorrend: a </w:t>
+      </w:r>
+      <w:r>
+        <w:rPr>
+          <w:b/>
+        </w:rPr>
+        <w:t>⠿</w:t>
+      </w:r>
+      <w:r>
+        <w:rPr>
+          <w:b w:val="0"/>
+        </w:rPr>
+        <w:t xml:space="preserve"> fogantyúnál húzd — a főoldali névsor ezt követi.</w:t>
+      </w:r>
+    </w:p>
+    <w:p>
+      <w:pPr>
+        <w:spacing w:after="40"/>
+        <w:ind w:left="510" w:hanging="340"/>
+      </w:pPr>
+      <w:r>
         <w:t>•</w:t>
         <w:tab/>
       </w:r>
@@ -1843,25 +2047,25 @@
         <w:rPr>
           <w:b/>
         </w:rPr>
-        <w:t>Általános</w:t>
-      </w:r>
-      <w:r>
-        <w:rPr>
-          <w:b w:val="0"/>
-        </w:rPr>
-        <w:t xml:space="preserve"> — csapat e-mail cím, a </w:t>
+        <w:t>Rejtés</w:t>
+      </w:r>
+      <w:r>
+        <w:rPr>
+          <w:b w:val="0"/>
+        </w:rPr>
+        <w:t xml:space="preserve"> — bármikor megteheted. A rejtett előadó </w:t>
       </w:r>
       <w:r>
         <w:rPr>
           <w:b/>
         </w:rPr>
-        <w:t>két info-sáv</w:t>
-      </w:r>
-      <w:r>
-        <w:rPr>
-          <w:b w:val="0"/>
-        </w:rPr>
-        <w:t xml:space="preserve"> (a foglalási és az ajánlatkérő űrlap tetején megjelenő szöveg), és hogy a Naptár lista vagy rács nézetben nyíljon.</w:t>
+        <w:t>nem jelenik meg</w:t>
+      </w:r>
+      <w:r>
+        <w:rPr>
+          <w:b w:val="0"/>
+        </w:rPr>
+        <w:t xml:space="preserve"> a Rólunk névsorban; ha programhoz van kötve, a kártyán a neve látszik, de nem kattintható.</w:t>
       </w:r>
     </w:p>
     <w:p>
@@ -1877,63 +2081,25 @@
         <w:rPr>
           <w:b/>
         </w:rPr>
-        <w:t>Nyilvános programok</w:t>
-      </w:r>
-      <w:r>
-        <w:rPr>
-          <w:b w:val="0"/>
-        </w:rPr>
-        <w:t xml:space="preserve"> — a foglalási azonosító formátuma (pl. </w:t>
-      </w:r>
-      <w:r>
-        <w:rPr>
-          <w:rFonts w:ascii="Consolas" w:hAnsi="Consolas"/>
-          <w:b w:val="0"/>
-          <w:sz w:val="20"/>
-        </w:rPr>
-        <w:t>F-100</w:t>
-      </w:r>
-      <w:r>
-        <w:rPr>
-          <w:b w:val="0"/>
-        </w:rPr>
-        <w:t>) és a foglalási levelek sablonjai.</w:t>
-      </w:r>
-    </w:p>
-    <w:p>
-      <w:pPr>
-        <w:spacing w:after="40"/>
-        <w:ind w:left="510" w:hanging="340"/>
-      </w:pPr>
-      <w:r>
-        <w:t>•</w:t>
-        <w:tab/>
+        <w:t>Törlés</w:t>
+      </w:r>
+      <w:r>
+        <w:rPr>
+          <w:b w:val="0"/>
+        </w:rPr>
+        <w:t xml:space="preserve"> — csak olyan előadónál jelenik meg, aki </w:t>
       </w:r>
       <w:r>
         <w:rPr>
           <w:b/>
         </w:rPr>
-        <w:t>Egyedi megrendelések</w:t>
-      </w:r>
-      <w:r>
-        <w:rPr>
-          <w:b w:val="0"/>
-        </w:rPr>
-        <w:t xml:space="preserve"> — az ajánlat-azonosító formátuma (pl. </w:t>
-      </w:r>
-      <w:r>
-        <w:rPr>
-          <w:rFonts w:ascii="Consolas" w:hAnsi="Consolas"/>
-          <w:b w:val="0"/>
-          <w:sz w:val="20"/>
-        </w:rPr>
-        <w:t>A-100</w:t>
-      </w:r>
-      <w:r>
-        <w:rPr>
-          <w:b w:val="0"/>
-        </w:rPr>
-        <w:t>) és az ajánlati levelek sablonjai.</w:t>
+        <w:t>egyetlen programhoz sincs hozzárendelve</w:t>
+      </w:r>
+      <w:r>
+        <w:rPr>
+          <w:b w:val="0"/>
+        </w:rPr>
+        <w:t>. Ha van kapcsolata, a soron ott a „N program” jelzés; előbb vedd le a programról, vagy használd a Rejtést.</w:t>
       </w:r>
     </w:p>
     <w:p>
@@ -1948,73 +2114,31 @@
         <w:rPr>
           <w:b w:val="0"/>
         </w:rPr>
-        <w:t>💡 A sablonokban a kapcsos zárójeles mezők (</w:t>
-      </w:r>
-      <w:r>
-        <w:rPr>
-          <w:rFonts w:ascii="Consolas" w:hAnsi="Consolas"/>
-          <w:b w:val="0"/>
-          <w:sz w:val="20"/>
-        </w:rPr>
-        <w:t>{nev}</w:t>
-      </w:r>
-      <w:r>
-        <w:rPr>
-          <w:b w:val="0"/>
-        </w:rPr>
-        <w:t xml:space="preserve">, </w:t>
-      </w:r>
-      <w:r>
-        <w:rPr>
-          <w:rFonts w:ascii="Consolas" w:hAnsi="Consolas"/>
-          <w:b w:val="0"/>
-          <w:sz w:val="20"/>
-        </w:rPr>
-        <w:t>{program}</w:t>
-      </w:r>
-      <w:r>
-        <w:rPr>
-          <w:b w:val="0"/>
-        </w:rPr>
-        <w:t xml:space="preserve">, </w:t>
-      </w:r>
-      <w:r>
-        <w:rPr>
-          <w:rFonts w:ascii="Consolas" w:hAnsi="Consolas"/>
-          <w:b w:val="0"/>
-          <w:sz w:val="20"/>
-        </w:rPr>
-        <w:t>{idopont}</w:t>
-      </w:r>
-      <w:r>
-        <w:rPr>
-          <w:b w:val="0"/>
-        </w:rPr>
-        <w:t xml:space="preserve">) küldéskor magától kitöltődnek. Minden kártyának </w:t>
+        <w:t xml:space="preserve">💡 </w:t>
       </w:r>
       <w:r>
         <w:rPr>
           <w:b/>
         </w:rPr>
-        <w:t>saját Mentés gombja</w:t>
-      </w:r>
-      <w:r>
-        <w:rPr>
-          <w:b w:val="0"/>
-        </w:rPr>
-        <w:t xml:space="preserve"> van — arra a kártyára vonatkozik, amelyikben van. Hogy melyik levél mikor megy ki, a </w:t>
+        <w:t>Hogyan kerül egy előadó a programhoz?</w:t>
+      </w:r>
+      <w:r>
+        <w:rPr>
+          <w:b w:val="0"/>
+        </w:rPr>
+        <w:t xml:space="preserve"> A program </w:t>
       </w:r>
       <w:r>
         <w:rPr>
           <w:b/>
         </w:rPr>
-        <w:t>2. és a 3. részben</w:t>
-      </w:r>
-      <w:r>
-        <w:rPr>
-          <w:b w:val="0"/>
-        </w:rPr>
-        <w:t xml:space="preserve"> találod, a saját ágánál.</w:t>
+        <w:t>Szerkesztés</w:t>
+      </w:r>
+      <w:r>
+        <w:rPr>
+          <w:b w:val="0"/>
+        </w:rPr>
+        <w:t xml:space="preserve"> ablakában, az „Előadók” résznél pipáld be a nevét — többet is jelölhetsz. A kártyán vesszővel elválasztva jelennek meg.</w:t>
       </w:r>
     </w:p>
     <w:p>
@@ -2034,7 +2158,7 @@
         <w:rPr>
           <w:b/>
         </w:rPr>
-        <w:t>📋 Példa — Kiírom, hogy a számlát magánszemély nevére állítjuk</w:t>
+        <w:t>📋 Példa — Új kolléga érkezett a csapatba</w:t>
       </w:r>
     </w:p>
     <w:p>
@@ -2055,7 +2179,7 @@
         <w:rPr>
           <w:b/>
         </w:rPr>
-        <w:t>Beállítások</w:t>
+        <w:t>Előadóink</w:t>
       </w:r>
       <w:r>
         <w:rPr>
@@ -2067,13 +2191,13 @@
         <w:rPr>
           <w:b/>
         </w:rPr>
-        <w:t>Általános</w:t>
-      </w:r>
-      <w:r>
-        <w:rPr>
-          <w:b w:val="0"/>
-        </w:rPr>
-        <w:t xml:space="preserve"> alfül.</w:t>
+        <w:t>+ Új előadó</w:t>
+      </w:r>
+      <w:r>
+        <w:rPr>
+          <w:b w:val="0"/>
+        </w:rPr>
+        <w:t xml:space="preserve"> → név: „Kis Petra”, pár mondat bemutatkozás, fénykép.</w:t>
       </w:r>
     </w:p>
     <w:p>
@@ -2088,19 +2212,19 @@
         <w:rPr>
           <w:b w:val="0"/>
         </w:rPr>
-        <w:t xml:space="preserve">2. Az </w:t>
+        <w:t xml:space="preserve">2. </w:t>
       </w:r>
       <w:r>
         <w:rPr>
           <w:b/>
         </w:rPr>
-        <w:t>Ajánlatkérési info-sáv</w:t>
-      </w:r>
-      <w:r>
-        <w:rPr>
-          <w:b w:val="0"/>
-        </w:rPr>
-        <w:t xml:space="preserve"> mezőbe beírod a szöveget, pl. „A számlát magánszemély nevére állítjuk ki!”.</w:t>
+        <w:t>Mentés</w:t>
+      </w:r>
+      <w:r>
+        <w:rPr>
+          <w:b w:val="0"/>
+        </w:rPr>
+        <w:t xml:space="preserve"> → a neve megjelenik a Rólunk szakaszban.</w:t>
       </w:r>
     </w:p>
     <w:p>
@@ -2115,19 +2239,43 @@
         <w:rPr>
           <w:b w:val="0"/>
         </w:rPr>
-        <w:t xml:space="preserve">3. Ugyanezt a </w:t>
+        <w:t xml:space="preserve">3. </w:t>
       </w:r>
       <w:r>
         <w:rPr>
           <w:b/>
         </w:rPr>
-        <w:t>Foglalási info-sáv</w:t>
-      </w:r>
-      <w:r>
-        <w:rPr>
-          <w:b w:val="0"/>
-        </w:rPr>
-        <w:t xml:space="preserve"> mezőbe is beírhatod, ha a foglalási űrlapon is látszódjon.</w:t>
+        <w:t>Programok</w:t>
+      </w:r>
+      <w:r>
+        <w:rPr>
+          <w:b w:val="0"/>
+        </w:rPr>
+        <w:t xml:space="preserve"> → a workshopnál </w:t>
+      </w:r>
+      <w:r>
+        <w:rPr>
+          <w:b/>
+        </w:rPr>
+        <w:t>Szerkesztés</w:t>
+      </w:r>
+      <w:r>
+        <w:rPr>
+          <w:b w:val="0"/>
+        </w:rPr>
+        <w:t xml:space="preserve"> → az Előadók résznél bepipálod Petrát → </w:t>
+      </w:r>
+      <w:r>
+        <w:rPr>
+          <w:b/>
+        </w:rPr>
+        <w:t>Mentés</w:t>
+      </w:r>
+      <w:r>
+        <w:rPr>
+          <w:b w:val="0"/>
+        </w:rPr>
+        <w:t>.</w:t>
       </w:r>
     </w:p>
     <w:p>
@@ -2142,19 +2290,227 @@
         <w:rPr>
           <w:b w:val="0"/>
         </w:rPr>
-        <w:t xml:space="preserve">4. </w:t>
+        <w:t>4. A program kártyáján ettől kezdve ott áll: „Előadó: Szabó Zoltán, Kis Petra” — mindkét név kattintható.</w:t>
+      </w:r>
+    </w:p>
+    <w:p>
+      <w:pPr>
+        <w:spacing w:after="0"/>
+      </w:pPr>
+    </w:p>
+    <w:p>
+      <w:pPr>
+        <w:pStyle w:val="Heading2"/>
+      </w:pPr>
+      <w:r>
+        <w:t>Beállítások</w:t>
+      </w:r>
+    </w:p>
+    <w:p>
+      <w:r>
+        <w:rPr>
+          <w:b w:val="0"/>
+        </w:rPr>
+        <w:t xml:space="preserve">A </w:t>
       </w:r>
       <w:r>
         <w:rPr>
           <w:b/>
         </w:rPr>
-        <w:t>Mentés</w:t>
-      </w:r>
-      <w:r>
-        <w:rPr>
-          <w:b w:val="0"/>
-        </w:rPr>
-        <w:t xml:space="preserve"> → a szöveg azonnal megjelenik az űrlap tetején. Ha kiüríted a mezőt, a sáv eltűnik.</w:t>
+        <w:t>Beállítások</w:t>
+      </w:r>
+      <w:r>
+        <w:rPr>
+          <w:b w:val="0"/>
+        </w:rPr>
+        <w:t xml:space="preserve"> fül három alfülből áll:</w:t>
+      </w:r>
+    </w:p>
+    <w:p>
+      <w:pPr>
+        <w:spacing w:after="40"/>
+        <w:ind w:left="510" w:hanging="340"/>
+      </w:pPr>
+      <w:r>
+        <w:t>•</w:t>
+        <w:tab/>
+      </w:r>
+      <w:r>
+        <w:rPr>
+          <w:b/>
+        </w:rPr>
+        <w:t>Általános</w:t>
+      </w:r>
+      <w:r>
+        <w:rPr>
+          <w:b w:val="0"/>
+        </w:rPr>
+        <w:t xml:space="preserve"> — csapat e-mail cím, a </w:t>
+      </w:r>
+      <w:r>
+        <w:rPr>
+          <w:b/>
+        </w:rPr>
+        <w:t>két info-sáv</w:t>
+      </w:r>
+      <w:r>
+        <w:rPr>
+          <w:b w:val="0"/>
+        </w:rPr>
+        <w:t xml:space="preserve"> (a foglalási és az ajánlatkérő űrlap tetején megjelenő szöveg), és hogy a Naptár lista vagy rács nézetben nyíljon.</w:t>
+      </w:r>
+    </w:p>
+    <w:p>
+      <w:pPr>
+        <w:spacing w:after="40"/>
+        <w:ind w:left="510" w:hanging="340"/>
+      </w:pPr>
+      <w:r>
+        <w:t>•</w:t>
+        <w:tab/>
+      </w:r>
+      <w:r>
+        <w:rPr>
+          <w:b/>
+        </w:rPr>
+        <w:t>Nyilvános programok</w:t>
+      </w:r>
+      <w:r>
+        <w:rPr>
+          <w:b w:val="0"/>
+        </w:rPr>
+        <w:t xml:space="preserve"> — a foglalási azonosító formátuma (pl. </w:t>
+      </w:r>
+      <w:r>
+        <w:rPr>
+          <w:rFonts w:ascii="Consolas" w:hAnsi="Consolas"/>
+          <w:b w:val="0"/>
+          <w:sz w:val="20"/>
+        </w:rPr>
+        <w:t>F-100</w:t>
+      </w:r>
+      <w:r>
+        <w:rPr>
+          <w:b w:val="0"/>
+        </w:rPr>
+        <w:t>) és a foglalási levelek sablonjai.</w:t>
+      </w:r>
+    </w:p>
+    <w:p>
+      <w:pPr>
+        <w:spacing w:after="40"/>
+        <w:ind w:left="510" w:hanging="340"/>
+      </w:pPr>
+      <w:r>
+        <w:t>•</w:t>
+        <w:tab/>
+      </w:r>
+      <w:r>
+        <w:rPr>
+          <w:b/>
+        </w:rPr>
+        <w:t>Egyedi megrendelések</w:t>
+      </w:r>
+      <w:r>
+        <w:rPr>
+          <w:b w:val="0"/>
+        </w:rPr>
+        <w:t xml:space="preserve"> — az ajánlat-azonosító formátuma (pl. </w:t>
+      </w:r>
+      <w:r>
+        <w:rPr>
+          <w:rFonts w:ascii="Consolas" w:hAnsi="Consolas"/>
+          <w:b w:val="0"/>
+          <w:sz w:val="20"/>
+        </w:rPr>
+        <w:t>A-100</w:t>
+      </w:r>
+      <w:r>
+        <w:rPr>
+          <w:b w:val="0"/>
+        </w:rPr>
+        <w:t>) és az ajánlati levelek sablonjai.</w:t>
+      </w:r>
+    </w:p>
+    <w:p>
+      <w:pPr>
+        <w:pBdr>
+          <w:left w:val="single" w:sz="24" w:space="8" w:color="D9A441"/>
+        </w:pBdr>
+        <w:shd w:val="clear" w:color="auto" w:fill="FDF7E3"/>
+        <w:spacing w:after="0"/>
+      </w:pPr>
+      <w:r>
+        <w:rPr>
+          <w:b w:val="0"/>
+        </w:rPr>
+        <w:t>💡 A sablonokban a kapcsos zárójeles mezők (</w:t>
+      </w:r>
+      <w:r>
+        <w:rPr>
+          <w:rFonts w:ascii="Consolas" w:hAnsi="Consolas"/>
+          <w:b w:val="0"/>
+          <w:sz w:val="20"/>
+        </w:rPr>
+        <w:t>{nev}</w:t>
+      </w:r>
+      <w:r>
+        <w:rPr>
+          <w:b w:val="0"/>
+        </w:rPr>
+        <w:t xml:space="preserve">, </w:t>
+      </w:r>
+      <w:r>
+        <w:rPr>
+          <w:rFonts w:ascii="Consolas" w:hAnsi="Consolas"/>
+          <w:b w:val="0"/>
+          <w:sz w:val="20"/>
+        </w:rPr>
+        <w:t>{program}</w:t>
+      </w:r>
+      <w:r>
+        <w:rPr>
+          <w:b w:val="0"/>
+        </w:rPr>
+        <w:t xml:space="preserve">, </w:t>
+      </w:r>
+      <w:r>
+        <w:rPr>
+          <w:rFonts w:ascii="Consolas" w:hAnsi="Consolas"/>
+          <w:b w:val="0"/>
+          <w:sz w:val="20"/>
+        </w:rPr>
+        <w:t>{idopont}</w:t>
+      </w:r>
+      <w:r>
+        <w:rPr>
+          <w:b w:val="0"/>
+        </w:rPr>
+        <w:t xml:space="preserve">) küldéskor magától kitöltődnek. Minden kártyának </w:t>
+      </w:r>
+      <w:r>
+        <w:rPr>
+          <w:b/>
+        </w:rPr>
+        <w:t>saját Mentés gombja</w:t>
+      </w:r>
+      <w:r>
+        <w:rPr>
+          <w:b w:val="0"/>
+        </w:rPr>
+        <w:t xml:space="preserve"> van — arra a kártyára vonatkozik, amelyikben van. Hogy melyik levél mikor megy ki, a </w:t>
+      </w:r>
+      <w:r>
+        <w:rPr>
+          <w:b/>
+        </w:rPr>
+        <w:t>2. és a 3. részben</w:t>
+      </w:r>
+      <w:r>
+        <w:rPr>
+          <w:b w:val="0"/>
+        </w:rPr>
+        <w:t xml:space="preserve"> találod, a saját ágánál.</w:t>
       </w:r>
     </w:p>
     <w:p>
@@ -2174,7 +2530,7 @@
         <w:rPr>
           <w:b/>
         </w:rPr>
-        <w:t>📋 Példa — Átírom a visszaigazoló levél szövegét</w:t>
+        <w:t>📋 Példa — Kiírom, hogy a számlát magánszemély nevére állítjuk</w:t>
       </w:r>
     </w:p>
     <w:p>
@@ -2207,7 +2563,7 @@
         <w:rPr>
           <w:b/>
         </w:rPr>
-        <w:t>Nyilvános programok</w:t>
+        <w:t>Általános</w:t>
       </w:r>
       <w:r>
         <w:rPr>
@@ -2228,7 +2584,19 @@
         <w:rPr>
           <w:b w:val="0"/>
         </w:rPr>
-        <w:t>2. Görgess a „Foglalási e-mail sablonok” kártyához, keresd meg a „Visszaigazolás” blokkot.</w:t>
+        <w:t xml:space="preserve">2. Az </w:t>
+      </w:r>
+      <w:r>
+        <w:rPr>
+          <w:b/>
+        </w:rPr>
+        <w:t>Ajánlatkérési info-sáv</w:t>
+      </w:r>
+      <w:r>
+        <w:rPr>
+          <w:b w:val="0"/>
+        </w:rPr>
+        <w:t xml:space="preserve"> mezőbe beírod a szöveget, pl. „A számlát magánszemély nevére állítjuk ki!”.</w:t>
       </w:r>
     </w:p>
     <w:p>
@@ -2243,35 +2611,19 @@
         <w:rPr>
           <w:b w:val="0"/>
         </w:rPr>
-        <w:t xml:space="preserve">3. Írd át a törzsszöveget, de a </w:t>
-      </w:r>
-      <w:r>
-        <w:rPr>
-          <w:rFonts w:ascii="Consolas" w:hAnsi="Consolas"/>
-          <w:b w:val="0"/>
-          <w:sz w:val="20"/>
-        </w:rPr>
-        <w:t>{nev}</w:t>
-      </w:r>
-      <w:r>
-        <w:rPr>
-          <w:b w:val="0"/>
-        </w:rPr>
-        <w:t xml:space="preserve"> és a </w:t>
-      </w:r>
-      <w:r>
-        <w:rPr>
-          <w:rFonts w:ascii="Consolas" w:hAnsi="Consolas"/>
-          <w:b w:val="0"/>
-          <w:sz w:val="20"/>
-        </w:rPr>
-        <w:t>{program}</w:t>
-      </w:r>
-      <w:r>
-        <w:rPr>
-          <w:b w:val="0"/>
-        </w:rPr>
-        <w:t xml:space="preserve"> maradjon benne — ezeket a rendszer tölti ki.</w:t>
+        <w:t xml:space="preserve">3. Ugyanezt a </w:t>
+      </w:r>
+      <w:r>
+        <w:rPr>
+          <w:b/>
+        </w:rPr>
+        <w:t>Foglalási info-sáv</w:t>
+      </w:r>
+      <w:r>
+        <w:rPr>
+          <w:b w:val="0"/>
+        </w:rPr>
+        <w:t xml:space="preserve"> mezőbe is beírhatod, ha a foglalási űrlapon is látszódjon.</w:t>
       </w:r>
     </w:p>
     <w:p>
@@ -2298,7 +2650,7 @@
         <w:rPr>
           <w:b w:val="0"/>
         </w:rPr>
-        <w:t>. A következő foglalásnál már az új szöveg megy ki.</w:t>
+        <w:t xml:space="preserve"> → a szöveg azonnal megjelenik az űrlap tetején. Ha kiüríted a mezőt, a sáv eltűnik.</w:t>
       </w:r>
     </w:p>
     <w:p>
@@ -2308,6 +2660,150 @@
     </w:p>
     <w:p>
       <w:pPr>
+        <w:pBdr>
+          <w:left w:val="single" w:sz="24" w:space="8" w:color="2F7D4F"/>
+        </w:pBdr>
+        <w:shd w:val="clear" w:color="auto" w:fill="EEF6EF"/>
+        <w:spacing w:after="0"/>
+      </w:pPr>
+      <w:r>
+        <w:rPr>
+          <w:b/>
+        </w:rPr>
+        <w:t>📋 Példa — Átírom a visszaigazoló levél szövegét</w:t>
+      </w:r>
+    </w:p>
+    <w:p>
+      <w:pPr>
+        <w:pBdr>
+          <w:left w:val="single" w:sz="24" w:space="8" w:color="2F7D4F"/>
+        </w:pBdr>
+        <w:shd w:val="clear" w:color="auto" w:fill="EEF6EF"/>
+        <w:spacing w:after="0"/>
+      </w:pPr>
+      <w:r>
+        <w:rPr>
+          <w:b w:val="0"/>
+        </w:rPr>
+        <w:t xml:space="preserve">1. </w:t>
+      </w:r>
+      <w:r>
+        <w:rPr>
+          <w:b/>
+        </w:rPr>
+        <w:t>Beállítások</w:t>
+      </w:r>
+      <w:r>
+        <w:rPr>
+          <w:b w:val="0"/>
+        </w:rPr>
+        <w:t xml:space="preserve"> → </w:t>
+      </w:r>
+      <w:r>
+        <w:rPr>
+          <w:b/>
+        </w:rPr>
+        <w:t>Nyilvános programok</w:t>
+      </w:r>
+      <w:r>
+        <w:rPr>
+          <w:b w:val="0"/>
+        </w:rPr>
+        <w:t xml:space="preserve"> alfül.</w:t>
+      </w:r>
+    </w:p>
+    <w:p>
+      <w:pPr>
+        <w:pBdr>
+          <w:left w:val="single" w:sz="24" w:space="8" w:color="2F7D4F"/>
+        </w:pBdr>
+        <w:shd w:val="clear" w:color="auto" w:fill="EEF6EF"/>
+        <w:spacing w:after="0"/>
+      </w:pPr>
+      <w:r>
+        <w:rPr>
+          <w:b w:val="0"/>
+        </w:rPr>
+        <w:t>2. Görgess a „Foglalási e-mail sablonok” kártyához, keresd meg a „Visszaigazolás” blokkot.</w:t>
+      </w:r>
+    </w:p>
+    <w:p>
+      <w:pPr>
+        <w:pBdr>
+          <w:left w:val="single" w:sz="24" w:space="8" w:color="2F7D4F"/>
+        </w:pBdr>
+        <w:shd w:val="clear" w:color="auto" w:fill="EEF6EF"/>
+        <w:spacing w:after="0"/>
+      </w:pPr>
+      <w:r>
+        <w:rPr>
+          <w:b w:val="0"/>
+        </w:rPr>
+        <w:t xml:space="preserve">3. Írd át a törzsszöveget, de a </w:t>
+      </w:r>
+      <w:r>
+        <w:rPr>
+          <w:rFonts w:ascii="Consolas" w:hAnsi="Consolas"/>
+          <w:b w:val="0"/>
+          <w:sz w:val="20"/>
+        </w:rPr>
+        <w:t>{nev}</w:t>
+      </w:r>
+      <w:r>
+        <w:rPr>
+          <w:b w:val="0"/>
+        </w:rPr>
+        <w:t xml:space="preserve"> és a </w:t>
+      </w:r>
+      <w:r>
+        <w:rPr>
+          <w:rFonts w:ascii="Consolas" w:hAnsi="Consolas"/>
+          <w:b w:val="0"/>
+          <w:sz w:val="20"/>
+        </w:rPr>
+        <w:t>{program}</w:t>
+      </w:r>
+      <w:r>
+        <w:rPr>
+          <w:b w:val="0"/>
+        </w:rPr>
+        <w:t xml:space="preserve"> maradjon benne — ezeket a rendszer tölti ki.</w:t>
+      </w:r>
+    </w:p>
+    <w:p>
+      <w:pPr>
+        <w:pBdr>
+          <w:left w:val="single" w:sz="24" w:space="8" w:color="2F7D4F"/>
+        </w:pBdr>
+        <w:shd w:val="clear" w:color="auto" w:fill="EEF6EF"/>
+        <w:spacing w:after="0"/>
+      </w:pPr>
+      <w:r>
+        <w:rPr>
+          <w:b w:val="0"/>
+        </w:rPr>
+        <w:t xml:space="preserve">4. </w:t>
+      </w:r>
+      <w:r>
+        <w:rPr>
+          <w:b/>
+        </w:rPr>
+        <w:t>Mentés</w:t>
+      </w:r>
+      <w:r>
+        <w:rPr>
+          <w:b w:val="0"/>
+        </w:rPr>
+        <w:t>. A következő foglalásnál már az új szöveg megy ki.</w:t>
+      </w:r>
+    </w:p>
+    <w:p>
+      <w:pPr>
+        <w:spacing w:after="0"/>
+      </w:pPr>
+    </w:p>
+    <w:p>
+      <w:pPr>
         <w:jc w:val="center"/>
       </w:pPr>
       <w:r>
@@ -2466,6 +2962,40 @@
           <w:b w:val="0"/>
         </w:rPr>
         <w:t xml:space="preserve"> → az alkalom betelt, lejárt, elmaradt, vagy a foglalás szünetel (lásd 2. rész).</w:t>
+      </w:r>
+    </w:p>
+    <w:p>
+      <w:pPr>
+        <w:spacing w:after="40"/>
+        <w:ind w:left="510" w:hanging="340"/>
+      </w:pPr>
+      <w:r>
+        <w:t>•</w:t>
+        <w:tab/>
+      </w:r>
+      <w:r>
+        <w:rPr>
+          <w:b/>
+        </w:rPr>
+        <w:t>Nem látom a Törlés gombot egy előadónál</w:t>
+      </w:r>
+      <w:r>
+        <w:rPr>
+          <w:b w:val="0"/>
+        </w:rPr>
+        <w:t xml:space="preserve"> → csak akkor törölhető, ha egyetlen programhoz sincs hozzárendelve. A soron lévő „N program” jelzés mutatja, hányhoz. Vedd le a programokról, vagy használd a </w:t>
+      </w:r>
+      <w:r>
+        <w:rPr>
+          <w:b/>
+        </w:rPr>
+        <w:t>Rejtés</w:t>
+      </w:r>
+      <w:r>
+        <w:rPr>
+          <w:b w:val="0"/>
+        </w:rPr>
+        <w:t>t.</w:t>
       </w:r>
     </w:p>
     <w:p>
@@ -2775,7 +3305,7 @@
         <w:rPr>
           <w:b w:val="0"/>
         </w:rPr>
-        <w:t>Cím és rövid leírás (ez látszik a kártyán). Ha van: részletes leírás, előadó, várható időtartam, fotó.</w:t>
+        <w:t>Cím és rövid leírás (ez látszik a kártyán). Ha van: részletes leírás, várható időtartam, fotó.</w:t>
       </w:r>
     </w:p>
     <w:p>
@@ -2831,13 +3361,13 @@
         <w:rPr>
           <w:b/>
         </w:rPr>
-        <w:t>+ Időpont hozzáadása</w:t>
-      </w:r>
-      <w:r>
-        <w:rPr>
-          <w:b w:val="0"/>
-        </w:rPr>
-        <w:t xml:space="preserve"> — alkalmanként: dátum és idő, ár/fő, kedvezményes ár (nem kötelező), max. létszám.</w:t>
+        <w:t>Előadók</w:t>
+      </w:r>
+      <w:r>
+        <w:rPr>
+          <w:b w:val="0"/>
+        </w:rPr>
+        <w:t>: pipáld be, ki tartja — a nevek az Előadóink fülről jönnek (1. rész).</w:t>
       </w:r>
     </w:p>
     <w:p>
@@ -2853,6 +3383,28 @@
         <w:rPr>
           <w:b/>
         </w:rPr>
+        <w:t>+ Időpont hozzáadása</w:t>
+      </w:r>
+      <w:r>
+        <w:rPr>
+          <w:b w:val="0"/>
+        </w:rPr>
+        <w:t xml:space="preserve"> — alkalmanként: dátum és idő, ár/fő, kedvezményes ár (nem kötelező), max. létszám.</w:t>
+      </w:r>
+    </w:p>
+    <w:p>
+      <w:pPr>
+        <w:spacing w:after="40"/>
+        <w:ind w:left="510" w:hanging="340"/>
+      </w:pPr>
+      <w:r>
+        <w:t>6.</w:t>
+        <w:tab/>
+      </w:r>
+      <w:r>
+        <w:rPr>
+          <w:b/>
+        </w:rPr>
         <w:t>Mentés</w:t>
       </w:r>
       <w:r>
@@ -2861,6 +3413,38 @@
         </w:rPr>
         <w:t>.</w:t>
       </w:r>
+    </w:p>
+    <w:p>
+      <w:pPr>
+        <w:pBdr>
+          <w:left w:val="single" w:sz="24" w:space="8" w:color="D9A441"/>
+        </w:pBdr>
+        <w:shd w:val="clear" w:color="auto" w:fill="FDF7E3"/>
+        <w:spacing w:after="0"/>
+      </w:pPr>
+      <w:r>
+        <w:rPr>
+          <w:b w:val="0"/>
+        </w:rPr>
+        <w:t xml:space="preserve">💡 Ha </w:t>
+      </w:r>
+      <w:r>
+        <w:rPr>
+          <w:b/>
+        </w:rPr>
+        <w:t>egyetlen előadót sem</w:t>
+      </w:r>
+      <w:r>
+        <w:rPr>
+          <w:b w:val="0"/>
+        </w:rPr>
+        <w:t xml:space="preserve"> pipálsz be, a kártyán egyszerűen nincs „Előadó:” sor — a program ettől még teljesen működik.</w:t>
+      </w:r>
+    </w:p>
+    <w:p>
+      <w:pPr>
+        <w:spacing w:after="0"/>
+      </w:pPr>
     </w:p>
     <w:p>
       <w:pPr>

</xml_diff>

<commit_message>
Program-link (slug), build.bat deploy-csomag, heti adatmentes (backup-export + 05 cron), keep-alive workflow torolve. Co-Authored-By: Claude Fable 5.1 <noreply@anthropic.com>
</commit_message>
<xml_diff>
--- a/felhasznaloi-utmutato.docx
+++ b/felhasznaloi-utmutato.docx
@@ -3483,6 +3483,440 @@
         <w:pStyle w:val="Heading2"/>
       </w:pPr>
       <w:r>
+        <w:t>Megosztható link egy programhoz</w:t>
+      </w:r>
+    </w:p>
+    <w:p>
+      <w:r>
+        <w:rPr>
+          <w:b w:val="0"/>
+        </w:rPr>
+        <w:t xml:space="preserve">Minden programnak van </w:t>
+      </w:r>
+      <w:r>
+        <w:rPr>
+          <w:b/>
+        </w:rPr>
+        <w:t>saját linkje</w:t>
+      </w:r>
+      <w:r>
+        <w:rPr>
+          <w:b w:val="0"/>
+        </w:rPr>
+        <w:t xml:space="preserve">. Aki megnyitja, </w:t>
+      </w:r>
+      <w:r>
+        <w:rPr>
+          <w:b/>
+        </w:rPr>
+        <w:t>csak azt az egy programot</w:t>
+      </w:r>
+      <w:r>
+        <w:rPr>
+          <w:b w:val="0"/>
+        </w:rPr>
+        <w:t xml:space="preserve"> látja, és rögtön foglalhat is rá. Ez főleg az </w:t>
+      </w:r>
+      <w:r>
+        <w:rPr>
+          <w:b/>
+        </w:rPr>
+        <w:t>előadóknak</w:t>
+      </w:r>
+      <w:r>
+        <w:rPr>
+          <w:b w:val="0"/>
+        </w:rPr>
+        <w:t xml:space="preserve"> hasznos: a saját workshopjuk linkjét kitehetik a Facebookra vagy elküldhetik ismerősöknek.</w:t>
+      </w:r>
+    </w:p>
+    <w:p>
+      <w:pPr>
+        <w:spacing w:after="40"/>
+        <w:ind w:left="510" w:hanging="340"/>
+      </w:pPr>
+      <w:r>
+        <w:t>1.</w:t>
+        <w:tab/>
+      </w:r>
+      <w:r>
+        <w:rPr>
+          <w:b w:val="0"/>
+        </w:rPr>
+        <w:t xml:space="preserve">Nyisd meg a </w:t>
+      </w:r>
+      <w:r>
+        <w:rPr>
+          <w:b/>
+        </w:rPr>
+        <w:t>főoldalt</w:t>
+      </w:r>
+      <w:r>
+        <w:rPr>
+          <w:b w:val="0"/>
+        </w:rPr>
+        <w:t xml:space="preserve"> (nem az admint).</w:t>
+      </w:r>
+    </w:p>
+    <w:p>
+      <w:pPr>
+        <w:spacing w:after="40"/>
+        <w:ind w:left="510" w:hanging="340"/>
+      </w:pPr>
+      <w:r>
+        <w:t>2.</w:t>
+        <w:tab/>
+      </w:r>
+      <w:r>
+        <w:rPr>
+          <w:b w:val="0"/>
+        </w:rPr>
+        <w:t>Keresd meg a program kártyáját.</w:t>
+      </w:r>
+    </w:p>
+    <w:p>
+      <w:pPr>
+        <w:spacing w:after="40"/>
+        <w:ind w:left="510" w:hanging="340"/>
+      </w:pPr>
+      <w:r>
+        <w:t>3.</w:t>
+        <w:tab/>
+      </w:r>
+      <w:r>
+        <w:rPr>
+          <w:b w:val="0"/>
+        </w:rPr>
+        <w:t xml:space="preserve">Kattints a </w:t>
+      </w:r>
+      <w:r>
+        <w:rPr>
+          <w:b/>
+        </w:rPr>
+        <w:t>„Link másolása”</w:t>
+      </w:r>
+      <w:r>
+        <w:rPr>
+          <w:b w:val="0"/>
+        </w:rPr>
+        <w:t xml:space="preserve"> feliratra — a link a vágólapra kerül.</w:t>
+      </w:r>
+    </w:p>
+    <w:p>
+      <w:pPr>
+        <w:spacing w:after="40"/>
+        <w:ind w:left="510" w:hanging="340"/>
+      </w:pPr>
+      <w:r>
+        <w:t>4.</w:t>
+        <w:tab/>
+      </w:r>
+      <w:r>
+        <w:rPr>
+          <w:b w:val="0"/>
+        </w:rPr>
+        <w:t>Illeszd be oda, ahová szánod (üzenet, bejegyzés, e-mail).</w:t>
+      </w:r>
+    </w:p>
+    <w:p>
+      <w:pPr>
+        <w:pBdr>
+          <w:left w:val="single" w:sz="24" w:space="8" w:color="D9A441"/>
+        </w:pBdr>
+        <w:shd w:val="clear" w:color="auto" w:fill="FDF7E3"/>
+        <w:spacing w:after="0"/>
+      </w:pPr>
+      <w:r>
+        <w:rPr>
+          <w:b w:val="0"/>
+        </w:rPr>
+        <w:t xml:space="preserve">💡 </w:t>
+      </w:r>
+      <w:r>
+        <w:rPr>
+          <w:b/>
+        </w:rPr>
+        <w:t>Az adminban nincs ezzel teendőd.</w:t>
+      </w:r>
+      <w:r>
+        <w:rPr>
+          <w:b w:val="0"/>
+        </w:rPr>
+        <w:t xml:space="preserve"> A link magától elkészül, amikor felveszel egy programot, és a gomb a nyilvános oldalon van — így az </w:t>
+      </w:r>
+      <w:r>
+        <w:rPr>
+          <w:b/>
+        </w:rPr>
+        <w:t>előadó maga is elhozhatja</w:t>
+      </w:r>
+      <w:r>
+        <w:rPr>
+          <w:b w:val="0"/>
+        </w:rPr>
+        <w:t>, nem kell tőletek kérnie.</w:t>
+      </w:r>
+    </w:p>
+    <w:p>
+      <w:pPr>
+        <w:spacing w:after="0"/>
+      </w:pPr>
+    </w:p>
+    <w:p>
+      <w:pPr>
+        <w:spacing w:after="40"/>
+        <w:ind w:left="510" w:hanging="340"/>
+      </w:pPr>
+      <w:r>
+        <w:t>•</w:t>
+        <w:tab/>
+      </w:r>
+      <w:r>
+        <w:rPr>
+          <w:b/>
+        </w:rPr>
+        <w:t>Átnevezed a programot?</w:t>
+      </w:r>
+      <w:r>
+        <w:rPr>
+          <w:b w:val="0"/>
+        </w:rPr>
+        <w:t xml:space="preserve"> A link </w:t>
+      </w:r>
+      <w:r>
+        <w:rPr>
+          <w:b/>
+        </w:rPr>
+        <w:t>változatlan marad</w:t>
+      </w:r>
+      <w:r>
+        <w:rPr>
+          <w:b w:val="0"/>
+        </w:rPr>
+        <w:t>, a korábbi megosztások tovább működnek.</w:t>
+      </w:r>
+    </w:p>
+    <w:p>
+      <w:pPr>
+        <w:spacing w:after="40"/>
+        <w:ind w:left="510" w:hanging="340"/>
+      </w:pPr>
+      <w:r>
+        <w:t>•</w:t>
+        <w:tab/>
+      </w:r>
+      <w:r>
+        <w:rPr>
+          <w:b/>
+        </w:rPr>
+        <w:t>Archiválod?</w:t>
+      </w:r>
+      <w:r>
+        <w:rPr>
+          <w:b w:val="0"/>
+        </w:rPr>
+        <w:t xml:space="preserve"> Aki a régi linkre kattint, azt látja: „Ez a program jelenleg nem meghirdetett.” — alatta a visszaúttal az összes programhoz. Ha később </w:t>
+      </w:r>
+      <w:r>
+        <w:rPr>
+          <w:b/>
+        </w:rPr>
+        <w:t>visszaállítod</w:t>
+      </w:r>
+      <w:r>
+        <w:rPr>
+          <w:b w:val="0"/>
+        </w:rPr>
+        <w:t xml:space="preserve">, a link </w:t>
+      </w:r>
+      <w:r>
+        <w:rPr>
+          <w:b/>
+        </w:rPr>
+        <w:t>újra él</w:t>
+      </w:r>
+      <w:r>
+        <w:rPr>
+          <w:b w:val="0"/>
+        </w:rPr>
+        <w:t>.</w:t>
+      </w:r>
+    </w:p>
+    <w:p>
+      <w:pPr>
+        <w:spacing w:after="40"/>
+        <w:ind w:left="510" w:hanging="340"/>
+      </w:pPr>
+      <w:r>
+        <w:t>•</w:t>
+        <w:tab/>
+      </w:r>
+      <w:r>
+        <w:rPr>
+          <w:b/>
+        </w:rPr>
+        <w:t>Törlöd?</w:t>
+      </w:r>
+      <w:r>
+        <w:rPr>
+          <w:b w:val="0"/>
+        </w:rPr>
+        <w:t xml:space="preserve"> Ugyanez az üzenet fogadja — de ez végleges.</w:t>
+      </w:r>
+    </w:p>
+    <w:p>
+      <w:pPr>
+        <w:pBdr>
+          <w:left w:val="single" w:sz="24" w:space="8" w:color="E4571B"/>
+        </w:pBdr>
+        <w:shd w:val="clear" w:color="auto" w:fill="FFF4EE"/>
+        <w:spacing w:after="0"/>
+      </w:pPr>
+      <w:r>
+        <w:rPr>
+          <w:b w:val="0"/>
+        </w:rPr>
+        <w:t xml:space="preserve">⚠️ Amikor a linket </w:t>
+      </w:r>
+      <w:r>
+        <w:rPr>
+          <w:b/>
+        </w:rPr>
+        <w:t>Facebookon</w:t>
+      </w:r>
+      <w:r>
+        <w:rPr>
+          <w:b w:val="0"/>
+        </w:rPr>
+        <w:t xml:space="preserve"> osztják meg, az előnézeti kép és szöveg az </w:t>
+      </w:r>
+      <w:r>
+        <w:rPr>
+          <w:b/>
+        </w:rPr>
+        <w:t>oldal általános bemutatkozása</w:t>
+      </w:r>
+      <w:r>
+        <w:rPr>
+          <w:b w:val="0"/>
+        </w:rPr>
+        <w:t xml:space="preserve"> lesz, nem az adott programé. Maga a link jól működik, csak az előnézet egységes.</w:t>
+      </w:r>
+    </w:p>
+    <w:p>
+      <w:pPr>
+        <w:spacing w:after="0"/>
+      </w:pPr>
+    </w:p>
+    <w:p>
+      <w:pPr>
+        <w:pBdr>
+          <w:left w:val="single" w:sz="24" w:space="8" w:color="2F7D4F"/>
+        </w:pBdr>
+        <w:shd w:val="clear" w:color="auto" w:fill="EEF6EF"/>
+        <w:spacing w:after="0"/>
+      </w:pPr>
+      <w:r>
+        <w:rPr>
+          <w:b/>
+        </w:rPr>
+        <w:t>📋 Példa — Az előadó kiteszi a saját workshopját</w:t>
+      </w:r>
+    </w:p>
+    <w:p>
+      <w:pPr>
+        <w:pBdr>
+          <w:left w:val="single" w:sz="24" w:space="8" w:color="2F7D4F"/>
+        </w:pBdr>
+        <w:shd w:val="clear" w:color="auto" w:fill="EEF6EF"/>
+        <w:spacing w:after="0"/>
+      </w:pPr>
+      <w:r>
+        <w:rPr>
+          <w:b w:val="0"/>
+        </w:rPr>
+        <w:t xml:space="preserve">1. Az előadó megnyitja a </w:t>
+      </w:r>
+      <w:r>
+        <w:rPr>
+          <w:b/>
+        </w:rPr>
+        <w:t>kemence-akademia.xyz</w:t>
+      </w:r>
+      <w:r>
+        <w:rPr>
+          <w:b w:val="0"/>
+        </w:rPr>
+        <w:t xml:space="preserve"> oldalt.</w:t>
+      </w:r>
+    </w:p>
+    <w:p>
+      <w:pPr>
+        <w:pBdr>
+          <w:left w:val="single" w:sz="24" w:space="8" w:color="2F7D4F"/>
+        </w:pBdr>
+        <w:shd w:val="clear" w:color="auto" w:fill="EEF6EF"/>
+        <w:spacing w:after="0"/>
+      </w:pPr>
+      <w:r>
+        <w:rPr>
+          <w:b w:val="0"/>
+        </w:rPr>
+        <w:t xml:space="preserve">2. Megkeresi a „Kortárs Nápolyi Pizza Workshop” kártyát, és rákattint a </w:t>
+      </w:r>
+      <w:r>
+        <w:rPr>
+          <w:b/>
+        </w:rPr>
+        <w:t>Link másolása</w:t>
+      </w:r>
+      <w:r>
+        <w:rPr>
+          <w:b w:val="0"/>
+        </w:rPr>
+        <w:t xml:space="preserve"> feliratra.</w:t>
+      </w:r>
+    </w:p>
+    <w:p>
+      <w:pPr>
+        <w:pBdr>
+          <w:left w:val="single" w:sz="24" w:space="8" w:color="2F7D4F"/>
+        </w:pBdr>
+        <w:shd w:val="clear" w:color="auto" w:fill="EEF6EF"/>
+        <w:spacing w:after="0"/>
+      </w:pPr>
+      <w:r>
+        <w:rPr>
+          <w:b w:val="0"/>
+        </w:rPr>
+        <w:t>3. Beilleszti a saját Facebook-bejegyzésébe.</w:t>
+      </w:r>
+    </w:p>
+    <w:p>
+      <w:pPr>
+        <w:pBdr>
+          <w:left w:val="single" w:sz="24" w:space="8" w:color="2F7D4F"/>
+        </w:pBdr>
+        <w:shd w:val="clear" w:color="auto" w:fill="EEF6EF"/>
+        <w:spacing w:after="0"/>
+      </w:pPr>
+      <w:r>
+        <w:rPr>
+          <w:b w:val="0"/>
+        </w:rPr>
+        <w:t>4. Aki rákattint, egyből azt az egy workshopot látja, és ott helyben foglal.</w:t>
+      </w:r>
+    </w:p>
+    <w:p>
+      <w:pPr>
+        <w:spacing w:after="0"/>
+      </w:pPr>
+    </w:p>
+    <w:p>
+      <w:pPr>
+        <w:pStyle w:val="Heading2"/>
+      </w:pPr>
+      <w:r>
         <w:t>Új időpontot adnék hozzá, vagy módosítanék</w:t>
       </w:r>
     </w:p>

</xml_diff>